<commit_message>
docs(announcements): real bold emphasis in the Word copy pack
Bold markers re-introduced in the markdown paste blocks (section headers,
key numbers, the fallback sentence) and the docx generator now converts
**...** into true Word bold runs — so bold pastes as bold into X Premium
and Telegram instead of literal asterisks. Wording unchanged; counts
re-verified (Telegram long 2,770/4,096 · caption 456/1,024).

Co-Authored-By: Claude Code <noreply@anthropic.com>
</commit_message>
<xml_diff>
--- a/DOCS/announcements/Wave1-Referendum-Copy.docx
+++ b/DOCS/announcements/Wave1-Referendum-Copy.docx
@@ -27,7 +27,7 @@
           <w:sz w:val="18"/>
           <w:szCs w:val="18"/>
         </w:rPr>
-        <w:t xml:space="preserve">Updated 2026-10-01 (v3 — includes the Week 1 story) · matches the live ballots: opened Oct 1, closes Nov 1, 00:00 UTC · verify gate GREEN.</w:t>
+        <w:t xml:space="preserve">v4 — includes the Week 1 story + real bold (pastes as bold into X Premium and Telegram) · matches the live ballots: opened Oct 1, closes Nov 1, 00:00 UTC · verify gate GREEN.</w:t>
       </w:r>
     </w:p>
     <w:p>
@@ -47,6 +47,8 @@
       </w:r>
       <w:r>
         <w:rPr>
+          <w:b/>
+          <w:bCs/>
           <w:sz w:val="20"/>
           <w:szCs w:val="20"/>
           <w:highlight w:val="yellow"/>
@@ -58,7 +60,7 @@
           <w:sz w:val="20"/>
           <w:szCs w:val="20"/>
         </w:rPr>
-        <w:t xml:space="preserve"> placeholders with live numbers from dao.omnom.dog/vote · keep the fallback sentence in every post · never round 25,686 · links stay exactly as written. The Telegram long post (item 3) is a TEXT message — the 4,096-char limit applies; attaching an image? Use the caption (item 4).</w:t>
+        <w:t xml:space="preserve"> placeholders with live numbers from dao.omnom.dog/vote · keep the fallback sentence in every post · never round 25,686 · links stay exactly as written. The Telegram long post (item 3) is a TEXT message — the 4,096-char limit applies; attaching an image? Use the caption (item 4). Bold pastes as bold into X Premium and Telegram.</w:t>
       </w:r>
     </w:p>
     <w:p>
@@ -76,45 +78,65 @@
           <w:sz w:val="26"/>
           <w:szCs w:val="26"/>
         </w:rPr>
-        <w:t xml:space="preserve">1. LAUNCH — X long post (Premium long-form, ~3,235 chars)</w:t>
-      </w:r>
-    </w:p>
-    <w:p>
-      <w:pPr>
-        <w:pBdr>
-          <w:top w:val="single" w:color="262626" w:sz="12"/>
-          <w:left w:val="single" w:color="262626" w:sz="12"/>
-          <w:bottom w:val="single" w:color="262626" w:sz="12"/>
-          <w:right w:val="single" w:color="262626" w:sz="12"/>
-        </w:pBdr>
-        <w:shd w:fill="FAFAF5" w:val="clear"/>
-        <w:spacing w:after="0"/>
-        <w:ind w:left="200" w:right="200"/>
-      </w:pPr>
-      <w:r>
-        <w:rPr>
-          <w:rFonts w:ascii="Consolas" w:cs="Consolas" w:eastAsia="Consolas" w:hAnsi="Consolas"/>
-          <w:sz w:val="20"/>
-          <w:szCs w:val="20"/>
-        </w:rPr>
-        <w:t xml:space="preserve">🗳️ THE $OMNOM RULEBOOK VOTE IS LIVE — and this time, the full story.</w:t>
-      </w:r>
-    </w:p>
-    <w:p>
-      <w:pPr>
-        <w:pBdr>
-          <w:top w:val="single" w:color="262626" w:sz="12"/>
-          <w:left w:val="single" w:color="262626" w:sz="12"/>
-          <w:bottom w:val="single" w:color="262626" w:sz="12"/>
-          <w:right w:val="single" w:color="262626" w:sz="12"/>
-        </w:pBdr>
-        <w:shd w:fill="FAFAF5" w:val="clear"/>
-        <w:spacing w:after="0"/>
-        <w:ind w:left="200" w:right="200"/>
-      </w:pPr>
-      <w:r>
-        <w:rPr>
-          <w:rFonts w:ascii="Consolas" w:cs="Consolas" w:eastAsia="Consolas" w:hAnsi="Consolas"/>
+        <w:t xml:space="preserve">1. LAUNCH — X long post (Premium long-form)</w:t>
+      </w:r>
+    </w:p>
+    <w:p>
+      <w:pPr>
+        <w:pBdr>
+          <w:top w:val="single" w:color="262626" w:sz="12"/>
+          <w:left w:val="single" w:color="262626" w:sz="12"/>
+          <w:bottom w:val="single" w:color="262626" w:sz="12"/>
+          <w:right w:val="single" w:color="262626" w:sz="12"/>
+        </w:pBdr>
+        <w:shd w:fill="FAFAF5" w:val="clear"/>
+        <w:spacing w:after="0"/>
+        <w:ind w:left="200" w:right="200"/>
+      </w:pPr>
+      <w:r>
+        <w:rPr>
+          <w:rFonts w:ascii="Consolas" w:cs="Consolas" w:eastAsia="Consolas" w:hAnsi="Consolas"/>
+          <w:sz w:val="20"/>
+          <w:szCs w:val="20"/>
+        </w:rPr>
+        <w:t xml:space="preserve">🗳️ </w:t>
+      </w:r>
+      <w:r>
+        <w:rPr>
+          <w:rFonts w:ascii="Consolas" w:cs="Consolas" w:eastAsia="Consolas" w:hAnsi="Consolas"/>
+          <w:b/>
+          <w:bCs/>
+          <w:sz w:val="20"/>
+          <w:szCs w:val="20"/>
+        </w:rPr>
+        <w:t xml:space="preserve">THE $OMNOM RULEBOOK VOTE IS LIVE</w:t>
+      </w:r>
+      <w:r>
+        <w:rPr>
+          <w:rFonts w:ascii="Consolas" w:cs="Consolas" w:eastAsia="Consolas" w:hAnsi="Consolas"/>
+          <w:sz w:val="20"/>
+          <w:szCs w:val="20"/>
+        </w:rPr>
+        <w:t xml:space="preserve"> — and this time, the full story.</w:t>
+      </w:r>
+    </w:p>
+    <w:p>
+      <w:pPr>
+        <w:pBdr>
+          <w:top w:val="single" w:color="262626" w:sz="12"/>
+          <w:left w:val="single" w:color="262626" w:sz="12"/>
+          <w:bottom w:val="single" w:color="262626" w:sz="12"/>
+          <w:right w:val="single" w:color="262626" w:sz="12"/>
+        </w:pBdr>
+        <w:shd w:fill="FAFAF5" w:val="clear"/>
+        <w:spacing w:after="0"/>
+        <w:ind w:left="200" w:right="200"/>
+      </w:pPr>
+      <w:r>
+        <w:rPr>
+          <w:rFonts w:ascii="Consolas" w:cs="Consolas" w:eastAsia="Consolas" w:hAnsi="Consolas"/>
+          <w:b/>
+          <w:bCs/>
           <w:sz w:val="20"/>
           <w:szCs w:val="20"/>
         </w:rPr>
@@ -178,6 +200,8 @@
       <w:r>
         <w:rPr>
           <w:rFonts w:ascii="Consolas" w:cs="Consolas" w:eastAsia="Consolas" w:hAnsi="Consolas"/>
+          <w:b/>
+          <w:bCs/>
           <w:sz w:val="20"/>
           <w:szCs w:val="20"/>
         </w:rPr>
@@ -265,7 +289,25 @@
           <w:sz w:val="20"/>
           <w:szCs w:val="20"/>
         </w:rPr>
-        <w:t xml:space="preserve">▪ A fallback rule disclosed before a single ballot: if 5% isn't reached, the most-voted outcome still becomes our working consensus — recorded openly as quorum-missed, re-confirmed in a later ratification vote</w:t>
+        <w:t xml:space="preserve">▪ A fallback rule disclosed before a single ballot: if 5% isn't reached, the </w:t>
+      </w:r>
+      <w:r>
+        <w:rPr>
+          <w:rFonts w:ascii="Consolas" w:cs="Consolas" w:eastAsia="Consolas" w:hAnsi="Consolas"/>
+          <w:b/>
+          <w:bCs/>
+          <w:sz w:val="20"/>
+          <w:szCs w:val="20"/>
+        </w:rPr>
+        <w:t xml:space="preserve">most-voted outcome still becomes our working consensus</w:t>
+      </w:r>
+      <w:r>
+        <w:rPr>
+          <w:rFonts w:ascii="Consolas" w:cs="Consolas" w:eastAsia="Consolas" w:hAnsi="Consolas"/>
+          <w:sz w:val="20"/>
+          <w:szCs w:val="20"/>
+        </w:rPr>
+        <w:t xml:space="preserve"> — recorded openly as quorum-missed, re-confirmed in a later ratification vote</w:t>
       </w:r>
     </w:p>
     <w:p>
@@ -304,31 +346,59 @@
       <w:r>
         <w:rPr>
           <w:rFonts w:ascii="Consolas" w:cs="Consolas" w:eastAsia="Consolas" w:hAnsi="Consolas"/>
-          <w:sz w:val="20"/>
-          <w:szCs w:val="20"/>
-        </w:rPr>
-        <w:t xml:space="preserve">THE THREE QUESTIONS (one FOR/AGAINST/ABSTAIN ballot each — your voting power is √ of your snapshot balance):</w:t>
-      </w:r>
-    </w:p>
-    <w:p>
-      <w:pPr>
-        <w:pBdr>
-          <w:top w:val="single" w:color="262626" w:sz="12"/>
-          <w:left w:val="single" w:color="262626" w:sz="12"/>
-          <w:bottom w:val="single" w:color="262626" w:sz="12"/>
-          <w:right w:val="single" w:color="262626" w:sz="12"/>
-        </w:pBdr>
-        <w:shd w:fill="FAFAF5" w:val="clear"/>
-        <w:spacing w:after="0"/>
-        <w:ind w:left="200" w:right="200"/>
-      </w:pPr>
-      <w:r>
-        <w:rPr>
-          <w:rFonts w:ascii="Consolas" w:cs="Consolas" w:eastAsia="Consolas" w:hAnsi="Consolas"/>
-          <w:sz w:val="20"/>
-          <w:szCs w:val="20"/>
-        </w:rPr>
-        <w:t xml:space="preserve">1️⃣ Global default quorum — how many people need to vote for a result to count?</w:t>
+          <w:b/>
+          <w:bCs/>
+          <w:sz w:val="20"/>
+          <w:szCs w:val="20"/>
+        </w:rPr>
+        <w:t xml:space="preserve">THE THREE QUESTIONS</w:t>
+      </w:r>
+      <w:r>
+        <w:rPr>
+          <w:rFonts w:ascii="Consolas" w:cs="Consolas" w:eastAsia="Consolas" w:hAnsi="Consolas"/>
+          <w:sz w:val="20"/>
+          <w:szCs w:val="20"/>
+        </w:rPr>
+        <w:t xml:space="preserve"> (one FOR/AGAINST/ABSTAIN ballot each — your voting power is √ of your snapshot balance):</w:t>
+      </w:r>
+    </w:p>
+    <w:p>
+      <w:pPr>
+        <w:pBdr>
+          <w:top w:val="single" w:color="262626" w:sz="12"/>
+          <w:left w:val="single" w:color="262626" w:sz="12"/>
+          <w:bottom w:val="single" w:color="262626" w:sz="12"/>
+          <w:right w:val="single" w:color="262626" w:sz="12"/>
+        </w:pBdr>
+        <w:shd w:fill="FAFAF5" w:val="clear"/>
+        <w:spacing w:after="0"/>
+        <w:ind w:left="200" w:right="200"/>
+      </w:pPr>
+      <w:r>
+        <w:rPr>
+          <w:rFonts w:ascii="Consolas" w:cs="Consolas" w:eastAsia="Consolas" w:hAnsi="Consolas"/>
+          <w:sz w:val="20"/>
+          <w:szCs w:val="20"/>
+        </w:rPr>
+        <w:t xml:space="preserve">1️⃣ </w:t>
+      </w:r>
+      <w:r>
+        <w:rPr>
+          <w:rFonts w:ascii="Consolas" w:cs="Consolas" w:eastAsia="Consolas" w:hAnsi="Consolas"/>
+          <w:b/>
+          <w:bCs/>
+          <w:sz w:val="20"/>
+          <w:szCs w:val="20"/>
+        </w:rPr>
+        <w:t xml:space="preserve">Global default quorum</w:t>
+      </w:r>
+      <w:r>
+        <w:rPr>
+          <w:rFonts w:ascii="Consolas" w:cs="Consolas" w:eastAsia="Consolas" w:hAnsi="Consolas"/>
+          <w:sz w:val="20"/>
+          <w:szCs w:val="20"/>
+        </w:rPr>
+        <w:t xml:space="preserve"> — how many people need to vote for a result to count?</w:t>
       </w:r>
     </w:p>
     <w:p>
@@ -370,7 +440,25 @@
           <w:sz w:val="20"/>
           <w:szCs w:val="20"/>
         </w:rPr>
-        <w:t xml:space="preserve">2️⃣ Pass threshold — how many "yes" votes does it take to win?</w:t>
+        <w:t xml:space="preserve">2️⃣ </w:t>
+      </w:r>
+      <w:r>
+        <w:rPr>
+          <w:rFonts w:ascii="Consolas" w:cs="Consolas" w:eastAsia="Consolas" w:hAnsi="Consolas"/>
+          <w:b/>
+          <w:bCs/>
+          <w:sz w:val="20"/>
+          <w:szCs w:val="20"/>
+        </w:rPr>
+        <w:t xml:space="preserve">Pass threshold</w:t>
+      </w:r>
+      <w:r>
+        <w:rPr>
+          <w:rFonts w:ascii="Consolas" w:cs="Consolas" w:eastAsia="Consolas" w:hAnsi="Consolas"/>
+          <w:sz w:val="20"/>
+          <w:szCs w:val="20"/>
+        </w:rPr>
+        <w:t xml:space="preserve"> — how many "yes" votes does it take to win?</w:t>
       </w:r>
     </w:p>
     <w:p>
@@ -412,7 +500,25 @@
           <w:sz w:val="20"/>
           <w:szCs w:val="20"/>
         </w:rPr>
-        <w:t xml:space="preserve">3️⃣ Per-type quorum schedule — should big decisions need more voters than small ones?</w:t>
+        <w:t xml:space="preserve">3️⃣ </w:t>
+      </w:r>
+      <w:r>
+        <w:rPr>
+          <w:rFonts w:ascii="Consolas" w:cs="Consolas" w:eastAsia="Consolas" w:hAnsi="Consolas"/>
+          <w:b/>
+          <w:bCs/>
+          <w:sz w:val="20"/>
+          <w:szCs w:val="20"/>
+        </w:rPr>
+        <w:t xml:space="preserve">Per-type quorum schedule</w:t>
+      </w:r>
+      <w:r>
+        <w:rPr>
+          <w:rFonts w:ascii="Consolas" w:cs="Consolas" w:eastAsia="Consolas" w:hAnsi="Consolas"/>
+          <w:sz w:val="20"/>
+          <w:szCs w:val="20"/>
+        </w:rPr>
+        <w:t xml:space="preserve"> — should big decisions need more voters than small ones?</w:t>
       </w:r>
     </w:p>
     <w:p>
@@ -451,10 +557,20 @@
       <w:r>
         <w:rPr>
           <w:rFonts w:ascii="Consolas" w:cs="Consolas" w:eastAsia="Consolas" w:hAnsi="Consolas"/>
-          <w:sz w:val="20"/>
-          <w:szCs w:val="20"/>
-        </w:rPr>
-        <w:t xml:space="preserve">THE HONEST MATH (from the pinned snapshot — verifiable by anyone):</w:t>
+          <w:b/>
+          <w:bCs/>
+          <w:sz w:val="20"/>
+          <w:szCs w:val="20"/>
+        </w:rPr>
+        <w:t xml:space="preserve">THE HONEST MATH</w:t>
+      </w:r>
+      <w:r>
+        <w:rPr>
+          <w:rFonts w:ascii="Consolas" w:cs="Consolas" w:eastAsia="Consolas" w:hAnsi="Consolas"/>
+          <w:sz w:val="20"/>
+          <w:szCs w:val="20"/>
+        </w:rPr>
+        <w:t xml:space="preserve"> (from the pinned snapshot — verifiable by anyone):</w:t>
       </w:r>
     </w:p>
     <w:p>
@@ -496,49 +612,87 @@
           <w:sz w:val="20"/>
           <w:szCs w:val="20"/>
         </w:rPr>
-        <w:t xml:space="preserve">5% bar: 29,098,690 power ≈ 1,284 average-power wallets</w:t>
-      </w:r>
-    </w:p>
-    <w:p>
-      <w:pPr>
-        <w:pBdr>
-          <w:top w:val="single" w:color="262626" w:sz="12"/>
-          <w:left w:val="single" w:color="262626" w:sz="12"/>
-          <w:bottom w:val="single" w:color="262626" w:sz="12"/>
-          <w:right w:val="single" w:color="262626" w:sz="12"/>
-        </w:pBdr>
-        <w:shd w:fill="FAFAF5" w:val="clear"/>
-        <w:spacing w:after="0"/>
-        <w:ind w:left="200" w:right="200"/>
-      </w:pPr>
-      <w:r>
-        <w:rPr>
-          <w:rFonts w:ascii="Consolas" w:cs="Consolas" w:eastAsia="Consolas" w:hAnsi="Consolas"/>
-          <w:sz w:val="20"/>
-          <w:szCs w:val="20"/>
-        </w:rPr>
-        <w:t xml:space="preserve">Record turnout: 35 voters = 2.73% (Foundational Governance Election)</w:t>
-      </w:r>
-    </w:p>
-    <w:p>
-      <w:pPr>
-        <w:pBdr>
-          <w:top w:val="single" w:color="262626" w:sz="12"/>
-          <w:left w:val="single" w:color="262626" w:sz="12"/>
-          <w:bottom w:val="single" w:color="262626" w:sz="12"/>
-          <w:right w:val="single" w:color="262626" w:sz="12"/>
-        </w:pBdr>
-        <w:shd w:fill="FAFAF5" w:val="clear"/>
-        <w:spacing w:after="0"/>
-        <w:ind w:left="200" w:right="200"/>
-      </w:pPr>
-      <w:r>
-        <w:rPr>
-          <w:rFonts w:ascii="Consolas" w:cs="Consolas" w:eastAsia="Consolas" w:hAnsi="Consolas"/>
-          <w:sz w:val="20"/>
-          <w:szCs w:val="20"/>
-        </w:rPr>
-        <w:t xml:space="preserve">Last vote: 27 voters = 1.73%</w:t>
+        <w:t xml:space="preserve">5% bar: </w:t>
+      </w:r>
+      <w:r>
+        <w:rPr>
+          <w:rFonts w:ascii="Consolas" w:cs="Consolas" w:eastAsia="Consolas" w:hAnsi="Consolas"/>
+          <w:b/>
+          <w:bCs/>
+          <w:sz w:val="20"/>
+          <w:szCs w:val="20"/>
+        </w:rPr>
+        <w:t xml:space="preserve">29,098,690 power ≈ 1,284 average-power wallets</w:t>
+      </w:r>
+    </w:p>
+    <w:p>
+      <w:pPr>
+        <w:pBdr>
+          <w:top w:val="single" w:color="262626" w:sz="12"/>
+          <w:left w:val="single" w:color="262626" w:sz="12"/>
+          <w:bottom w:val="single" w:color="262626" w:sz="12"/>
+          <w:right w:val="single" w:color="262626" w:sz="12"/>
+        </w:pBdr>
+        <w:shd w:fill="FAFAF5" w:val="clear"/>
+        <w:spacing w:after="0"/>
+        <w:ind w:left="200" w:right="200"/>
+      </w:pPr>
+      <w:r>
+        <w:rPr>
+          <w:rFonts w:ascii="Consolas" w:cs="Consolas" w:eastAsia="Consolas" w:hAnsi="Consolas"/>
+          <w:sz w:val="20"/>
+          <w:szCs w:val="20"/>
+        </w:rPr>
+        <w:t xml:space="preserve">Record turnout: </w:t>
+      </w:r>
+      <w:r>
+        <w:rPr>
+          <w:rFonts w:ascii="Consolas" w:cs="Consolas" w:eastAsia="Consolas" w:hAnsi="Consolas"/>
+          <w:b/>
+          <w:bCs/>
+          <w:sz w:val="20"/>
+          <w:szCs w:val="20"/>
+        </w:rPr>
+        <w:t xml:space="preserve">35 voters = 2.73%</w:t>
+      </w:r>
+      <w:r>
+        <w:rPr>
+          <w:rFonts w:ascii="Consolas" w:cs="Consolas" w:eastAsia="Consolas" w:hAnsi="Consolas"/>
+          <w:sz w:val="20"/>
+          <w:szCs w:val="20"/>
+        </w:rPr>
+        <w:t xml:space="preserve"> (Foundational Governance Election)</w:t>
+      </w:r>
+    </w:p>
+    <w:p>
+      <w:pPr>
+        <w:pBdr>
+          <w:top w:val="single" w:color="262626" w:sz="12"/>
+          <w:left w:val="single" w:color="262626" w:sz="12"/>
+          <w:bottom w:val="single" w:color="262626" w:sz="12"/>
+          <w:right w:val="single" w:color="262626" w:sz="12"/>
+        </w:pBdr>
+        <w:shd w:fill="FAFAF5" w:val="clear"/>
+        <w:spacing w:after="0"/>
+        <w:ind w:left="200" w:right="200"/>
+      </w:pPr>
+      <w:r>
+        <w:rPr>
+          <w:rFonts w:ascii="Consolas" w:cs="Consolas" w:eastAsia="Consolas" w:hAnsi="Consolas"/>
+          <w:sz w:val="20"/>
+          <w:szCs w:val="20"/>
+        </w:rPr>
+        <w:t xml:space="preserve">Last vote: </w:t>
+      </w:r>
+      <w:r>
+        <w:rPr>
+          <w:rFonts w:ascii="Consolas" w:cs="Consolas" w:eastAsia="Consolas" w:hAnsi="Consolas"/>
+          <w:b/>
+          <w:bCs/>
+          <w:sz w:val="20"/>
+          <w:szCs w:val="20"/>
+        </w:rPr>
+        <w:t xml:space="preserve">27 voters = 1.73%</w:t>
       </w:r>
     </w:p>
     <w:p>
@@ -577,73 +731,139 @@
       <w:r>
         <w:rPr>
           <w:rFonts w:ascii="Consolas" w:cs="Consolas" w:eastAsia="Consolas" w:hAnsi="Consolas"/>
-          <w:sz w:val="20"/>
-          <w:szCs w:val="20"/>
-        </w:rPr>
-        <w:t xml:space="preserve">IF WE MISS 5% — the fallback, exactly as published before a single ballot:</w:t>
-      </w:r>
-    </w:p>
-    <w:p>
-      <w:pPr>
-        <w:pBdr>
-          <w:top w:val="single" w:color="262626" w:sz="12"/>
-          <w:left w:val="single" w:color="262626" w:sz="12"/>
-          <w:bottom w:val="single" w:color="262626" w:sz="12"/>
-          <w:right w:val="single" w:color="262626" w:sz="12"/>
-        </w:pBdr>
-        <w:shd w:fill="FAFAF5" w:val="clear"/>
-        <w:spacing w:after="0"/>
-        <w:ind w:left="200" w:right="200"/>
-      </w:pPr>
-      <w:r>
-        <w:rPr>
-          <w:rFonts w:ascii="Consolas" w:cs="Consolas" w:eastAsia="Consolas" w:hAnsi="Consolas"/>
-          <w:sz w:val="20"/>
-          <w:szCs w:val="20"/>
-        </w:rPr>
-        <w:t xml:space="preserve">The most-voted outcome per question is adopted as our working consensus. Recorded openly as quorum-missed (final turnout attached), re-confirmed in a later ratification vote as turnout grows. And the adoption happens in public: intent announced, 24 hours of cooling-off, then recorded — every step in the audit log anyone can read.</w:t>
-      </w:r>
-    </w:p>
-    <w:p>
-      <w:pPr>
-        <w:pBdr>
-          <w:top w:val="single" w:color="262626" w:sz="12"/>
-          <w:left w:val="single" w:color="262626" w:sz="12"/>
-          <w:bottom w:val="single" w:color="262626" w:sz="12"/>
-          <w:right w:val="single" w:color="262626" w:sz="12"/>
-        </w:pBdr>
-        <w:shd w:fill="FAFAF5" w:val="clear"/>
-        <w:spacing w:after="0"/>
-        <w:ind w:left="200" w:right="200"/>
-      </w:pPr>
-      <w:r>
-        <w:rPr>
-          <w:rFonts w:ascii="Consolas" w:cs="Consolas" w:eastAsia="Consolas" w:hAnsi="Consolas"/>
-          <w:sz w:val="20"/>
-          <w:szCs w:val="20"/>
-        </w:rPr>
-        <w:t xml:space="preserve">IF WE HIT 5% — binding, quorum-backed, no asterisk. The first fully ratified rulebook in this DAO's history.</w:t>
-      </w:r>
-    </w:p>
-    <w:p>
-      <w:pPr>
-        <w:pBdr>
-          <w:top w:val="single" w:color="262626" w:sz="12"/>
-          <w:left w:val="single" w:color="262626" w:sz="12"/>
-          <w:bottom w:val="single" w:color="262626" w:sz="12"/>
-          <w:right w:val="single" w:color="262626" w:sz="12"/>
-        </w:pBdr>
-        <w:shd w:fill="FAFAF5" w:val="clear"/>
-        <w:spacing w:after="0"/>
-        <w:ind w:left="200" w:right="200"/>
-      </w:pPr>
-      <w:r>
-        <w:rPr>
-          <w:rFonts w:ascii="Consolas" w:cs="Consolas" w:eastAsia="Consolas" w:hAnsi="Consolas"/>
-          <w:sz w:val="20"/>
-          <w:szCs w:val="20"/>
-        </w:rPr>
-        <w:t xml:space="preserve">WHO THIS IS FOR: every wallet that ever held ≥1 $OMNOM — 25,686 of you. Gasless. One signature. Changeable any time until Nov 1, 00:00 UTC.</w:t>
+          <w:b/>
+          <w:bCs/>
+          <w:sz w:val="20"/>
+          <w:szCs w:val="20"/>
+        </w:rPr>
+        <w:t xml:space="preserve">IF WE MISS 5%</w:t>
+      </w:r>
+      <w:r>
+        <w:rPr>
+          <w:rFonts w:ascii="Consolas" w:cs="Consolas" w:eastAsia="Consolas" w:hAnsi="Consolas"/>
+          <w:sz w:val="20"/>
+          <w:szCs w:val="20"/>
+        </w:rPr>
+        <w:t xml:space="preserve"> — the fallback, exactly as published before a single ballot:</w:t>
+      </w:r>
+    </w:p>
+    <w:p>
+      <w:pPr>
+        <w:pBdr>
+          <w:top w:val="single" w:color="262626" w:sz="12"/>
+          <w:left w:val="single" w:color="262626" w:sz="12"/>
+          <w:bottom w:val="single" w:color="262626" w:sz="12"/>
+          <w:right w:val="single" w:color="262626" w:sz="12"/>
+        </w:pBdr>
+        <w:shd w:fill="FAFAF5" w:val="clear"/>
+        <w:spacing w:after="0"/>
+        <w:ind w:left="200" w:right="200"/>
+      </w:pPr>
+      <w:r>
+        <w:rPr>
+          <w:rFonts w:ascii="Consolas" w:cs="Consolas" w:eastAsia="Consolas" w:hAnsi="Consolas"/>
+          <w:sz w:val="20"/>
+          <w:szCs w:val="20"/>
+        </w:rPr>
+        <w:t xml:space="preserve">The </w:t>
+      </w:r>
+      <w:r>
+        <w:rPr>
+          <w:rFonts w:ascii="Consolas" w:cs="Consolas" w:eastAsia="Consolas" w:hAnsi="Consolas"/>
+          <w:b/>
+          <w:bCs/>
+          <w:sz w:val="20"/>
+          <w:szCs w:val="20"/>
+        </w:rPr>
+        <w:t xml:space="preserve">most-voted outcome per question is adopted as our working consensus</w:t>
+      </w:r>
+      <w:r>
+        <w:rPr>
+          <w:rFonts w:ascii="Consolas" w:cs="Consolas" w:eastAsia="Consolas" w:hAnsi="Consolas"/>
+          <w:sz w:val="20"/>
+          <w:szCs w:val="20"/>
+        </w:rPr>
+        <w:t xml:space="preserve">. Recorded openly as quorum-missed (final turnout attached), re-confirmed in a later ratification vote as turnout grows. And the adoption happens in public: intent announced, 24 hours of cooling-off, then recorded — every step in the audit log anyone can read.</w:t>
+      </w:r>
+    </w:p>
+    <w:p>
+      <w:pPr>
+        <w:pBdr>
+          <w:top w:val="single" w:color="262626" w:sz="12"/>
+          <w:left w:val="single" w:color="262626" w:sz="12"/>
+          <w:bottom w:val="single" w:color="262626" w:sz="12"/>
+          <w:right w:val="single" w:color="262626" w:sz="12"/>
+        </w:pBdr>
+        <w:shd w:fill="FAFAF5" w:val="clear"/>
+        <w:spacing w:after="0"/>
+        <w:ind w:left="200" w:right="200"/>
+      </w:pPr>
+      <w:r>
+        <w:rPr>
+          <w:rFonts w:ascii="Consolas" w:cs="Consolas" w:eastAsia="Consolas" w:hAnsi="Consolas"/>
+          <w:b/>
+          <w:bCs/>
+          <w:sz w:val="20"/>
+          <w:szCs w:val="20"/>
+        </w:rPr>
+        <w:t xml:space="preserve">IF WE HIT 5%</w:t>
+      </w:r>
+      <w:r>
+        <w:rPr>
+          <w:rFonts w:ascii="Consolas" w:cs="Consolas" w:eastAsia="Consolas" w:hAnsi="Consolas"/>
+          <w:sz w:val="20"/>
+          <w:szCs w:val="20"/>
+        </w:rPr>
+        <w:t xml:space="preserve"> — binding, quorum-backed, no asterisk. The first fully ratified rulebook in this DAO's history.</w:t>
+      </w:r>
+    </w:p>
+    <w:p>
+      <w:pPr>
+        <w:pBdr>
+          <w:top w:val="single" w:color="262626" w:sz="12"/>
+          <w:left w:val="single" w:color="262626" w:sz="12"/>
+          <w:bottom w:val="single" w:color="262626" w:sz="12"/>
+          <w:right w:val="single" w:color="262626" w:sz="12"/>
+        </w:pBdr>
+        <w:shd w:fill="FAFAF5" w:val="clear"/>
+        <w:spacing w:after="0"/>
+        <w:ind w:left="200" w:right="200"/>
+      </w:pPr>
+      <w:r>
+        <w:rPr>
+          <w:rFonts w:ascii="Consolas" w:cs="Consolas" w:eastAsia="Consolas" w:hAnsi="Consolas"/>
+          <w:b/>
+          <w:bCs/>
+          <w:sz w:val="20"/>
+          <w:szCs w:val="20"/>
+        </w:rPr>
+        <w:t xml:space="preserve">WHO THIS IS FOR</w:t>
+      </w:r>
+      <w:r>
+        <w:rPr>
+          <w:rFonts w:ascii="Consolas" w:cs="Consolas" w:eastAsia="Consolas" w:hAnsi="Consolas"/>
+          <w:sz w:val="20"/>
+          <w:szCs w:val="20"/>
+        </w:rPr>
+        <w:t xml:space="preserve">: every wallet that ever held ≥1 $OMNOM — 25,686 of you. Gasless. One signature. Changeable any time until </w:t>
+      </w:r>
+      <w:r>
+        <w:rPr>
+          <w:rFonts w:ascii="Consolas" w:cs="Consolas" w:eastAsia="Consolas" w:hAnsi="Consolas"/>
+          <w:b/>
+          <w:bCs/>
+          <w:sz w:val="20"/>
+          <w:szCs w:val="20"/>
+        </w:rPr>
+        <w:t xml:space="preserve">Nov 1, 00:00 UTC</w:t>
+      </w:r>
+      <w:r>
+        <w:rPr>
+          <w:rFonts w:ascii="Consolas" w:cs="Consolas" w:eastAsia="Consolas" w:hAnsi="Consolas"/>
+          <w:sz w:val="20"/>
+          <w:szCs w:val="20"/>
+        </w:rPr>
+        <w:t xml:space="preserve">.</w:t>
       </w:r>
     </w:p>
     <w:p>
@@ -766,7 +986,25 @@
           <w:sz w:val="20"/>
           <w:szCs w:val="20"/>
         </w:rPr>
-        <w:t xml:space="preserve">Last month's vote: 27 wallets = 1.73% → expired. Record: 35 = 2.73%. This time all 3 rulebook questions vote at once, and the fallback is disclosed up front.</w:t>
+        <w:t xml:space="preserve">Last month's vote: </w:t>
+      </w:r>
+      <w:r>
+        <w:rPr>
+          <w:rFonts w:ascii="Consolas" w:cs="Consolas" w:eastAsia="Consolas" w:hAnsi="Consolas"/>
+          <w:b/>
+          <w:bCs/>
+          <w:sz w:val="20"/>
+          <w:szCs w:val="20"/>
+        </w:rPr>
+        <w:t xml:space="preserve">27 wallets = 1.73%</w:t>
+      </w:r>
+      <w:r>
+        <w:rPr>
+          <w:rFonts w:ascii="Consolas" w:cs="Consolas" w:eastAsia="Consolas" w:hAnsi="Consolas"/>
+          <w:sz w:val="20"/>
+          <w:szCs w:val="20"/>
+        </w:rPr>
+        <w:t xml:space="preserve"> → expired. Record: 35 = 2.73%. This time all 3 rulebook questions vote at once, and the fallback is disclosed up front.</w:t>
       </w:r>
     </w:p>
     <w:p>
@@ -847,7 +1085,25 @@
           <w:sz w:val="20"/>
           <w:szCs w:val="20"/>
         </w:rPr>
-        <w:t xml:space="preserve">Last month's vote: 27 wallets = 1.73% → expired. Record: 35 = 2.73%. This time all 3 rulebook questions vote at once, and the fallback is disclosed up front.</w:t>
+        <w:t xml:space="preserve">Last month's vote: </w:t>
+      </w:r>
+      <w:r>
+        <w:rPr>
+          <w:rFonts w:ascii="Consolas" w:cs="Consolas" w:eastAsia="Consolas" w:hAnsi="Consolas"/>
+          <w:b/>
+          <w:bCs/>
+          <w:sz w:val="20"/>
+          <w:szCs w:val="20"/>
+        </w:rPr>
+        <w:t xml:space="preserve">27 wallets = 1.73%</w:t>
+      </w:r>
+      <w:r>
+        <w:rPr>
+          <w:rFonts w:ascii="Consolas" w:cs="Consolas" w:eastAsia="Consolas" w:hAnsi="Consolas"/>
+          <w:sz w:val="20"/>
+          <w:szCs w:val="20"/>
+        </w:rPr>
+        <w:t xml:space="preserve"> → expired. Record: 35 = 2.73%. This time all 3 rulebook questions vote at once, and the fallback is disclosed up front.</w:t>
       </w:r>
     </w:p>
     <w:p>
@@ -907,7 +1163,7 @@
           <w:sz w:val="26"/>
           <w:szCs w:val="26"/>
         </w:rPr>
-        <w:t xml:space="preserve">3. LAUNCH — Telegram long post (TEXT post, ~2,770 / 4,096 chars — no image)</w:t>
+        <w:t xml:space="preserve">3. LAUNCH — Telegram long post (TEXT post, no image — 4,096-char limit)</w:t>
       </w:r>
     </w:p>
     <w:p>
@@ -1099,7 +1355,17 @@
           <w:sz w:val="20"/>
           <w:szCs w:val="20"/>
         </w:rPr>
-        <w:t xml:space="preserve">• A fallback disclosed before a single ballot: if 5% isn't reached, the most-voted outcome still becomes our working consensus</w:t>
+        <w:t xml:space="preserve">• A fallback disclosed before a single ballot: if 5% isn't reached, the </w:t>
+      </w:r>
+      <w:r>
+        <w:rPr>
+          <w:rFonts w:ascii="Consolas" w:cs="Consolas" w:eastAsia="Consolas" w:hAnsi="Consolas"/>
+          <w:b/>
+          <w:bCs/>
+          <w:sz w:val="20"/>
+          <w:szCs w:val="20"/>
+        </w:rPr>
+        <w:t xml:space="preserve">most-voted outcome still becomes our working consensus</w:t>
       </w:r>
     </w:p>
     <w:p>
@@ -1186,7 +1452,25 @@
           <w:sz w:val="20"/>
           <w:szCs w:val="20"/>
         </w:rPr>
-        <w:t xml:space="preserve">1️⃣ Global default quorum — how many people need to vote for a result to count?</w:t>
+        <w:t xml:space="preserve">1️⃣ </w:t>
+      </w:r>
+      <w:r>
+        <w:rPr>
+          <w:rFonts w:ascii="Consolas" w:cs="Consolas" w:eastAsia="Consolas" w:hAnsi="Consolas"/>
+          <w:b/>
+          <w:bCs/>
+          <w:sz w:val="20"/>
+          <w:szCs w:val="20"/>
+        </w:rPr>
+        <w:t xml:space="preserve">Global default quorum</w:t>
+      </w:r>
+      <w:r>
+        <w:rPr>
+          <w:rFonts w:ascii="Consolas" w:cs="Consolas" w:eastAsia="Consolas" w:hAnsi="Consolas"/>
+          <w:sz w:val="20"/>
+          <w:szCs w:val="20"/>
+        </w:rPr>
+        <w:t xml:space="preserve"> — how many people need to vote for a result to count?</w:t>
       </w:r>
     </w:p>
     <w:p>
@@ -1240,7 +1524,25 @@
           <w:sz w:val="20"/>
           <w:szCs w:val="20"/>
         </w:rPr>
-        <w:t xml:space="preserve">2️⃣ Pass threshold — how many "yes" votes does it take to win?</w:t>
+        <w:t xml:space="preserve">2️⃣ </w:t>
+      </w:r>
+      <w:r>
+        <w:rPr>
+          <w:rFonts w:ascii="Consolas" w:cs="Consolas" w:eastAsia="Consolas" w:hAnsi="Consolas"/>
+          <w:b/>
+          <w:bCs/>
+          <w:sz w:val="20"/>
+          <w:szCs w:val="20"/>
+        </w:rPr>
+        <w:t xml:space="preserve">Pass threshold</w:t>
+      </w:r>
+      <w:r>
+        <w:rPr>
+          <w:rFonts w:ascii="Consolas" w:cs="Consolas" w:eastAsia="Consolas" w:hAnsi="Consolas"/>
+          <w:sz w:val="20"/>
+          <w:szCs w:val="20"/>
+        </w:rPr>
+        <w:t xml:space="preserve"> — how many "yes" votes does it take to win?</w:t>
       </w:r>
     </w:p>
     <w:p>
@@ -1294,7 +1596,25 @@
           <w:sz w:val="20"/>
           <w:szCs w:val="20"/>
         </w:rPr>
-        <w:t xml:space="preserve">3️⃣ Per-type quorum schedule — should big decisions need more voters than small ones?</w:t>
+        <w:t xml:space="preserve">3️⃣ </w:t>
+      </w:r>
+      <w:r>
+        <w:rPr>
+          <w:rFonts w:ascii="Consolas" w:cs="Consolas" w:eastAsia="Consolas" w:hAnsi="Consolas"/>
+          <w:b/>
+          <w:bCs/>
+          <w:sz w:val="20"/>
+          <w:szCs w:val="20"/>
+        </w:rPr>
+        <w:t xml:space="preserve">Per-type quorum schedule</w:t>
+      </w:r>
+      <w:r>
+        <w:rPr>
+          <w:rFonts w:ascii="Consolas" w:cs="Consolas" w:eastAsia="Consolas" w:hAnsi="Consolas"/>
+          <w:sz w:val="20"/>
+          <w:szCs w:val="20"/>
+        </w:rPr>
+        <w:t xml:space="preserve"> — should big decisions need more voters than small ones?</w:t>
       </w:r>
     </w:p>
     <w:p>
@@ -1390,49 +1710,87 @@
           <w:sz w:val="20"/>
           <w:szCs w:val="20"/>
         </w:rPr>
-        <w:t xml:space="preserve">• 5% bar = 29,098,690 power ≈ 1,284 average-power wallets</w:t>
-      </w:r>
-    </w:p>
-    <w:p>
-      <w:pPr>
-        <w:pBdr>
-          <w:top w:val="single" w:color="262626" w:sz="12"/>
-          <w:left w:val="single" w:color="262626" w:sz="12"/>
-          <w:bottom w:val="single" w:color="262626" w:sz="12"/>
-          <w:right w:val="single" w:color="262626" w:sz="12"/>
-        </w:pBdr>
-        <w:shd w:fill="FAFAF5" w:val="clear"/>
-        <w:spacing w:after="0"/>
-        <w:ind w:left="200" w:right="200"/>
-      </w:pPr>
-      <w:r>
-        <w:rPr>
-          <w:rFonts w:ascii="Consolas" w:cs="Consolas" w:eastAsia="Consolas" w:hAnsi="Consolas"/>
-          <w:sz w:val="20"/>
-          <w:szCs w:val="20"/>
-        </w:rPr>
-        <w:t xml:space="preserve">• Record: 35 voters = 2.73% (Foundational Governance Election)</w:t>
-      </w:r>
-    </w:p>
-    <w:p>
-      <w:pPr>
-        <w:pBdr>
-          <w:top w:val="single" w:color="262626" w:sz="12"/>
-          <w:left w:val="single" w:color="262626" w:sz="12"/>
-          <w:bottom w:val="single" w:color="262626" w:sz="12"/>
-          <w:right w:val="single" w:color="262626" w:sz="12"/>
-        </w:pBdr>
-        <w:shd w:fill="FAFAF5" w:val="clear"/>
-        <w:spacing w:after="0"/>
-        <w:ind w:left="200" w:right="200"/>
-      </w:pPr>
-      <w:r>
-        <w:rPr>
-          <w:rFonts w:ascii="Consolas" w:cs="Consolas" w:eastAsia="Consolas" w:hAnsi="Consolas"/>
-          <w:sz w:val="20"/>
-          <w:szCs w:val="20"/>
-        </w:rPr>
-        <w:t xml:space="preserve">• Last vote: 27 voters = 1.73%</w:t>
+        <w:t xml:space="preserve">• 5% bar = </w:t>
+      </w:r>
+      <w:r>
+        <w:rPr>
+          <w:rFonts w:ascii="Consolas" w:cs="Consolas" w:eastAsia="Consolas" w:hAnsi="Consolas"/>
+          <w:b/>
+          <w:bCs/>
+          <w:sz w:val="20"/>
+          <w:szCs w:val="20"/>
+        </w:rPr>
+        <w:t xml:space="preserve">29,098,690 power ≈ 1,284 average-power wallets</w:t>
+      </w:r>
+    </w:p>
+    <w:p>
+      <w:pPr>
+        <w:pBdr>
+          <w:top w:val="single" w:color="262626" w:sz="12"/>
+          <w:left w:val="single" w:color="262626" w:sz="12"/>
+          <w:bottom w:val="single" w:color="262626" w:sz="12"/>
+          <w:right w:val="single" w:color="262626" w:sz="12"/>
+        </w:pBdr>
+        <w:shd w:fill="FAFAF5" w:val="clear"/>
+        <w:spacing w:after="0"/>
+        <w:ind w:left="200" w:right="200"/>
+      </w:pPr>
+      <w:r>
+        <w:rPr>
+          <w:rFonts w:ascii="Consolas" w:cs="Consolas" w:eastAsia="Consolas" w:hAnsi="Consolas"/>
+          <w:sz w:val="20"/>
+          <w:szCs w:val="20"/>
+        </w:rPr>
+        <w:t xml:space="preserve">• Record: </w:t>
+      </w:r>
+      <w:r>
+        <w:rPr>
+          <w:rFonts w:ascii="Consolas" w:cs="Consolas" w:eastAsia="Consolas" w:hAnsi="Consolas"/>
+          <w:b/>
+          <w:bCs/>
+          <w:sz w:val="20"/>
+          <w:szCs w:val="20"/>
+        </w:rPr>
+        <w:t xml:space="preserve">35 voters = 2.73%</w:t>
+      </w:r>
+      <w:r>
+        <w:rPr>
+          <w:rFonts w:ascii="Consolas" w:cs="Consolas" w:eastAsia="Consolas" w:hAnsi="Consolas"/>
+          <w:sz w:val="20"/>
+          <w:szCs w:val="20"/>
+        </w:rPr>
+        <w:t xml:space="preserve"> (Foundational Governance Election)</w:t>
+      </w:r>
+    </w:p>
+    <w:p>
+      <w:pPr>
+        <w:pBdr>
+          <w:top w:val="single" w:color="262626" w:sz="12"/>
+          <w:left w:val="single" w:color="262626" w:sz="12"/>
+          <w:bottom w:val="single" w:color="262626" w:sz="12"/>
+          <w:right w:val="single" w:color="262626" w:sz="12"/>
+        </w:pBdr>
+        <w:shd w:fill="FAFAF5" w:val="clear"/>
+        <w:spacing w:after="0"/>
+        <w:ind w:left="200" w:right="200"/>
+      </w:pPr>
+      <w:r>
+        <w:rPr>
+          <w:rFonts w:ascii="Consolas" w:cs="Consolas" w:eastAsia="Consolas" w:hAnsi="Consolas"/>
+          <w:sz w:val="20"/>
+          <w:szCs w:val="20"/>
+        </w:rPr>
+        <w:t xml:space="preserve">• Last vote: </w:t>
+      </w:r>
+      <w:r>
+        <w:rPr>
+          <w:rFonts w:ascii="Consolas" w:cs="Consolas" w:eastAsia="Consolas" w:hAnsi="Consolas"/>
+          <w:b/>
+          <w:bCs/>
+          <w:sz w:val="20"/>
+          <w:szCs w:val="20"/>
+        </w:rPr>
+        <w:t xml:space="preserve">27 voters = 1.73%</w:t>
       </w:r>
     </w:p>
     <w:p>
@@ -1702,7 +2060,7 @@
           <w:sz w:val="26"/>
           <w:szCs w:val="26"/>
         </w:rPr>
-        <w:t xml:space="preserve">4. LAUNCH — Telegram caption for image posts (~456 / 1,024 chars)</w:t>
+        <w:t xml:space="preserve">4. LAUNCH — Telegram caption for image posts (1,024-char limit)</w:t>
       </w:r>
     </w:p>
     <w:p>

</xml_diff>

<commit_message>
docs(announcements): paragraph spacing for the X long post
The X long post was one continuous blockquote run — no blank separators —
so it rendered (and would have posted) as a wall of text. Logical
paragraphs now separated by blank blockquote lines in the source, and the
Word extractor preserves them as spacers instead of dropping empties.

Co-Authored-By: Claude Code <noreply@anthropic.com>
</commit_message>
<xml_diff>
--- a/DOCS/announcements/Wave1-Referendum-Copy.docx
+++ b/DOCS/announcements/Wave1-Referendum-Copy.docx
@@ -27,7 +27,7 @@
           <w:sz w:val="18"/>
           <w:szCs w:val="18"/>
         </w:rPr>
-        <w:t xml:space="preserve">v4 — includes the Week 1 story + real bold (pastes as bold into X Premium and Telegram) · matches the live ballots: opened Oct 1, closes Nov 1, 00:00 UTC · verify gate GREEN.</w:t>
+        <w:t xml:space="preserve">v5 — X long post now has real paragraph spacing (in the doc AND on the post itself) · includes the Week 1 story · real bold throughout · opened Oct 1, closes Nov 1, 00:00 UTC · verify gate GREEN.</w:t>
       </w:r>
     </w:p>
     <w:p>
@@ -99,44 +99,36 @@
           <w:sz w:val="20"/>
           <w:szCs w:val="20"/>
         </w:rPr>
-        <w:t xml:space="preserve">🗳️ </w:t>
-      </w:r>
-      <w:r>
-        <w:rPr>
-          <w:rFonts w:ascii="Consolas" w:cs="Consolas" w:eastAsia="Consolas" w:hAnsi="Consolas"/>
-          <w:b/>
-          <w:bCs/>
-          <w:sz w:val="20"/>
-          <w:szCs w:val="20"/>
-        </w:rPr>
-        <w:t xml:space="preserve">THE $OMNOM RULEBOOK VOTE IS LIVE</w:t>
-      </w:r>
-      <w:r>
-        <w:rPr>
-          <w:rFonts w:ascii="Consolas" w:cs="Consolas" w:eastAsia="Consolas" w:hAnsi="Consolas"/>
-          <w:sz w:val="20"/>
-          <w:szCs w:val="20"/>
-        </w:rPr>
-        <w:t xml:space="preserve"> — and this time, the full story.</w:t>
-      </w:r>
-    </w:p>
-    <w:p>
-      <w:pPr>
-        <w:pBdr>
-          <w:top w:val="single" w:color="262626" w:sz="12"/>
-          <w:left w:val="single" w:color="262626" w:sz="12"/>
-          <w:bottom w:val="single" w:color="262626" w:sz="12"/>
-          <w:right w:val="single" w:color="262626" w:sz="12"/>
-        </w:pBdr>
-        <w:shd w:fill="FAFAF5" w:val="clear"/>
-        <w:spacing w:after="0"/>
-        <w:ind w:left="200" w:right="200"/>
-      </w:pPr>
-      <w:r>
-        <w:rPr>
-          <w:rFonts w:ascii="Consolas" w:cs="Consolas" w:eastAsia="Consolas" w:hAnsi="Consolas"/>
-          <w:b/>
-          <w:bCs/>
+        <w:t xml:space="preserve">🗳️ THE $OMNOM RULEBOOK VOTE IS LIVE — and this time, the full story.</w:t>
+      </w:r>
+    </w:p>
+    <w:p>
+      <w:pPr>
+        <w:pBdr>
+          <w:top w:val="single" w:color="262626" w:sz="12"/>
+          <w:left w:val="single" w:color="262626" w:sz="12"/>
+          <w:bottom w:val="single" w:color="262626" w:sz="12"/>
+          <w:right w:val="single" w:color="262626" w:sz="12"/>
+        </w:pBdr>
+        <w:shd w:fill="FAFAF5" w:val="clear"/>
+        <w:spacing w:after="100"/>
+      </w:pPr>
+    </w:p>
+    <w:p>
+      <w:pPr>
+        <w:pBdr>
+          <w:top w:val="single" w:color="262626" w:sz="12"/>
+          <w:left w:val="single" w:color="262626" w:sz="12"/>
+          <w:bottom w:val="single" w:color="262626" w:sz="12"/>
+          <w:right w:val="single" w:color="262626" w:sz="12"/>
+        </w:pBdr>
+        <w:shd w:fill="FAFAF5" w:val="clear"/>
+        <w:spacing w:after="0"/>
+        <w:ind w:left="200" w:right="200"/>
+      </w:pPr>
+      <w:r>
+        <w:rPr>
+          <w:rFonts w:ascii="Consolas" w:cs="Consolas" w:eastAsia="Consolas" w:hAnsi="Consolas"/>
           <w:sz w:val="20"/>
           <w:szCs w:val="20"/>
         </w:rPr>
@@ -152,6 +144,18 @@
           <w:right w:val="single" w:color="262626" w:sz="12"/>
         </w:pBdr>
         <w:shd w:fill="FAFAF5" w:val="clear"/>
+        <w:spacing w:after="100"/>
+      </w:pPr>
+    </w:p>
+    <w:p>
+      <w:pPr>
+        <w:pBdr>
+          <w:top w:val="single" w:color="262626" w:sz="12"/>
+          <w:left w:val="single" w:color="262626" w:sz="12"/>
+          <w:bottom w:val="single" w:color="262626" w:sz="12"/>
+          <w:right w:val="single" w:color="262626" w:sz="12"/>
+        </w:pBdr>
+        <w:shd w:fill="FAFAF5" w:val="clear"/>
         <w:spacing w:after="0"/>
         <w:ind w:left="200" w:right="200"/>
       </w:pPr>
@@ -173,6 +177,18 @@
           <w:right w:val="single" w:color="262626" w:sz="12"/>
         </w:pBdr>
         <w:shd w:fill="FAFAF5" w:val="clear"/>
+        <w:spacing w:after="100"/>
+      </w:pPr>
+    </w:p>
+    <w:p>
+      <w:pPr>
+        <w:pBdr>
+          <w:top w:val="single" w:color="262626" w:sz="12"/>
+          <w:left w:val="single" w:color="262626" w:sz="12"/>
+          <w:bottom w:val="single" w:color="262626" w:sz="12"/>
+          <w:right w:val="single" w:color="262626" w:sz="12"/>
+        </w:pBdr>
+        <w:shd w:fill="FAFAF5" w:val="clear"/>
         <w:spacing w:after="0"/>
         <w:ind w:left="200" w:right="200"/>
       </w:pPr>
@@ -194,14 +210,24 @@
           <w:right w:val="single" w:color="262626" w:sz="12"/>
         </w:pBdr>
         <w:shd w:fill="FAFAF5" w:val="clear"/>
-        <w:spacing w:after="0"/>
-        <w:ind w:left="200" w:right="200"/>
-      </w:pPr>
-      <w:r>
-        <w:rPr>
-          <w:rFonts w:ascii="Consolas" w:cs="Consolas" w:eastAsia="Consolas" w:hAnsi="Consolas"/>
-          <w:b/>
-          <w:bCs/>
+        <w:spacing w:after="100"/>
+      </w:pPr>
+    </w:p>
+    <w:p>
+      <w:pPr>
+        <w:pBdr>
+          <w:top w:val="single" w:color="262626" w:sz="12"/>
+          <w:left w:val="single" w:color="262626" w:sz="12"/>
+          <w:bottom w:val="single" w:color="262626" w:sz="12"/>
+          <w:right w:val="single" w:color="262626" w:sz="12"/>
+        </w:pBdr>
+        <w:shd w:fill="FAFAF5" w:val="clear"/>
+        <w:spacing w:after="0"/>
+        <w:ind w:left="200" w:right="200"/>
+      </w:pPr>
+      <w:r>
+        <w:rPr>
+          <w:rFonts w:ascii="Consolas" w:cs="Consolas" w:eastAsia="Consolas" w:hAnsi="Consolas"/>
           <w:sz w:val="20"/>
           <w:szCs w:val="20"/>
         </w:rPr>
@@ -217,6 +243,18 @@
           <w:right w:val="single" w:color="262626" w:sz="12"/>
         </w:pBdr>
         <w:shd w:fill="FAFAF5" w:val="clear"/>
+        <w:spacing w:after="100"/>
+      </w:pPr>
+    </w:p>
+    <w:p>
+      <w:pPr>
+        <w:pBdr>
+          <w:top w:val="single" w:color="262626" w:sz="12"/>
+          <w:left w:val="single" w:color="262626" w:sz="12"/>
+          <w:bottom w:val="single" w:color="262626" w:sz="12"/>
+          <w:right w:val="single" w:color="262626" w:sz="12"/>
+        </w:pBdr>
+        <w:shd w:fill="FAFAF5" w:val="clear"/>
         <w:spacing w:after="0"/>
         <w:ind w:left="200" w:right="200"/>
       </w:pPr>
@@ -238,6 +276,18 @@
           <w:right w:val="single" w:color="262626" w:sz="12"/>
         </w:pBdr>
         <w:shd w:fill="FAFAF5" w:val="clear"/>
+        <w:spacing w:after="100"/>
+      </w:pPr>
+    </w:p>
+    <w:p>
+      <w:pPr>
+        <w:pBdr>
+          <w:top w:val="single" w:color="262626" w:sz="12"/>
+          <w:left w:val="single" w:color="262626" w:sz="12"/>
+          <w:bottom w:val="single" w:color="262626" w:sz="12"/>
+          <w:right w:val="single" w:color="262626" w:sz="12"/>
+        </w:pBdr>
+        <w:shd w:fill="FAFAF5" w:val="clear"/>
         <w:spacing w:after="0"/>
         <w:ind w:left="200" w:right="200"/>
       </w:pPr>
@@ -289,25 +339,7 @@
           <w:sz w:val="20"/>
           <w:szCs w:val="20"/>
         </w:rPr>
-        <w:t xml:space="preserve">▪ A fallback rule disclosed before a single ballot: if 5% isn't reached, the </w:t>
-      </w:r>
-      <w:r>
-        <w:rPr>
-          <w:rFonts w:ascii="Consolas" w:cs="Consolas" w:eastAsia="Consolas" w:hAnsi="Consolas"/>
-          <w:b/>
-          <w:bCs/>
-          <w:sz w:val="20"/>
-          <w:szCs w:val="20"/>
-        </w:rPr>
-        <w:t xml:space="preserve">most-voted outcome still becomes our working consensus</w:t>
-      </w:r>
-      <w:r>
-        <w:rPr>
-          <w:rFonts w:ascii="Consolas" w:cs="Consolas" w:eastAsia="Consolas" w:hAnsi="Consolas"/>
-          <w:sz w:val="20"/>
-          <w:szCs w:val="20"/>
-        </w:rPr>
-        <w:t xml:space="preserve"> — recorded openly as quorum-missed, re-confirmed in a later ratification vote</w:t>
+        <w:t xml:space="preserve">▪ A fallback rule disclosed before a single ballot: if 5% isn't reached, the most-voted outcome still becomes our working consensus — recorded openly as quorum-missed, re-confirmed in a later ratification vote</w:t>
       </w:r>
     </w:p>
     <w:p>
@@ -340,65 +372,61 @@
           <w:right w:val="single" w:color="262626" w:sz="12"/>
         </w:pBdr>
         <w:shd w:fill="FAFAF5" w:val="clear"/>
-        <w:spacing w:after="0"/>
-        <w:ind w:left="200" w:right="200"/>
-      </w:pPr>
-      <w:r>
-        <w:rPr>
-          <w:rFonts w:ascii="Consolas" w:cs="Consolas" w:eastAsia="Consolas" w:hAnsi="Consolas"/>
-          <w:b/>
-          <w:bCs/>
-          <w:sz w:val="20"/>
-          <w:szCs w:val="20"/>
-        </w:rPr>
-        <w:t xml:space="preserve">THE THREE QUESTIONS</w:t>
-      </w:r>
-      <w:r>
-        <w:rPr>
-          <w:rFonts w:ascii="Consolas" w:cs="Consolas" w:eastAsia="Consolas" w:hAnsi="Consolas"/>
-          <w:sz w:val="20"/>
-          <w:szCs w:val="20"/>
-        </w:rPr>
-        <w:t xml:space="preserve"> (one FOR/AGAINST/ABSTAIN ballot each — your voting power is √ of your snapshot balance):</w:t>
-      </w:r>
-    </w:p>
-    <w:p>
-      <w:pPr>
-        <w:pBdr>
-          <w:top w:val="single" w:color="262626" w:sz="12"/>
-          <w:left w:val="single" w:color="262626" w:sz="12"/>
-          <w:bottom w:val="single" w:color="262626" w:sz="12"/>
-          <w:right w:val="single" w:color="262626" w:sz="12"/>
-        </w:pBdr>
-        <w:shd w:fill="FAFAF5" w:val="clear"/>
-        <w:spacing w:after="0"/>
-        <w:ind w:left="200" w:right="200"/>
-      </w:pPr>
-      <w:r>
-        <w:rPr>
-          <w:rFonts w:ascii="Consolas" w:cs="Consolas" w:eastAsia="Consolas" w:hAnsi="Consolas"/>
-          <w:sz w:val="20"/>
-          <w:szCs w:val="20"/>
-        </w:rPr>
-        <w:t xml:space="preserve">1️⃣ </w:t>
-      </w:r>
-      <w:r>
-        <w:rPr>
-          <w:rFonts w:ascii="Consolas" w:cs="Consolas" w:eastAsia="Consolas" w:hAnsi="Consolas"/>
-          <w:b/>
-          <w:bCs/>
-          <w:sz w:val="20"/>
-          <w:szCs w:val="20"/>
-        </w:rPr>
-        <w:t xml:space="preserve">Global default quorum</w:t>
-      </w:r>
-      <w:r>
-        <w:rPr>
-          <w:rFonts w:ascii="Consolas" w:cs="Consolas" w:eastAsia="Consolas" w:hAnsi="Consolas"/>
-          <w:sz w:val="20"/>
-          <w:szCs w:val="20"/>
-        </w:rPr>
-        <w:t xml:space="preserve"> — how many people need to vote for a result to count?</w:t>
+        <w:spacing w:after="100"/>
+      </w:pPr>
+    </w:p>
+    <w:p>
+      <w:pPr>
+        <w:pBdr>
+          <w:top w:val="single" w:color="262626" w:sz="12"/>
+          <w:left w:val="single" w:color="262626" w:sz="12"/>
+          <w:bottom w:val="single" w:color="262626" w:sz="12"/>
+          <w:right w:val="single" w:color="262626" w:sz="12"/>
+        </w:pBdr>
+        <w:shd w:fill="FAFAF5" w:val="clear"/>
+        <w:spacing w:after="0"/>
+        <w:ind w:left="200" w:right="200"/>
+      </w:pPr>
+      <w:r>
+        <w:rPr>
+          <w:rFonts w:ascii="Consolas" w:cs="Consolas" w:eastAsia="Consolas" w:hAnsi="Consolas"/>
+          <w:sz w:val="20"/>
+          <w:szCs w:val="20"/>
+        </w:rPr>
+        <w:t xml:space="preserve">THE THREE QUESTIONS (one FOR/AGAINST/ABSTAIN ballot each — your voting power is √ of your snapshot balance):</w:t>
+      </w:r>
+    </w:p>
+    <w:p>
+      <w:pPr>
+        <w:pBdr>
+          <w:top w:val="single" w:color="262626" w:sz="12"/>
+          <w:left w:val="single" w:color="262626" w:sz="12"/>
+          <w:bottom w:val="single" w:color="262626" w:sz="12"/>
+          <w:right w:val="single" w:color="262626" w:sz="12"/>
+        </w:pBdr>
+        <w:shd w:fill="FAFAF5" w:val="clear"/>
+        <w:spacing w:after="100"/>
+      </w:pPr>
+    </w:p>
+    <w:p>
+      <w:pPr>
+        <w:pBdr>
+          <w:top w:val="single" w:color="262626" w:sz="12"/>
+          <w:left w:val="single" w:color="262626" w:sz="12"/>
+          <w:bottom w:val="single" w:color="262626" w:sz="12"/>
+          <w:right w:val="single" w:color="262626" w:sz="12"/>
+        </w:pBdr>
+        <w:shd w:fill="FAFAF5" w:val="clear"/>
+        <w:spacing w:after="0"/>
+        <w:ind w:left="200" w:right="200"/>
+      </w:pPr>
+      <w:r>
+        <w:rPr>
+          <w:rFonts w:ascii="Consolas" w:cs="Consolas" w:eastAsia="Consolas" w:hAnsi="Consolas"/>
+          <w:sz w:val="20"/>
+          <w:szCs w:val="20"/>
+        </w:rPr>
+        <w:t xml:space="preserve">1️⃣ Global default quorum — how many people need to vote for a result to count?</w:t>
       </w:r>
     </w:p>
     <w:p>
@@ -431,34 +459,28 @@
           <w:right w:val="single" w:color="262626" w:sz="12"/>
         </w:pBdr>
         <w:shd w:fill="FAFAF5" w:val="clear"/>
-        <w:spacing w:after="0"/>
-        <w:ind w:left="200" w:right="200"/>
-      </w:pPr>
-      <w:r>
-        <w:rPr>
-          <w:rFonts w:ascii="Consolas" w:cs="Consolas" w:eastAsia="Consolas" w:hAnsi="Consolas"/>
-          <w:sz w:val="20"/>
-          <w:szCs w:val="20"/>
-        </w:rPr>
-        <w:t xml:space="preserve">2️⃣ </w:t>
-      </w:r>
-      <w:r>
-        <w:rPr>
-          <w:rFonts w:ascii="Consolas" w:cs="Consolas" w:eastAsia="Consolas" w:hAnsi="Consolas"/>
-          <w:b/>
-          <w:bCs/>
-          <w:sz w:val="20"/>
-          <w:szCs w:val="20"/>
-        </w:rPr>
-        <w:t xml:space="preserve">Pass threshold</w:t>
-      </w:r>
-      <w:r>
-        <w:rPr>
-          <w:rFonts w:ascii="Consolas" w:cs="Consolas" w:eastAsia="Consolas" w:hAnsi="Consolas"/>
-          <w:sz w:val="20"/>
-          <w:szCs w:val="20"/>
-        </w:rPr>
-        <w:t xml:space="preserve"> — how many "yes" votes does it take to win?</w:t>
+        <w:spacing w:after="100"/>
+      </w:pPr>
+    </w:p>
+    <w:p>
+      <w:pPr>
+        <w:pBdr>
+          <w:top w:val="single" w:color="262626" w:sz="12"/>
+          <w:left w:val="single" w:color="262626" w:sz="12"/>
+          <w:bottom w:val="single" w:color="262626" w:sz="12"/>
+          <w:right w:val="single" w:color="262626" w:sz="12"/>
+        </w:pBdr>
+        <w:shd w:fill="FAFAF5" w:val="clear"/>
+        <w:spacing w:after="0"/>
+        <w:ind w:left="200" w:right="200"/>
+      </w:pPr>
+      <w:r>
+        <w:rPr>
+          <w:rFonts w:ascii="Consolas" w:cs="Consolas" w:eastAsia="Consolas" w:hAnsi="Consolas"/>
+          <w:sz w:val="20"/>
+          <w:szCs w:val="20"/>
+        </w:rPr>
+        <w:t xml:space="preserve">2️⃣ Pass threshold — how many "yes" votes does it take to win?</w:t>
       </w:r>
     </w:p>
     <w:p>
@@ -491,34 +513,28 @@
           <w:right w:val="single" w:color="262626" w:sz="12"/>
         </w:pBdr>
         <w:shd w:fill="FAFAF5" w:val="clear"/>
-        <w:spacing w:after="0"/>
-        <w:ind w:left="200" w:right="200"/>
-      </w:pPr>
-      <w:r>
-        <w:rPr>
-          <w:rFonts w:ascii="Consolas" w:cs="Consolas" w:eastAsia="Consolas" w:hAnsi="Consolas"/>
-          <w:sz w:val="20"/>
-          <w:szCs w:val="20"/>
-        </w:rPr>
-        <w:t xml:space="preserve">3️⃣ </w:t>
-      </w:r>
-      <w:r>
-        <w:rPr>
-          <w:rFonts w:ascii="Consolas" w:cs="Consolas" w:eastAsia="Consolas" w:hAnsi="Consolas"/>
-          <w:b/>
-          <w:bCs/>
-          <w:sz w:val="20"/>
-          <w:szCs w:val="20"/>
-        </w:rPr>
-        <w:t xml:space="preserve">Per-type quorum schedule</w:t>
-      </w:r>
-      <w:r>
-        <w:rPr>
-          <w:rFonts w:ascii="Consolas" w:cs="Consolas" w:eastAsia="Consolas" w:hAnsi="Consolas"/>
-          <w:sz w:val="20"/>
-          <w:szCs w:val="20"/>
-        </w:rPr>
-        <w:t xml:space="preserve"> — should big decisions need more voters than small ones?</w:t>
+        <w:spacing w:after="100"/>
+      </w:pPr>
+    </w:p>
+    <w:p>
+      <w:pPr>
+        <w:pBdr>
+          <w:top w:val="single" w:color="262626" w:sz="12"/>
+          <w:left w:val="single" w:color="262626" w:sz="12"/>
+          <w:bottom w:val="single" w:color="262626" w:sz="12"/>
+          <w:right w:val="single" w:color="262626" w:sz="12"/>
+        </w:pBdr>
+        <w:shd w:fill="FAFAF5" w:val="clear"/>
+        <w:spacing w:after="0"/>
+        <w:ind w:left="200" w:right="200"/>
+      </w:pPr>
+      <w:r>
+        <w:rPr>
+          <w:rFonts w:ascii="Consolas" w:cs="Consolas" w:eastAsia="Consolas" w:hAnsi="Consolas"/>
+          <w:sz w:val="20"/>
+          <w:szCs w:val="20"/>
+        </w:rPr>
+        <w:t xml:space="preserve">3️⃣ Per-type quorum schedule — should big decisions need more voters than small ones?</w:t>
       </w:r>
     </w:p>
     <w:p>
@@ -551,27 +567,41 @@
           <w:right w:val="single" w:color="262626" w:sz="12"/>
         </w:pBdr>
         <w:shd w:fill="FAFAF5" w:val="clear"/>
-        <w:spacing w:after="0"/>
-        <w:ind w:left="200" w:right="200"/>
-      </w:pPr>
-      <w:r>
-        <w:rPr>
-          <w:rFonts w:ascii="Consolas" w:cs="Consolas" w:eastAsia="Consolas" w:hAnsi="Consolas"/>
-          <w:b/>
-          <w:bCs/>
-          <w:sz w:val="20"/>
-          <w:szCs w:val="20"/>
-        </w:rPr>
-        <w:t xml:space="preserve">THE HONEST MATH</w:t>
-      </w:r>
-      <w:r>
-        <w:rPr>
-          <w:rFonts w:ascii="Consolas" w:cs="Consolas" w:eastAsia="Consolas" w:hAnsi="Consolas"/>
-          <w:sz w:val="20"/>
-          <w:szCs w:val="20"/>
-        </w:rPr>
-        <w:t xml:space="preserve"> (from the pinned snapshot — verifiable by anyone):</w:t>
-      </w:r>
+        <w:spacing w:after="100"/>
+      </w:pPr>
+    </w:p>
+    <w:p>
+      <w:pPr>
+        <w:pBdr>
+          <w:top w:val="single" w:color="262626" w:sz="12"/>
+          <w:left w:val="single" w:color="262626" w:sz="12"/>
+          <w:bottom w:val="single" w:color="262626" w:sz="12"/>
+          <w:right w:val="single" w:color="262626" w:sz="12"/>
+        </w:pBdr>
+        <w:shd w:fill="FAFAF5" w:val="clear"/>
+        <w:spacing w:after="0"/>
+        <w:ind w:left="200" w:right="200"/>
+      </w:pPr>
+      <w:r>
+        <w:rPr>
+          <w:rFonts w:ascii="Consolas" w:cs="Consolas" w:eastAsia="Consolas" w:hAnsi="Consolas"/>
+          <w:sz w:val="20"/>
+          <w:szCs w:val="20"/>
+        </w:rPr>
+        <w:t xml:space="preserve">THE HONEST MATH (from the pinned snapshot — verifiable by anyone):</w:t>
+      </w:r>
+    </w:p>
+    <w:p>
+      <w:pPr>
+        <w:pBdr>
+          <w:top w:val="single" w:color="262626" w:sz="12"/>
+          <w:left w:val="single" w:color="262626" w:sz="12"/>
+          <w:bottom w:val="single" w:color="262626" w:sz="12"/>
+          <w:right w:val="single" w:color="262626" w:sz="12"/>
+        </w:pBdr>
+        <w:shd w:fill="FAFAF5" w:val="clear"/>
+        <w:spacing w:after="100"/>
+      </w:pPr>
     </w:p>
     <w:p>
       <w:pPr>
@@ -612,87 +642,49 @@
           <w:sz w:val="20"/>
           <w:szCs w:val="20"/>
         </w:rPr>
-        <w:t xml:space="preserve">5% bar: </w:t>
-      </w:r>
-      <w:r>
-        <w:rPr>
-          <w:rFonts w:ascii="Consolas" w:cs="Consolas" w:eastAsia="Consolas" w:hAnsi="Consolas"/>
-          <w:b/>
-          <w:bCs/>
-          <w:sz w:val="20"/>
-          <w:szCs w:val="20"/>
-        </w:rPr>
-        <w:t xml:space="preserve">29,098,690 power ≈ 1,284 average-power wallets</w:t>
-      </w:r>
-    </w:p>
-    <w:p>
-      <w:pPr>
-        <w:pBdr>
-          <w:top w:val="single" w:color="262626" w:sz="12"/>
-          <w:left w:val="single" w:color="262626" w:sz="12"/>
-          <w:bottom w:val="single" w:color="262626" w:sz="12"/>
-          <w:right w:val="single" w:color="262626" w:sz="12"/>
-        </w:pBdr>
-        <w:shd w:fill="FAFAF5" w:val="clear"/>
-        <w:spacing w:after="0"/>
-        <w:ind w:left="200" w:right="200"/>
-      </w:pPr>
-      <w:r>
-        <w:rPr>
-          <w:rFonts w:ascii="Consolas" w:cs="Consolas" w:eastAsia="Consolas" w:hAnsi="Consolas"/>
-          <w:sz w:val="20"/>
-          <w:szCs w:val="20"/>
-        </w:rPr>
-        <w:t xml:space="preserve">Record turnout: </w:t>
-      </w:r>
-      <w:r>
-        <w:rPr>
-          <w:rFonts w:ascii="Consolas" w:cs="Consolas" w:eastAsia="Consolas" w:hAnsi="Consolas"/>
-          <w:b/>
-          <w:bCs/>
-          <w:sz w:val="20"/>
-          <w:szCs w:val="20"/>
-        </w:rPr>
-        <w:t xml:space="preserve">35 voters = 2.73%</w:t>
-      </w:r>
-      <w:r>
-        <w:rPr>
-          <w:rFonts w:ascii="Consolas" w:cs="Consolas" w:eastAsia="Consolas" w:hAnsi="Consolas"/>
-          <w:sz w:val="20"/>
-          <w:szCs w:val="20"/>
-        </w:rPr>
-        <w:t xml:space="preserve"> (Foundational Governance Election)</w:t>
-      </w:r>
-    </w:p>
-    <w:p>
-      <w:pPr>
-        <w:pBdr>
-          <w:top w:val="single" w:color="262626" w:sz="12"/>
-          <w:left w:val="single" w:color="262626" w:sz="12"/>
-          <w:bottom w:val="single" w:color="262626" w:sz="12"/>
-          <w:right w:val="single" w:color="262626" w:sz="12"/>
-        </w:pBdr>
-        <w:shd w:fill="FAFAF5" w:val="clear"/>
-        <w:spacing w:after="0"/>
-        <w:ind w:left="200" w:right="200"/>
-      </w:pPr>
-      <w:r>
-        <w:rPr>
-          <w:rFonts w:ascii="Consolas" w:cs="Consolas" w:eastAsia="Consolas" w:hAnsi="Consolas"/>
-          <w:sz w:val="20"/>
-          <w:szCs w:val="20"/>
-        </w:rPr>
-        <w:t xml:space="preserve">Last vote: </w:t>
-      </w:r>
-      <w:r>
-        <w:rPr>
-          <w:rFonts w:ascii="Consolas" w:cs="Consolas" w:eastAsia="Consolas" w:hAnsi="Consolas"/>
-          <w:b/>
-          <w:bCs/>
-          <w:sz w:val="20"/>
-          <w:szCs w:val="20"/>
-        </w:rPr>
-        <w:t xml:space="preserve">27 voters = 1.73%</w:t>
+        <w:t xml:space="preserve">5% bar: 29,098,690 power ≈ 1,284 average-power wallets</w:t>
+      </w:r>
+    </w:p>
+    <w:p>
+      <w:pPr>
+        <w:pBdr>
+          <w:top w:val="single" w:color="262626" w:sz="12"/>
+          <w:left w:val="single" w:color="262626" w:sz="12"/>
+          <w:bottom w:val="single" w:color="262626" w:sz="12"/>
+          <w:right w:val="single" w:color="262626" w:sz="12"/>
+        </w:pBdr>
+        <w:shd w:fill="FAFAF5" w:val="clear"/>
+        <w:spacing w:after="0"/>
+        <w:ind w:left="200" w:right="200"/>
+      </w:pPr>
+      <w:r>
+        <w:rPr>
+          <w:rFonts w:ascii="Consolas" w:cs="Consolas" w:eastAsia="Consolas" w:hAnsi="Consolas"/>
+          <w:sz w:val="20"/>
+          <w:szCs w:val="20"/>
+        </w:rPr>
+        <w:t xml:space="preserve">Record turnout: 35 voters = 2.73% (Foundational Governance Election)</w:t>
+      </w:r>
+    </w:p>
+    <w:p>
+      <w:pPr>
+        <w:pBdr>
+          <w:top w:val="single" w:color="262626" w:sz="12"/>
+          <w:left w:val="single" w:color="262626" w:sz="12"/>
+          <w:bottom w:val="single" w:color="262626" w:sz="12"/>
+          <w:right w:val="single" w:color="262626" w:sz="12"/>
+        </w:pBdr>
+        <w:shd w:fill="FAFAF5" w:val="clear"/>
+        <w:spacing w:after="0"/>
+        <w:ind w:left="200" w:right="200"/>
+      </w:pPr>
+      <w:r>
+        <w:rPr>
+          <w:rFonts w:ascii="Consolas" w:cs="Consolas" w:eastAsia="Consolas" w:hAnsi="Consolas"/>
+          <w:sz w:val="20"/>
+          <w:szCs w:val="20"/>
+        </w:rPr>
+        <w:t xml:space="preserve">Last vote: 27 voters = 1.73%</w:t>
       </w:r>
     </w:p>
     <w:p>
@@ -725,146 +717,128 @@
           <w:right w:val="single" w:color="262626" w:sz="12"/>
         </w:pBdr>
         <w:shd w:fill="FAFAF5" w:val="clear"/>
-        <w:spacing w:after="0"/>
-        <w:ind w:left="200" w:right="200"/>
-      </w:pPr>
-      <w:r>
-        <w:rPr>
-          <w:rFonts w:ascii="Consolas" w:cs="Consolas" w:eastAsia="Consolas" w:hAnsi="Consolas"/>
-          <w:b/>
-          <w:bCs/>
-          <w:sz w:val="20"/>
-          <w:szCs w:val="20"/>
-        </w:rPr>
-        <w:t xml:space="preserve">IF WE MISS 5%</w:t>
-      </w:r>
-      <w:r>
-        <w:rPr>
-          <w:rFonts w:ascii="Consolas" w:cs="Consolas" w:eastAsia="Consolas" w:hAnsi="Consolas"/>
-          <w:sz w:val="20"/>
-          <w:szCs w:val="20"/>
-        </w:rPr>
-        <w:t xml:space="preserve"> — the fallback, exactly as published before a single ballot:</w:t>
-      </w:r>
-    </w:p>
-    <w:p>
-      <w:pPr>
-        <w:pBdr>
-          <w:top w:val="single" w:color="262626" w:sz="12"/>
-          <w:left w:val="single" w:color="262626" w:sz="12"/>
-          <w:bottom w:val="single" w:color="262626" w:sz="12"/>
-          <w:right w:val="single" w:color="262626" w:sz="12"/>
-        </w:pBdr>
-        <w:shd w:fill="FAFAF5" w:val="clear"/>
-        <w:spacing w:after="0"/>
-        <w:ind w:left="200" w:right="200"/>
-      </w:pPr>
-      <w:r>
-        <w:rPr>
-          <w:rFonts w:ascii="Consolas" w:cs="Consolas" w:eastAsia="Consolas" w:hAnsi="Consolas"/>
-          <w:sz w:val="20"/>
-          <w:szCs w:val="20"/>
-        </w:rPr>
-        <w:t xml:space="preserve">The </w:t>
-      </w:r>
-      <w:r>
-        <w:rPr>
-          <w:rFonts w:ascii="Consolas" w:cs="Consolas" w:eastAsia="Consolas" w:hAnsi="Consolas"/>
-          <w:b/>
-          <w:bCs/>
-          <w:sz w:val="20"/>
-          <w:szCs w:val="20"/>
-        </w:rPr>
-        <w:t xml:space="preserve">most-voted outcome per question is adopted as our working consensus</w:t>
-      </w:r>
-      <w:r>
-        <w:rPr>
-          <w:rFonts w:ascii="Consolas" w:cs="Consolas" w:eastAsia="Consolas" w:hAnsi="Consolas"/>
-          <w:sz w:val="20"/>
-          <w:szCs w:val="20"/>
-        </w:rPr>
-        <w:t xml:space="preserve">. Recorded openly as quorum-missed (final turnout attached), re-confirmed in a later ratification vote as turnout grows. And the adoption happens in public: intent announced, 24 hours of cooling-off, then recorded — every step in the audit log anyone can read.</w:t>
-      </w:r>
-    </w:p>
-    <w:p>
-      <w:pPr>
-        <w:pBdr>
-          <w:top w:val="single" w:color="262626" w:sz="12"/>
-          <w:left w:val="single" w:color="262626" w:sz="12"/>
-          <w:bottom w:val="single" w:color="262626" w:sz="12"/>
-          <w:right w:val="single" w:color="262626" w:sz="12"/>
-        </w:pBdr>
-        <w:shd w:fill="FAFAF5" w:val="clear"/>
-        <w:spacing w:after="0"/>
-        <w:ind w:left="200" w:right="200"/>
-      </w:pPr>
-      <w:r>
-        <w:rPr>
-          <w:rFonts w:ascii="Consolas" w:cs="Consolas" w:eastAsia="Consolas" w:hAnsi="Consolas"/>
-          <w:b/>
-          <w:bCs/>
-          <w:sz w:val="20"/>
-          <w:szCs w:val="20"/>
-        </w:rPr>
-        <w:t xml:space="preserve">IF WE HIT 5%</w:t>
-      </w:r>
-      <w:r>
-        <w:rPr>
-          <w:rFonts w:ascii="Consolas" w:cs="Consolas" w:eastAsia="Consolas" w:hAnsi="Consolas"/>
-          <w:sz w:val="20"/>
-          <w:szCs w:val="20"/>
-        </w:rPr>
-        <w:t xml:space="preserve"> — binding, quorum-backed, no asterisk. The first fully ratified rulebook in this DAO's history.</w:t>
-      </w:r>
-    </w:p>
-    <w:p>
-      <w:pPr>
-        <w:pBdr>
-          <w:top w:val="single" w:color="262626" w:sz="12"/>
-          <w:left w:val="single" w:color="262626" w:sz="12"/>
-          <w:bottom w:val="single" w:color="262626" w:sz="12"/>
-          <w:right w:val="single" w:color="262626" w:sz="12"/>
-        </w:pBdr>
-        <w:shd w:fill="FAFAF5" w:val="clear"/>
-        <w:spacing w:after="0"/>
-        <w:ind w:left="200" w:right="200"/>
-      </w:pPr>
-      <w:r>
-        <w:rPr>
-          <w:rFonts w:ascii="Consolas" w:cs="Consolas" w:eastAsia="Consolas" w:hAnsi="Consolas"/>
-          <w:b/>
-          <w:bCs/>
-          <w:sz w:val="20"/>
-          <w:szCs w:val="20"/>
-        </w:rPr>
-        <w:t xml:space="preserve">WHO THIS IS FOR</w:t>
-      </w:r>
-      <w:r>
-        <w:rPr>
-          <w:rFonts w:ascii="Consolas" w:cs="Consolas" w:eastAsia="Consolas" w:hAnsi="Consolas"/>
-          <w:sz w:val="20"/>
-          <w:szCs w:val="20"/>
-        </w:rPr>
-        <w:t xml:space="preserve">: every wallet that ever held ≥1 $OMNOM — 25,686 of you. Gasless. One signature. Changeable any time until </w:t>
-      </w:r>
-      <w:r>
-        <w:rPr>
-          <w:rFonts w:ascii="Consolas" w:cs="Consolas" w:eastAsia="Consolas" w:hAnsi="Consolas"/>
-          <w:b/>
-          <w:bCs/>
-          <w:sz w:val="20"/>
-          <w:szCs w:val="20"/>
-        </w:rPr>
-        <w:t xml:space="preserve">Nov 1, 00:00 UTC</w:t>
-      </w:r>
-      <w:r>
-        <w:rPr>
-          <w:rFonts w:ascii="Consolas" w:cs="Consolas" w:eastAsia="Consolas" w:hAnsi="Consolas"/>
-          <w:sz w:val="20"/>
-          <w:szCs w:val="20"/>
-        </w:rPr>
-        <w:t xml:space="preserve">.</w:t>
-      </w:r>
+        <w:spacing w:after="100"/>
+      </w:pPr>
+    </w:p>
+    <w:p>
+      <w:pPr>
+        <w:pBdr>
+          <w:top w:val="single" w:color="262626" w:sz="12"/>
+          <w:left w:val="single" w:color="262626" w:sz="12"/>
+          <w:bottom w:val="single" w:color="262626" w:sz="12"/>
+          <w:right w:val="single" w:color="262626" w:sz="12"/>
+        </w:pBdr>
+        <w:shd w:fill="FAFAF5" w:val="clear"/>
+        <w:spacing w:after="0"/>
+        <w:ind w:left="200" w:right="200"/>
+      </w:pPr>
+      <w:r>
+        <w:rPr>
+          <w:rFonts w:ascii="Consolas" w:cs="Consolas" w:eastAsia="Consolas" w:hAnsi="Consolas"/>
+          <w:sz w:val="20"/>
+          <w:szCs w:val="20"/>
+        </w:rPr>
+        <w:t xml:space="preserve">IF WE MISS 5% — the fallback, exactly as published before a single ballot:</w:t>
+      </w:r>
+    </w:p>
+    <w:p>
+      <w:pPr>
+        <w:pBdr>
+          <w:top w:val="single" w:color="262626" w:sz="12"/>
+          <w:left w:val="single" w:color="262626" w:sz="12"/>
+          <w:bottom w:val="single" w:color="262626" w:sz="12"/>
+          <w:right w:val="single" w:color="262626" w:sz="12"/>
+        </w:pBdr>
+        <w:shd w:fill="FAFAF5" w:val="clear"/>
+        <w:spacing w:after="0"/>
+        <w:ind w:left="200" w:right="200"/>
+      </w:pPr>
+      <w:r>
+        <w:rPr>
+          <w:rFonts w:ascii="Consolas" w:cs="Consolas" w:eastAsia="Consolas" w:hAnsi="Consolas"/>
+          <w:sz w:val="20"/>
+          <w:szCs w:val="20"/>
+        </w:rPr>
+        <w:t xml:space="preserve">The most-voted outcome per question is adopted as our working consensus. Recorded openly as quorum-missed (final turnout attached), re-confirmed in a later ratification vote as turnout grows. And the adoption happens in public: intent announced, 24 hours of cooling-off, then recorded — every step in the audit log anyone can read.</w:t>
+      </w:r>
+    </w:p>
+    <w:p>
+      <w:pPr>
+        <w:pBdr>
+          <w:top w:val="single" w:color="262626" w:sz="12"/>
+          <w:left w:val="single" w:color="262626" w:sz="12"/>
+          <w:bottom w:val="single" w:color="262626" w:sz="12"/>
+          <w:right w:val="single" w:color="262626" w:sz="12"/>
+        </w:pBdr>
+        <w:shd w:fill="FAFAF5" w:val="clear"/>
+        <w:spacing w:after="100"/>
+      </w:pPr>
+    </w:p>
+    <w:p>
+      <w:pPr>
+        <w:pBdr>
+          <w:top w:val="single" w:color="262626" w:sz="12"/>
+          <w:left w:val="single" w:color="262626" w:sz="12"/>
+          <w:bottom w:val="single" w:color="262626" w:sz="12"/>
+          <w:right w:val="single" w:color="262626" w:sz="12"/>
+        </w:pBdr>
+        <w:shd w:fill="FAFAF5" w:val="clear"/>
+        <w:spacing w:after="0"/>
+        <w:ind w:left="200" w:right="200"/>
+      </w:pPr>
+      <w:r>
+        <w:rPr>
+          <w:rFonts w:ascii="Consolas" w:cs="Consolas" w:eastAsia="Consolas" w:hAnsi="Consolas"/>
+          <w:sz w:val="20"/>
+          <w:szCs w:val="20"/>
+        </w:rPr>
+        <w:t xml:space="preserve">IF WE HIT 5% — binding, quorum-backed, no asterisk. The first fully ratified rulebook in this DAO's history.</w:t>
+      </w:r>
+    </w:p>
+    <w:p>
+      <w:pPr>
+        <w:pBdr>
+          <w:top w:val="single" w:color="262626" w:sz="12"/>
+          <w:left w:val="single" w:color="262626" w:sz="12"/>
+          <w:bottom w:val="single" w:color="262626" w:sz="12"/>
+          <w:right w:val="single" w:color="262626" w:sz="12"/>
+        </w:pBdr>
+        <w:shd w:fill="FAFAF5" w:val="clear"/>
+        <w:spacing w:after="100"/>
+      </w:pPr>
+    </w:p>
+    <w:p>
+      <w:pPr>
+        <w:pBdr>
+          <w:top w:val="single" w:color="262626" w:sz="12"/>
+          <w:left w:val="single" w:color="262626" w:sz="12"/>
+          <w:bottom w:val="single" w:color="262626" w:sz="12"/>
+          <w:right w:val="single" w:color="262626" w:sz="12"/>
+        </w:pBdr>
+        <w:shd w:fill="FAFAF5" w:val="clear"/>
+        <w:spacing w:after="0"/>
+        <w:ind w:left="200" w:right="200"/>
+      </w:pPr>
+      <w:r>
+        <w:rPr>
+          <w:rFonts w:ascii="Consolas" w:cs="Consolas" w:eastAsia="Consolas" w:hAnsi="Consolas"/>
+          <w:sz w:val="20"/>
+          <w:szCs w:val="20"/>
+        </w:rPr>
+        <w:t xml:space="preserve">WHO THIS IS FOR: every wallet that ever held ≥1 $OMNOM — 25,686 of you. Gasless. One signature. Changeable any time until Nov 1, 00:00 UTC.</w:t>
+      </w:r>
+    </w:p>
+    <w:p>
+      <w:pPr>
+        <w:pBdr>
+          <w:top w:val="single" w:color="262626" w:sz="12"/>
+          <w:left w:val="single" w:color="262626" w:sz="12"/>
+          <w:bottom w:val="single" w:color="262626" w:sz="12"/>
+          <w:right w:val="single" w:color="262626" w:sz="12"/>
+        </w:pBdr>
+        <w:shd w:fill="FAFAF5" w:val="clear"/>
+        <w:spacing w:after="100"/>
+      </w:pPr>
     </w:p>
     <w:p>
       <w:pPr>
@@ -896,6 +870,18 @@
           <w:right w:val="single" w:color="262626" w:sz="12"/>
         </w:pBdr>
         <w:shd w:fill="FAFAF5" w:val="clear"/>
+        <w:spacing w:after="100"/>
+      </w:pPr>
+    </w:p>
+    <w:p>
+      <w:pPr>
+        <w:pBdr>
+          <w:top w:val="single" w:color="262626" w:sz="12"/>
+          <w:left w:val="single" w:color="262626" w:sz="12"/>
+          <w:bottom w:val="single" w:color="262626" w:sz="12"/>
+          <w:right w:val="single" w:color="262626" w:sz="12"/>
+        </w:pBdr>
+        <w:shd w:fill="FAFAF5" w:val="clear"/>
         <w:spacing w:after="0"/>
         <w:ind w:left="200" w:right="200"/>
       </w:pPr>
@@ -907,6 +893,18 @@
         </w:rPr>
         <w:t xml:space="preserve">👉 Read &amp; vote: https://dao.omnom.dog/vote?utm_campaign=wave1-referendum&amp;utm_source=x</w:t>
       </w:r>
+    </w:p>
+    <w:p>
+      <w:pPr>
+        <w:pBdr>
+          <w:top w:val="single" w:color="262626" w:sz="12"/>
+          <w:left w:val="single" w:color="262626" w:sz="12"/>
+          <w:bottom w:val="single" w:color="262626" w:sz="12"/>
+          <w:right w:val="single" w:color="262626" w:sz="12"/>
+        </w:pBdr>
+        <w:shd w:fill="FAFAF5" w:val="clear"/>
+        <w:spacing w:after="100"/>
+      </w:pPr>
     </w:p>
     <w:p>
       <w:pPr>
@@ -977,6 +975,18 @@
           <w:right w:val="single" w:color="262626" w:sz="12"/>
         </w:pBdr>
         <w:shd w:fill="FAFAF5" w:val="clear"/>
+        <w:spacing w:after="100"/>
+      </w:pPr>
+    </w:p>
+    <w:p>
+      <w:pPr>
+        <w:pBdr>
+          <w:top w:val="single" w:color="262626" w:sz="12"/>
+          <w:left w:val="single" w:color="262626" w:sz="12"/>
+          <w:bottom w:val="single" w:color="262626" w:sz="12"/>
+          <w:right w:val="single" w:color="262626" w:sz="12"/>
+        </w:pBdr>
+        <w:shd w:fill="FAFAF5" w:val="clear"/>
         <w:spacing w:after="0"/>
         <w:ind w:left="200" w:right="200"/>
       </w:pPr>
@@ -1006,6 +1016,18 @@
         </w:rPr>
         <w:t xml:space="preserve"> → expired. Record: 35 = 2.73%. This time all 3 rulebook questions vote at once, and the fallback is disclosed up front.</w:t>
       </w:r>
+    </w:p>
+    <w:p>
+      <w:pPr>
+        <w:pBdr>
+          <w:top w:val="single" w:color="262626" w:sz="12"/>
+          <w:left w:val="single" w:color="262626" w:sz="12"/>
+          <w:bottom w:val="single" w:color="262626" w:sz="12"/>
+          <w:right w:val="single" w:color="262626" w:sz="12"/>
+        </w:pBdr>
+        <w:shd w:fill="FAFAF5" w:val="clear"/>
+        <w:spacing w:after="100"/>
+      </w:pPr>
     </w:p>
     <w:p>
       <w:pPr>
@@ -1076,6 +1098,18 @@
           <w:right w:val="single" w:color="262626" w:sz="12"/>
         </w:pBdr>
         <w:shd w:fill="FAFAF5" w:val="clear"/>
+        <w:spacing w:after="100"/>
+      </w:pPr>
+    </w:p>
+    <w:p>
+      <w:pPr>
+        <w:pBdr>
+          <w:top w:val="single" w:color="262626" w:sz="12"/>
+          <w:left w:val="single" w:color="262626" w:sz="12"/>
+          <w:bottom w:val="single" w:color="262626" w:sz="12"/>
+          <w:right w:val="single" w:color="262626" w:sz="12"/>
+        </w:pBdr>
+        <w:shd w:fill="FAFAF5" w:val="clear"/>
         <w:spacing w:after="0"/>
         <w:ind w:left="200" w:right="200"/>
       </w:pPr>
@@ -1115,6 +1149,18 @@
           <w:right w:val="single" w:color="262626" w:sz="12"/>
         </w:pBdr>
         <w:shd w:fill="FAFAF5" w:val="clear"/>
+        <w:spacing w:after="100"/>
+      </w:pPr>
+    </w:p>
+    <w:p>
+      <w:pPr>
+        <w:pBdr>
+          <w:top w:val="single" w:color="262626" w:sz="12"/>
+          <w:left w:val="single" w:color="262626" w:sz="12"/>
+          <w:bottom w:val="single" w:color="262626" w:sz="12"/>
+          <w:right w:val="single" w:color="262626" w:sz="12"/>
+        </w:pBdr>
+        <w:shd w:fill="FAFAF5" w:val="clear"/>
         <w:spacing w:after="0"/>
         <w:ind w:left="200" w:right="200"/>
       </w:pPr>
@@ -1126,6 +1172,18 @@
         </w:rPr>
         <w:t xml:space="preserve">Ever held $OMNOM? You're eligible.</w:t>
       </w:r>
+    </w:p>
+    <w:p>
+      <w:pPr>
+        <w:pBdr>
+          <w:top w:val="single" w:color="262626" w:sz="12"/>
+          <w:left w:val="single" w:color="262626" w:sz="12"/>
+          <w:bottom w:val="single" w:color="262626" w:sz="12"/>
+          <w:right w:val="single" w:color="262626" w:sz="12"/>
+        </w:pBdr>
+        <w:shd w:fill="FAFAF5" w:val="clear"/>
+        <w:spacing w:after="100"/>
+      </w:pPr>
     </w:p>
     <w:p>
       <w:pPr>

</xml_diff>

<commit_message>
fix(announcements): repair nested bold + harden copy-pack generation
- Repair the last-48h line the emphasis pass had mangled into quadruple
  asterisks (nested bold inside an existing span).
- Word generator: replace prefix-dependent extraction with a robust
  extractor that handles blockquoted AND plain sections, drops instruction
  lines, and hard-refuses to write if any of the 12 boxes is empty or thin
  (sections 6-11 were silently empty in earlier builds).
- Verified end-to-end: all 12 box anchors present in the OOXML, 94 bold
  runs, 20 highlighted placeholders, no literal ** leakage, counts within
  channel limits (X long 3,253 · TG long 2,770/4,096 · caption 456/1,024 ·
  X short 275).

Co-Authored-By: Claude Code <noreply@anthropic.com>
</commit_message>
<xml_diff>
--- a/DOCS/announcements/Wave1-Referendum-Copy.docx
+++ b/DOCS/announcements/Wave1-Referendum-Copy.docx
@@ -27,7 +27,7 @@
           <w:sz w:val="18"/>
           <w:szCs w:val="18"/>
         </w:rPr>
-        <w:t xml:space="preserve">v5 — X long post now has real paragraph spacing (in the doc AND on the post itself) · includes the Week 1 story · real bold throughout · opened Oct 1, closes Nov 1, 00:00 UTC · verify gate GREEN.</w:t>
+        <w:t xml:space="preserve">v6 — Week 1 story included · real bold throughout · paragraph spacing fixed in every box · opened Oct 1, closes Nov 1, 00:00 UTC · verify gate GREEN.</w:t>
       </w:r>
     </w:p>
     <w:p>
@@ -99,6 +99,39 @@
           <w:sz w:val="20"/>
           <w:szCs w:val="20"/>
         </w:rPr>
+        <w:t xml:space="preserve">Premium post (Premium allows ~25,000 chars; this draft ≈ 3,300)</w:t>
+      </w:r>
+    </w:p>
+    <w:p>
+      <w:pPr>
+        <w:pBdr>
+          <w:top w:val="single" w:color="262626" w:sz="12"/>
+          <w:left w:val="single" w:color="262626" w:sz="12"/>
+          <w:bottom w:val="single" w:color="262626" w:sz="12"/>
+          <w:right w:val="single" w:color="262626" w:sz="12"/>
+        </w:pBdr>
+        <w:shd w:fill="FAFAF5" w:val="clear"/>
+        <w:spacing w:after="100"/>
+      </w:pPr>
+    </w:p>
+    <w:p>
+      <w:pPr>
+        <w:pBdr>
+          <w:top w:val="single" w:color="262626" w:sz="12"/>
+          <w:left w:val="single" w:color="262626" w:sz="12"/>
+          <w:bottom w:val="single" w:color="262626" w:sz="12"/>
+          <w:right w:val="single" w:color="262626" w:sz="12"/>
+        </w:pBdr>
+        <w:shd w:fill="FAFAF5" w:val="clear"/>
+        <w:spacing w:after="0"/>
+        <w:ind w:left="200" w:right="200"/>
+      </w:pPr>
+      <w:r>
+        <w:rPr>
+          <w:rFonts w:ascii="Consolas" w:cs="Consolas" w:eastAsia="Consolas" w:hAnsi="Consolas"/>
+          <w:sz w:val="20"/>
+          <w:szCs w:val="20"/>
+        </w:rPr>
         <w:t xml:space="preserve">🗳️ THE $OMNOM RULEBOOK VOTE IS LIVE — and this time, the full story.</w:t>
       </w:r>
     </w:p>
@@ -963,6 +996,39 @@
           <w:sz w:val="20"/>
           <w:szCs w:val="20"/>
         </w:rPr>
+        <w:t xml:space="preserve">(274 raw chars — you're Premium, so these are just quick hits)</w:t>
+      </w:r>
+    </w:p>
+    <w:p>
+      <w:pPr>
+        <w:pBdr>
+          <w:top w:val="single" w:color="262626" w:sz="12"/>
+          <w:left w:val="single" w:color="262626" w:sz="12"/>
+          <w:bottom w:val="single" w:color="262626" w:sz="12"/>
+          <w:right w:val="single" w:color="262626" w:sz="12"/>
+        </w:pBdr>
+        <w:shd w:fill="FAFAF5" w:val="clear"/>
+        <w:spacing w:after="100"/>
+      </w:pPr>
+    </w:p>
+    <w:p>
+      <w:pPr>
+        <w:pBdr>
+          <w:top w:val="single" w:color="262626" w:sz="12"/>
+          <w:left w:val="single" w:color="262626" w:sz="12"/>
+          <w:bottom w:val="single" w:color="262626" w:sz="12"/>
+          <w:right w:val="single" w:color="262626" w:sz="12"/>
+        </w:pBdr>
+        <w:shd w:fill="FAFAF5" w:val="clear"/>
+        <w:spacing w:after="0"/>
+        <w:ind w:left="200" w:right="200"/>
+      </w:pPr>
+      <w:r>
+        <w:rPr>
+          <w:rFonts w:ascii="Consolas" w:cs="Consolas" w:eastAsia="Consolas" w:hAnsi="Consolas"/>
+          <w:sz w:val="20"/>
+          <w:szCs w:val="20"/>
+        </w:rPr>
         <w:t xml:space="preserve">🗳️ $OMNOM rulebook vote LIVE — 3 questions, 30 days.</w:t>
       </w:r>
     </w:p>
@@ -1086,6 +1152,39 @@
           <w:sz w:val="20"/>
           <w:szCs w:val="20"/>
         </w:rPr>
+        <w:t xml:space="preserve">with the eligibility line:</w:t>
+      </w:r>
+    </w:p>
+    <w:p>
+      <w:pPr>
+        <w:pBdr>
+          <w:top w:val="single" w:color="262626" w:sz="12"/>
+          <w:left w:val="single" w:color="262626" w:sz="12"/>
+          <w:bottom w:val="single" w:color="262626" w:sz="12"/>
+          <w:right w:val="single" w:color="262626" w:sz="12"/>
+        </w:pBdr>
+        <w:shd w:fill="FAFAF5" w:val="clear"/>
+        <w:spacing w:after="100"/>
+      </w:pPr>
+    </w:p>
+    <w:p>
+      <w:pPr>
+        <w:pBdr>
+          <w:top w:val="single" w:color="262626" w:sz="12"/>
+          <w:left w:val="single" w:color="262626" w:sz="12"/>
+          <w:bottom w:val="single" w:color="262626" w:sz="12"/>
+          <w:right w:val="single" w:color="262626" w:sz="12"/>
+        </w:pBdr>
+        <w:shd w:fill="FAFAF5" w:val="clear"/>
+        <w:spacing w:after="0"/>
+        <w:ind w:left="200" w:right="200"/>
+      </w:pPr>
+      <w:r>
+        <w:rPr>
+          <w:rFonts w:ascii="Consolas" w:cs="Consolas" w:eastAsia="Consolas" w:hAnsi="Consolas"/>
+          <w:sz w:val="20"/>
+          <w:szCs w:val="20"/>
+        </w:rPr>
         <w:t xml:space="preserve">🗳️ $OMNOM rulebook vote LIVE — 3 questions, 30 days.</w:t>
       </w:r>
     </w:p>
@@ -1242,6 +1341,39 @@
           <w:sz w:val="20"/>
           <w:szCs w:val="20"/>
         </w:rPr>
+        <w:t xml:space="preserve">(TEXT post, ≤ 4,096 chars; this draft ≈ 3,150 — paste as a normal message, no image)</w:t>
+      </w:r>
+    </w:p>
+    <w:p>
+      <w:pPr>
+        <w:pBdr>
+          <w:top w:val="single" w:color="262626" w:sz="12"/>
+          <w:left w:val="single" w:color="262626" w:sz="12"/>
+          <w:bottom w:val="single" w:color="262626" w:sz="12"/>
+          <w:right w:val="single" w:color="262626" w:sz="12"/>
+        </w:pBdr>
+        <w:shd w:fill="FAFAF5" w:val="clear"/>
+        <w:spacing w:after="100"/>
+      </w:pPr>
+    </w:p>
+    <w:p>
+      <w:pPr>
+        <w:pBdr>
+          <w:top w:val="single" w:color="262626" w:sz="12"/>
+          <w:left w:val="single" w:color="262626" w:sz="12"/>
+          <w:bottom w:val="single" w:color="262626" w:sz="12"/>
+          <w:right w:val="single" w:color="262626" w:sz="12"/>
+        </w:pBdr>
+        <w:shd w:fill="FAFAF5" w:val="clear"/>
+        <w:spacing w:after="0"/>
+        <w:ind w:left="200" w:right="200"/>
+      </w:pPr>
+      <w:r>
+        <w:rPr>
+          <w:rFonts w:ascii="Consolas" w:cs="Consolas" w:eastAsia="Consolas" w:hAnsi="Consolas"/>
+          <w:sz w:val="20"/>
+          <w:szCs w:val="20"/>
+        </w:rPr>
         <w:t xml:space="preserve">🐕 $OMNOM DAO — THE RULEBOOK VOTE IS LIVE. First, the honest backstory.</w:t>
       </w:r>
     </w:p>
@@ -2139,6 +2271,39 @@
           <w:sz w:val="20"/>
           <w:szCs w:val="20"/>
         </w:rPr>
+        <w:t xml:space="preserve">(for image posts; ≤ 1,024 chars — this draft ≈ 700)</w:t>
+      </w:r>
+    </w:p>
+    <w:p>
+      <w:pPr>
+        <w:pBdr>
+          <w:top w:val="single" w:color="262626" w:sz="12"/>
+          <w:left w:val="single" w:color="262626" w:sz="12"/>
+          <w:bottom w:val="single" w:color="262626" w:sz="12"/>
+          <w:right w:val="single" w:color="262626" w:sz="12"/>
+        </w:pBdr>
+        <w:shd w:fill="FAFAF5" w:val="clear"/>
+        <w:spacing w:after="100"/>
+      </w:pPr>
+    </w:p>
+    <w:p>
+      <w:pPr>
+        <w:pBdr>
+          <w:top w:val="single" w:color="262626" w:sz="12"/>
+          <w:left w:val="single" w:color="262626" w:sz="12"/>
+          <w:bottom w:val="single" w:color="262626" w:sz="12"/>
+          <w:right w:val="single" w:color="262626" w:sz="12"/>
+        </w:pBdr>
+        <w:shd w:fill="FAFAF5" w:val="clear"/>
+        <w:spacing w:after="0"/>
+        <w:ind w:left="200" w:right="200"/>
+      </w:pPr>
+      <w:r>
+        <w:rPr>
+          <w:rFonts w:ascii="Consolas" w:cs="Consolas" w:eastAsia="Consolas" w:hAnsi="Consolas"/>
+          <w:sz w:val="20"/>
+          <w:szCs w:val="20"/>
+        </w:rPr>
         <w:t xml:space="preserve">🐕 $OMNOM rulebook vote is LIVE — 3 questions, 30 days, one window.</w:t>
       </w:r>
     </w:p>
@@ -2310,6 +2475,39 @@
           <w:sz w:val="20"/>
           <w:szCs w:val="20"/>
         </w:rPr>
+        <w:t xml:space="preserve">(owner's call — use sparingly)</w:t>
+      </w:r>
+    </w:p>
+    <w:p>
+      <w:pPr>
+        <w:pBdr>
+          <w:top w:val="single" w:color="262626" w:sz="12"/>
+          <w:left w:val="single" w:color="262626" w:sz="12"/>
+          <w:bottom w:val="single" w:color="262626" w:sz="12"/>
+          <w:right w:val="single" w:color="262626" w:sz="12"/>
+        </w:pBdr>
+        <w:shd w:fill="FAFAF5" w:val="clear"/>
+        <w:spacing w:after="100"/>
+      </w:pPr>
+    </w:p>
+    <w:p>
+      <w:pPr>
+        <w:pBdr>
+          <w:top w:val="single" w:color="262626" w:sz="12"/>
+          <w:left w:val="single" w:color="262626" w:sz="12"/>
+          <w:bottom w:val="single" w:color="262626" w:sz="12"/>
+          <w:right w:val="single" w:color="262626" w:sz="12"/>
+        </w:pBdr>
+        <w:shd w:fill="FAFAF5" w:val="clear"/>
+        <w:spacing w:after="0"/>
+        <w:ind w:left="200" w:right="200"/>
+      </w:pPr>
+      <w:r>
+        <w:rPr>
+          <w:rFonts w:ascii="Consolas" w:cs="Consolas" w:eastAsia="Consolas" w:hAnsi="Consolas"/>
+          <w:sz w:val="20"/>
+          <w:szCs w:val="20"/>
+        </w:rPr>
         <w:t xml:space="preserve">If you want to seed what comes after the rulebook, append ONE line to the Telegram long post or an X reply (never the main post — don't dilute the CTA):</w:t>
       </w:r>
     </w:p>
@@ -2343,7 +2541,7 @@
           <w:sz w:val="20"/>
           <w:szCs w:val="20"/>
         </w:rPr>
-        <w:t xml:space="preserve">&gt; 👀 And after the rulebook: the community decides where $OMNOM lives next. DogeOS just opened its public testnet — a Dogecoin L2 with DOGE gas. Early eyes are watching.</w:t>
+        <w:t xml:space="preserve">👀 And after the rulebook: the community decides where $OMNOM lives next. DogeOS just opened its public testnet — a Dogecoin L2 with DOGE gas. Early eyes are watching.</w:t>
       </w:r>
     </w:p>
     <w:p>
@@ -2373,8 +2571,504 @@
           <w:right w:val="single" w:color="262626" w:sz="12"/>
         </w:pBdr>
         <w:shd w:fill="FAFAF5" w:val="clear"/>
-        <w:spacing w:after="100"/>
-      </w:pPr>
+        <w:spacing w:after="0"/>
+        <w:ind w:left="200" w:right="200"/>
+      </w:pPr>
+      <w:r>
+        <w:rPr>
+          <w:rFonts w:ascii="Consolas" w:cs="Consolas" w:eastAsia="Consolas" w:hAnsi="Consolas"/>
+          <w:sz w:val="20"/>
+          <w:szCs w:val="20"/>
+        </w:rPr>
+        <w:t xml:space="preserve">(Oct 9)</w:t>
+      </w:r>
+    </w:p>
+    <w:p>
+      <w:pPr>
+        <w:pBdr>
+          <w:top w:val="single" w:color="262626" w:sz="12"/>
+          <w:left w:val="single" w:color="262626" w:sz="12"/>
+          <w:bottom w:val="single" w:color="262626" w:sz="12"/>
+          <w:right w:val="single" w:color="262626" w:sz="12"/>
+        </w:pBdr>
+        <w:shd w:fill="FAFAF5" w:val="clear"/>
+        <w:spacing w:after="100"/>
+      </w:pPr>
+    </w:p>
+    <w:p>
+      <w:pPr>
+        <w:pBdr>
+          <w:top w:val="single" w:color="262626" w:sz="12"/>
+          <w:left w:val="single" w:color="262626" w:sz="12"/>
+          <w:bottom w:val="single" w:color="262626" w:sz="12"/>
+          <w:right w:val="single" w:color="262626" w:sz="12"/>
+        </w:pBdr>
+        <w:shd w:fill="FAFAF5" w:val="clear"/>
+        <w:spacing w:after="0"/>
+        <w:ind w:left="200" w:right="200"/>
+      </w:pPr>
+      <w:r>
+        <w:rPr>
+          <w:rFonts w:ascii="Consolas" w:cs="Consolas" w:eastAsia="Consolas" w:hAnsi="Consolas"/>
+          <w:sz w:val="20"/>
+          <w:szCs w:val="20"/>
+        </w:rPr>
+        <w:t xml:space="preserve">🗳️ </w:t>
+      </w:r>
+      <w:r>
+        <w:rPr>
+          <w:rFonts w:ascii="Consolas" w:cs="Consolas" w:eastAsia="Consolas" w:hAnsi="Consolas"/>
+          <w:b/>
+          <w:bCs/>
+          <w:sz w:val="20"/>
+          <w:szCs w:val="20"/>
+        </w:rPr>
+        <w:t xml:space="preserve">$OMNOM rulebook vote — 7 days in, 23 to go.</w:t>
+      </w:r>
+    </w:p>
+    <w:p>
+      <w:pPr>
+        <w:pBdr>
+          <w:top w:val="single" w:color="262626" w:sz="12"/>
+          <w:left w:val="single" w:color="262626" w:sz="12"/>
+          <w:bottom w:val="single" w:color="262626" w:sz="12"/>
+          <w:right w:val="single" w:color="262626" w:sz="12"/>
+        </w:pBdr>
+        <w:shd w:fill="FAFAF5" w:val="clear"/>
+        <w:spacing w:after="100"/>
+      </w:pPr>
+    </w:p>
+    <w:p>
+      <w:pPr>
+        <w:pBdr>
+          <w:top w:val="single" w:color="262626" w:sz="12"/>
+          <w:left w:val="single" w:color="262626" w:sz="12"/>
+          <w:bottom w:val="single" w:color="262626" w:sz="12"/>
+          <w:right w:val="single" w:color="262626" w:sz="12"/>
+        </w:pBdr>
+        <w:shd w:fill="FAFAF5" w:val="clear"/>
+        <w:spacing w:after="0"/>
+        <w:ind w:left="200" w:right="200"/>
+      </w:pPr>
+      <w:r>
+        <w:rPr>
+          <w:rFonts w:ascii="Consolas" w:cs="Consolas" w:eastAsia="Consolas" w:hAnsi="Consolas"/>
+          <w:sz w:val="20"/>
+          <w:szCs w:val="20"/>
+        </w:rPr>
+        <w:t xml:space="preserve">Turnout so far: </w:t>
+      </w:r>
+      <w:r>
+        <w:rPr>
+          <w:rFonts w:ascii="Consolas" w:cs="Consolas" w:eastAsia="Consolas" w:hAnsi="Consolas"/>
+          <w:b/>
+          <w:bCs/>
+          <w:sz w:val="20"/>
+          <w:szCs w:val="20"/>
+        </w:rPr>
+        <w:t xml:space="preserve">[N] ballots = [X]% of the 5% bar</w:t>
+      </w:r>
+      <w:r>
+        <w:rPr>
+          <w:rFonts w:ascii="Consolas" w:cs="Consolas" w:eastAsia="Consolas" w:hAnsi="Consolas"/>
+          <w:sz w:val="20"/>
+          <w:szCs w:val="20"/>
+        </w:rPr>
+        <w:t xml:space="preserve"> (bar = 29,098,690 power).</w:t>
+      </w:r>
+    </w:p>
+    <w:p>
+      <w:pPr>
+        <w:pBdr>
+          <w:top w:val="single" w:color="262626" w:sz="12"/>
+          <w:left w:val="single" w:color="262626" w:sz="12"/>
+          <w:bottom w:val="single" w:color="262626" w:sz="12"/>
+          <w:right w:val="single" w:color="262626" w:sz="12"/>
+        </w:pBdr>
+        <w:shd w:fill="FAFAF5" w:val="clear"/>
+        <w:spacing w:after="100"/>
+      </w:pPr>
+    </w:p>
+    <w:p>
+      <w:pPr>
+        <w:pBdr>
+          <w:top w:val="single" w:color="262626" w:sz="12"/>
+          <w:left w:val="single" w:color="262626" w:sz="12"/>
+          <w:bottom w:val="single" w:color="262626" w:sz="12"/>
+          <w:right w:val="single" w:color="262626" w:sz="12"/>
+        </w:pBdr>
+        <w:shd w:fill="FAFAF5" w:val="clear"/>
+        <w:spacing w:after="0"/>
+        <w:ind w:left="200" w:right="200"/>
+      </w:pPr>
+      <w:r>
+        <w:rPr>
+          <w:rFonts w:ascii="Consolas" w:cs="Consolas" w:eastAsia="Consolas" w:hAnsi="Consolas"/>
+          <w:sz w:val="20"/>
+          <w:szCs w:val="20"/>
+        </w:rPr>
+        <w:t xml:space="preserve">Leading positions right now:</w:t>
+      </w:r>
+    </w:p>
+    <w:p>
+      <w:pPr>
+        <w:pBdr>
+          <w:top w:val="single" w:color="262626" w:sz="12"/>
+          <w:left w:val="single" w:color="262626" w:sz="12"/>
+          <w:bottom w:val="single" w:color="262626" w:sz="12"/>
+          <w:right w:val="single" w:color="262626" w:sz="12"/>
+        </w:pBdr>
+        <w:shd w:fill="FAFAF5" w:val="clear"/>
+        <w:spacing w:after="0"/>
+        <w:ind w:left="200" w:right="200"/>
+      </w:pPr>
+      <w:r>
+        <w:rPr>
+          <w:rFonts w:ascii="Consolas" w:cs="Consolas" w:eastAsia="Consolas" w:hAnsi="Consolas"/>
+          <w:sz w:val="20"/>
+          <w:szCs w:val="20"/>
+        </w:rPr>
+        <w:t xml:space="preserve">1️⃣ </w:t>
+      </w:r>
+      <w:r>
+        <w:rPr>
+          <w:rFonts w:ascii="Consolas" w:cs="Consolas" w:eastAsia="Consolas" w:hAnsi="Consolas"/>
+          <w:b/>
+          <w:bCs/>
+          <w:sz w:val="20"/>
+          <w:szCs w:val="20"/>
+        </w:rPr>
+        <w:t xml:space="preserve">Global default quorum</w:t>
+      </w:r>
+      <w:r>
+        <w:rPr>
+          <w:rFonts w:ascii="Consolas" w:cs="Consolas" w:eastAsia="Consolas" w:hAnsi="Consolas"/>
+          <w:sz w:val="20"/>
+          <w:szCs w:val="20"/>
+        </w:rPr>
+        <w:t xml:space="preserve">: </w:t>
+      </w:r>
+      <w:r>
+        <w:rPr>
+          <w:rFonts w:ascii="Consolas" w:cs="Consolas" w:eastAsia="Consolas" w:hAnsi="Consolas"/>
+          <w:b/>
+          <w:bCs/>
+          <w:sz w:val="20"/>
+          <w:szCs w:val="20"/>
+        </w:rPr>
+        <w:t xml:space="preserve">[FOR/AGAINST]</w:t>
+      </w:r>
+      <w:r>
+        <w:rPr>
+          <w:rFonts w:ascii="Consolas" w:cs="Consolas" w:eastAsia="Consolas" w:hAnsi="Consolas"/>
+          <w:sz w:val="20"/>
+          <w:szCs w:val="20"/>
+        </w:rPr>
+        <w:t xml:space="preserve"> at </w:t>
+      </w:r>
+      <w:r>
+        <w:rPr>
+          <w:rFonts w:ascii="Consolas" w:cs="Consolas" w:eastAsia="Consolas" w:hAnsi="Consolas"/>
+          <w:b/>
+          <w:bCs/>
+          <w:sz w:val="20"/>
+          <w:szCs w:val="20"/>
+          <w:highlight w:val="yellow"/>
+        </w:rPr>
+        <w:t xml:space="preserve">[X]</w:t>
+      </w:r>
+      <w:r>
+        <w:rPr>
+          <w:rFonts w:ascii="Consolas" w:cs="Consolas" w:eastAsia="Consolas" w:hAnsi="Consolas"/>
+          <w:sz w:val="20"/>
+          <w:szCs w:val="20"/>
+        </w:rPr>
+        <w:t xml:space="preserve">%</w:t>
+      </w:r>
+    </w:p>
+    <w:p>
+      <w:pPr>
+        <w:pBdr>
+          <w:top w:val="single" w:color="262626" w:sz="12"/>
+          <w:left w:val="single" w:color="262626" w:sz="12"/>
+          <w:bottom w:val="single" w:color="262626" w:sz="12"/>
+          <w:right w:val="single" w:color="262626" w:sz="12"/>
+        </w:pBdr>
+        <w:shd w:fill="FAFAF5" w:val="clear"/>
+        <w:spacing w:after="0"/>
+        <w:ind w:left="200" w:right="200"/>
+      </w:pPr>
+      <w:r>
+        <w:rPr>
+          <w:rFonts w:ascii="Consolas" w:cs="Consolas" w:eastAsia="Consolas" w:hAnsi="Consolas"/>
+          <w:sz w:val="20"/>
+          <w:szCs w:val="20"/>
+        </w:rPr>
+        <w:t xml:space="preserve">2️⃣ </w:t>
+      </w:r>
+      <w:r>
+        <w:rPr>
+          <w:rFonts w:ascii="Consolas" w:cs="Consolas" w:eastAsia="Consolas" w:hAnsi="Consolas"/>
+          <w:b/>
+          <w:bCs/>
+          <w:sz w:val="20"/>
+          <w:szCs w:val="20"/>
+        </w:rPr>
+        <w:t xml:space="preserve">Pass threshold</w:t>
+      </w:r>
+      <w:r>
+        <w:rPr>
+          <w:rFonts w:ascii="Consolas" w:cs="Consolas" w:eastAsia="Consolas" w:hAnsi="Consolas"/>
+          <w:sz w:val="20"/>
+          <w:szCs w:val="20"/>
+        </w:rPr>
+        <w:t xml:space="preserve">: </w:t>
+      </w:r>
+      <w:r>
+        <w:rPr>
+          <w:rFonts w:ascii="Consolas" w:cs="Consolas" w:eastAsia="Consolas" w:hAnsi="Consolas"/>
+          <w:b/>
+          <w:bCs/>
+          <w:sz w:val="20"/>
+          <w:szCs w:val="20"/>
+        </w:rPr>
+        <w:t xml:space="preserve">[FOR/AGAINST]</w:t>
+      </w:r>
+      <w:r>
+        <w:rPr>
+          <w:rFonts w:ascii="Consolas" w:cs="Consolas" w:eastAsia="Consolas" w:hAnsi="Consolas"/>
+          <w:sz w:val="20"/>
+          <w:szCs w:val="20"/>
+        </w:rPr>
+        <w:t xml:space="preserve"> at </w:t>
+      </w:r>
+      <w:r>
+        <w:rPr>
+          <w:rFonts w:ascii="Consolas" w:cs="Consolas" w:eastAsia="Consolas" w:hAnsi="Consolas"/>
+          <w:b/>
+          <w:bCs/>
+          <w:sz w:val="20"/>
+          <w:szCs w:val="20"/>
+          <w:highlight w:val="yellow"/>
+        </w:rPr>
+        <w:t xml:space="preserve">[X]</w:t>
+      </w:r>
+      <w:r>
+        <w:rPr>
+          <w:rFonts w:ascii="Consolas" w:cs="Consolas" w:eastAsia="Consolas" w:hAnsi="Consolas"/>
+          <w:sz w:val="20"/>
+          <w:szCs w:val="20"/>
+        </w:rPr>
+        <w:t xml:space="preserve">%</w:t>
+      </w:r>
+    </w:p>
+    <w:p>
+      <w:pPr>
+        <w:pBdr>
+          <w:top w:val="single" w:color="262626" w:sz="12"/>
+          <w:left w:val="single" w:color="262626" w:sz="12"/>
+          <w:bottom w:val="single" w:color="262626" w:sz="12"/>
+          <w:right w:val="single" w:color="262626" w:sz="12"/>
+        </w:pBdr>
+        <w:shd w:fill="FAFAF5" w:val="clear"/>
+        <w:spacing w:after="0"/>
+        <w:ind w:left="200" w:right="200"/>
+      </w:pPr>
+      <w:r>
+        <w:rPr>
+          <w:rFonts w:ascii="Consolas" w:cs="Consolas" w:eastAsia="Consolas" w:hAnsi="Consolas"/>
+          <w:sz w:val="20"/>
+          <w:szCs w:val="20"/>
+        </w:rPr>
+        <w:t xml:space="preserve">3️⃣ Per-type schedule: </w:t>
+      </w:r>
+      <w:r>
+        <w:rPr>
+          <w:rFonts w:ascii="Consolas" w:cs="Consolas" w:eastAsia="Consolas" w:hAnsi="Consolas"/>
+          <w:b/>
+          <w:bCs/>
+          <w:sz w:val="20"/>
+          <w:szCs w:val="20"/>
+        </w:rPr>
+        <w:t xml:space="preserve">[FOR/AGAINST]</w:t>
+      </w:r>
+      <w:r>
+        <w:rPr>
+          <w:rFonts w:ascii="Consolas" w:cs="Consolas" w:eastAsia="Consolas" w:hAnsi="Consolas"/>
+          <w:sz w:val="20"/>
+          <w:szCs w:val="20"/>
+        </w:rPr>
+        <w:t xml:space="preserve"> at </w:t>
+      </w:r>
+      <w:r>
+        <w:rPr>
+          <w:rFonts w:ascii="Consolas" w:cs="Consolas" w:eastAsia="Consolas" w:hAnsi="Consolas"/>
+          <w:b/>
+          <w:bCs/>
+          <w:sz w:val="20"/>
+          <w:szCs w:val="20"/>
+          <w:highlight w:val="yellow"/>
+        </w:rPr>
+        <w:t xml:space="preserve">[X]</w:t>
+      </w:r>
+      <w:r>
+        <w:rPr>
+          <w:rFonts w:ascii="Consolas" w:cs="Consolas" w:eastAsia="Consolas" w:hAnsi="Consolas"/>
+          <w:sz w:val="20"/>
+          <w:szCs w:val="20"/>
+        </w:rPr>
+        <w:t xml:space="preserve">%</w:t>
+      </w:r>
+    </w:p>
+    <w:p>
+      <w:pPr>
+        <w:pBdr>
+          <w:top w:val="single" w:color="262626" w:sz="12"/>
+          <w:left w:val="single" w:color="262626" w:sz="12"/>
+          <w:bottom w:val="single" w:color="262626" w:sz="12"/>
+          <w:right w:val="single" w:color="262626" w:sz="12"/>
+        </w:pBdr>
+        <w:shd w:fill="FAFAF5" w:val="clear"/>
+        <w:spacing w:after="100"/>
+      </w:pPr>
+    </w:p>
+    <w:p>
+      <w:pPr>
+        <w:pBdr>
+          <w:top w:val="single" w:color="262626" w:sz="12"/>
+          <w:left w:val="single" w:color="262626" w:sz="12"/>
+          <w:bottom w:val="single" w:color="262626" w:sz="12"/>
+          <w:right w:val="single" w:color="262626" w:sz="12"/>
+        </w:pBdr>
+        <w:shd w:fill="FAFAF5" w:val="clear"/>
+        <w:spacing w:after="0"/>
+        <w:ind w:left="200" w:right="200"/>
+      </w:pPr>
+      <w:r>
+        <w:rPr>
+          <w:rFonts w:ascii="Consolas" w:cs="Consolas" w:eastAsia="Consolas" w:hAnsi="Consolas"/>
+          <w:sz w:val="20"/>
+          <w:szCs w:val="20"/>
+        </w:rPr>
+        <w:t xml:space="preserve">Reminder of the honest math: record turnout is 2.73% (35 voters); last vote was 1.73% (27). And the rule we disclosed on day one still stands: </w:t>
+      </w:r>
+      <w:r>
+        <w:rPr>
+          <w:rFonts w:ascii="Consolas" w:cs="Consolas" w:eastAsia="Consolas" w:hAnsi="Consolas"/>
+          <w:b/>
+          <w:bCs/>
+          <w:sz w:val="20"/>
+          <w:szCs w:val="20"/>
+        </w:rPr>
+        <w:t xml:space="preserve">if 5% isn't reached, the most-voted outcome still becomes our working consensus</w:t>
+      </w:r>
+      <w:r>
+        <w:rPr>
+          <w:rFonts w:ascii="Consolas" w:cs="Consolas" w:eastAsia="Consolas" w:hAnsi="Consolas"/>
+          <w:sz w:val="20"/>
+          <w:szCs w:val="20"/>
+        </w:rPr>
+        <w:t xml:space="preserve"> — recorded openly, re-confirmed later. Your vote counts either way.</w:t>
+      </w:r>
+    </w:p>
+    <w:p>
+      <w:pPr>
+        <w:pBdr>
+          <w:top w:val="single" w:color="262626" w:sz="12"/>
+          <w:left w:val="single" w:color="262626" w:sz="12"/>
+          <w:bottom w:val="single" w:color="262626" w:sz="12"/>
+          <w:right w:val="single" w:color="262626" w:sz="12"/>
+        </w:pBdr>
+        <w:shd w:fill="FAFAF5" w:val="clear"/>
+        <w:spacing w:after="100"/>
+      </w:pPr>
+    </w:p>
+    <w:p>
+      <w:pPr>
+        <w:pBdr>
+          <w:top w:val="single" w:color="262626" w:sz="12"/>
+          <w:left w:val="single" w:color="262626" w:sz="12"/>
+          <w:bottom w:val="single" w:color="262626" w:sz="12"/>
+          <w:right w:val="single" w:color="262626" w:sz="12"/>
+        </w:pBdr>
+        <w:shd w:fill="FAFAF5" w:val="clear"/>
+        <w:spacing w:after="0"/>
+        <w:ind w:left="200" w:right="200"/>
+      </w:pPr>
+      <w:r>
+        <w:rPr>
+          <w:rFonts w:ascii="Consolas" w:cs="Consolas" w:eastAsia="Consolas" w:hAnsi="Consolas"/>
+          <w:sz w:val="20"/>
+          <w:szCs w:val="20"/>
+        </w:rPr>
+        <w:t xml:space="preserve">Change your ballot any time until Nov 1, 00:00 UTC.</w:t>
+      </w:r>
+    </w:p>
+    <w:p>
+      <w:pPr>
+        <w:pBdr>
+          <w:top w:val="single" w:color="262626" w:sz="12"/>
+          <w:left w:val="single" w:color="262626" w:sz="12"/>
+          <w:bottom w:val="single" w:color="262626" w:sz="12"/>
+          <w:right w:val="single" w:color="262626" w:sz="12"/>
+        </w:pBdr>
+        <w:shd w:fill="FAFAF5" w:val="clear"/>
+        <w:spacing w:after="100"/>
+      </w:pPr>
+    </w:p>
+    <w:p>
+      <w:pPr>
+        <w:pBdr>
+          <w:top w:val="single" w:color="262626" w:sz="12"/>
+          <w:left w:val="single" w:color="262626" w:sz="12"/>
+          <w:bottom w:val="single" w:color="262626" w:sz="12"/>
+          <w:right w:val="single" w:color="262626" w:sz="12"/>
+        </w:pBdr>
+        <w:shd w:fill="FAFAF5" w:val="clear"/>
+        <w:spacing w:after="0"/>
+        <w:ind w:left="200" w:right="200"/>
+      </w:pPr>
+      <w:r>
+        <w:rPr>
+          <w:rFonts w:ascii="Consolas" w:cs="Consolas" w:eastAsia="Consolas" w:hAnsi="Consolas"/>
+          <w:sz w:val="20"/>
+          <w:szCs w:val="20"/>
+        </w:rPr>
+        <w:t xml:space="preserve">👉 dao.omnom.dog/vote?utm_campaign=wave1-referendum&amp;utm_source=x</w:t>
+      </w:r>
+    </w:p>
+    <w:p>
+      <w:pPr>
+        <w:pBdr>
+          <w:top w:val="single" w:color="262626" w:sz="12"/>
+          <w:left w:val="single" w:color="262626" w:sz="12"/>
+          <w:bottom w:val="single" w:color="262626" w:sz="12"/>
+          <w:right w:val="single" w:color="262626" w:sz="12"/>
+        </w:pBdr>
+        <w:shd w:fill="FAFAF5" w:val="clear"/>
+        <w:spacing w:after="100"/>
+      </w:pPr>
+    </w:p>
+    <w:p>
+      <w:pPr>
+        <w:pBdr>
+          <w:top w:val="single" w:color="262626" w:sz="12"/>
+          <w:left w:val="single" w:color="262626" w:sz="12"/>
+          <w:bottom w:val="single" w:color="262626" w:sz="12"/>
+          <w:right w:val="single" w:color="262626" w:sz="12"/>
+        </w:pBdr>
+        <w:shd w:fill="FAFAF5" w:val="clear"/>
+        <w:spacing w:after="0"/>
+        <w:ind w:left="200" w:right="200"/>
+      </w:pPr>
+      <w:r>
+        <w:rPr>
+          <w:rFonts w:ascii="Consolas" w:cs="Consolas" w:eastAsia="Consolas" w:hAnsi="Consolas"/>
+          <w:sz w:val="20"/>
+          <w:szCs w:val="20"/>
+        </w:rPr>
+        <w:t xml:space="preserve">$OMNOM #DAO #Governance 🐕🧡</w:t>
+      </w:r>
     </w:p>
     <w:p>
       <w:pPr>
@@ -2403,8 +3097,548 @@
           <w:right w:val="single" w:color="262626" w:sz="12"/>
         </w:pBdr>
         <w:shd w:fill="FAFAF5" w:val="clear"/>
-        <w:spacing w:after="100"/>
-      </w:pPr>
+        <w:spacing w:after="0"/>
+        <w:ind w:left="200" w:right="200"/>
+      </w:pPr>
+      <w:r>
+        <w:rPr>
+          <w:rFonts w:ascii="Consolas" w:cs="Consolas" w:eastAsia="Consolas" w:hAnsi="Consolas"/>
+          <w:sz w:val="20"/>
+          <w:szCs w:val="20"/>
+        </w:rPr>
+        <w:t xml:space="preserve">(Oct 16) — halfway</w:t>
+      </w:r>
+    </w:p>
+    <w:p>
+      <w:pPr>
+        <w:pBdr>
+          <w:top w:val="single" w:color="262626" w:sz="12"/>
+          <w:left w:val="single" w:color="262626" w:sz="12"/>
+          <w:bottom w:val="single" w:color="262626" w:sz="12"/>
+          <w:right w:val="single" w:color="262626" w:sz="12"/>
+        </w:pBdr>
+        <w:shd w:fill="FAFAF5" w:val="clear"/>
+        <w:spacing w:after="100"/>
+      </w:pPr>
+    </w:p>
+    <w:p>
+      <w:pPr>
+        <w:pBdr>
+          <w:top w:val="single" w:color="262626" w:sz="12"/>
+          <w:left w:val="single" w:color="262626" w:sz="12"/>
+          <w:bottom w:val="single" w:color="262626" w:sz="12"/>
+          <w:right w:val="single" w:color="262626" w:sz="12"/>
+        </w:pBdr>
+        <w:shd w:fill="FAFAF5" w:val="clear"/>
+        <w:spacing w:after="0"/>
+        <w:ind w:left="200" w:right="200"/>
+      </w:pPr>
+      <w:r>
+        <w:rPr>
+          <w:rFonts w:ascii="Consolas" w:cs="Consolas" w:eastAsia="Consolas" w:hAnsi="Consolas"/>
+          <w:sz w:val="20"/>
+          <w:szCs w:val="20"/>
+        </w:rPr>
+        <w:t xml:space="preserve">🗳️ </w:t>
+      </w:r>
+      <w:r>
+        <w:rPr>
+          <w:rFonts w:ascii="Consolas" w:cs="Consolas" w:eastAsia="Consolas" w:hAnsi="Consolas"/>
+          <w:b/>
+          <w:bCs/>
+          <w:sz w:val="20"/>
+          <w:szCs w:val="20"/>
+        </w:rPr>
+        <w:t xml:space="preserve">Halfway through the $OMNOM rulebook vote.</w:t>
+      </w:r>
+    </w:p>
+    <w:p>
+      <w:pPr>
+        <w:pBdr>
+          <w:top w:val="single" w:color="262626" w:sz="12"/>
+          <w:left w:val="single" w:color="262626" w:sz="12"/>
+          <w:bottom w:val="single" w:color="262626" w:sz="12"/>
+          <w:right w:val="single" w:color="262626" w:sz="12"/>
+        </w:pBdr>
+        <w:shd w:fill="FAFAF5" w:val="clear"/>
+        <w:spacing w:after="100"/>
+      </w:pPr>
+    </w:p>
+    <w:p>
+      <w:pPr>
+        <w:pBdr>
+          <w:top w:val="single" w:color="262626" w:sz="12"/>
+          <w:left w:val="single" w:color="262626" w:sz="12"/>
+          <w:bottom w:val="single" w:color="262626" w:sz="12"/>
+          <w:right w:val="single" w:color="262626" w:sz="12"/>
+        </w:pBdr>
+        <w:shd w:fill="FAFAF5" w:val="clear"/>
+        <w:spacing w:after="0"/>
+        <w:ind w:left="200" w:right="200"/>
+      </w:pPr>
+      <w:r>
+        <w:rPr>
+          <w:rFonts w:ascii="Consolas" w:cs="Consolas" w:eastAsia="Consolas" w:hAnsi="Consolas"/>
+          <w:b/>
+          <w:bCs/>
+          <w:sz w:val="20"/>
+          <w:szCs w:val="20"/>
+        </w:rPr>
+        <w:t xml:space="preserve">[N] ballots = [X]% of the 5% bar</w:t>
+      </w:r>
+      <w:r>
+        <w:rPr>
+          <w:rFonts w:ascii="Consolas" w:cs="Consolas" w:eastAsia="Consolas" w:hAnsi="Consolas"/>
+          <w:sz w:val="20"/>
+          <w:szCs w:val="20"/>
+        </w:rPr>
+        <w:t xml:space="preserve"> (for scale: record turnout 2.73%, last vote 1.73%). Fifteen days left.</w:t>
+      </w:r>
+    </w:p>
+    <w:p>
+      <w:pPr>
+        <w:pBdr>
+          <w:top w:val="single" w:color="262626" w:sz="12"/>
+          <w:left w:val="single" w:color="262626" w:sz="12"/>
+          <w:bottom w:val="single" w:color="262626" w:sz="12"/>
+          <w:right w:val="single" w:color="262626" w:sz="12"/>
+        </w:pBdr>
+        <w:shd w:fill="FAFAF5" w:val="clear"/>
+        <w:spacing w:after="100"/>
+      </w:pPr>
+    </w:p>
+    <w:p>
+      <w:pPr>
+        <w:pBdr>
+          <w:top w:val="single" w:color="262626" w:sz="12"/>
+          <w:left w:val="single" w:color="262626" w:sz="12"/>
+          <w:bottom w:val="single" w:color="262626" w:sz="12"/>
+          <w:right w:val="single" w:color="262626" w:sz="12"/>
+        </w:pBdr>
+        <w:shd w:fill="FAFAF5" w:val="clear"/>
+        <w:spacing w:after="0"/>
+        <w:ind w:left="200" w:right="200"/>
+      </w:pPr>
+      <w:r>
+        <w:rPr>
+          <w:rFonts w:ascii="Consolas" w:cs="Consolas" w:eastAsia="Consolas" w:hAnsi="Consolas"/>
+          <w:sz w:val="20"/>
+          <w:szCs w:val="20"/>
+        </w:rPr>
+        <w:t xml:space="preserve">Leading positions:</w:t>
+      </w:r>
+    </w:p>
+    <w:p>
+      <w:pPr>
+        <w:pBdr>
+          <w:top w:val="single" w:color="262626" w:sz="12"/>
+          <w:left w:val="single" w:color="262626" w:sz="12"/>
+          <w:bottom w:val="single" w:color="262626" w:sz="12"/>
+          <w:right w:val="single" w:color="262626" w:sz="12"/>
+        </w:pBdr>
+        <w:shd w:fill="FAFAF5" w:val="clear"/>
+        <w:spacing w:after="0"/>
+        <w:ind w:left="200" w:right="200"/>
+      </w:pPr>
+      <w:r>
+        <w:rPr>
+          <w:rFonts w:ascii="Consolas" w:cs="Consolas" w:eastAsia="Consolas" w:hAnsi="Consolas"/>
+          <w:sz w:val="20"/>
+          <w:szCs w:val="20"/>
+        </w:rPr>
+        <w:t xml:space="preserve">1️⃣ </w:t>
+      </w:r>
+      <w:r>
+        <w:rPr>
+          <w:rFonts w:ascii="Consolas" w:cs="Consolas" w:eastAsia="Consolas" w:hAnsi="Consolas"/>
+          <w:b/>
+          <w:bCs/>
+          <w:sz w:val="20"/>
+          <w:szCs w:val="20"/>
+        </w:rPr>
+        <w:t xml:space="preserve">Global default quorum</w:t>
+      </w:r>
+      <w:r>
+        <w:rPr>
+          <w:rFonts w:ascii="Consolas" w:cs="Consolas" w:eastAsia="Consolas" w:hAnsi="Consolas"/>
+          <w:sz w:val="20"/>
+          <w:szCs w:val="20"/>
+        </w:rPr>
+        <w:t xml:space="preserve">: </w:t>
+      </w:r>
+      <w:r>
+        <w:rPr>
+          <w:rFonts w:ascii="Consolas" w:cs="Consolas" w:eastAsia="Consolas" w:hAnsi="Consolas"/>
+          <w:b/>
+          <w:bCs/>
+          <w:sz w:val="20"/>
+          <w:szCs w:val="20"/>
+        </w:rPr>
+        <w:t xml:space="preserve">[FOR/AGAINST]</w:t>
+      </w:r>
+      <w:r>
+        <w:rPr>
+          <w:rFonts w:ascii="Consolas" w:cs="Consolas" w:eastAsia="Consolas" w:hAnsi="Consolas"/>
+          <w:sz w:val="20"/>
+          <w:szCs w:val="20"/>
+        </w:rPr>
+        <w:t xml:space="preserve"> at </w:t>
+      </w:r>
+      <w:r>
+        <w:rPr>
+          <w:rFonts w:ascii="Consolas" w:cs="Consolas" w:eastAsia="Consolas" w:hAnsi="Consolas"/>
+          <w:b/>
+          <w:bCs/>
+          <w:sz w:val="20"/>
+          <w:szCs w:val="20"/>
+          <w:highlight w:val="yellow"/>
+        </w:rPr>
+        <w:t xml:space="preserve">[X]</w:t>
+      </w:r>
+      <w:r>
+        <w:rPr>
+          <w:rFonts w:ascii="Consolas" w:cs="Consolas" w:eastAsia="Consolas" w:hAnsi="Consolas"/>
+          <w:sz w:val="20"/>
+          <w:szCs w:val="20"/>
+        </w:rPr>
+        <w:t xml:space="preserve">%</w:t>
+      </w:r>
+    </w:p>
+    <w:p>
+      <w:pPr>
+        <w:pBdr>
+          <w:top w:val="single" w:color="262626" w:sz="12"/>
+          <w:left w:val="single" w:color="262626" w:sz="12"/>
+          <w:bottom w:val="single" w:color="262626" w:sz="12"/>
+          <w:right w:val="single" w:color="262626" w:sz="12"/>
+        </w:pBdr>
+        <w:shd w:fill="FAFAF5" w:val="clear"/>
+        <w:spacing w:after="0"/>
+        <w:ind w:left="200" w:right="200"/>
+      </w:pPr>
+      <w:r>
+        <w:rPr>
+          <w:rFonts w:ascii="Consolas" w:cs="Consolas" w:eastAsia="Consolas" w:hAnsi="Consolas"/>
+          <w:sz w:val="20"/>
+          <w:szCs w:val="20"/>
+        </w:rPr>
+        <w:t xml:space="preserve">2️⃣ </w:t>
+      </w:r>
+      <w:r>
+        <w:rPr>
+          <w:rFonts w:ascii="Consolas" w:cs="Consolas" w:eastAsia="Consolas" w:hAnsi="Consolas"/>
+          <w:b/>
+          <w:bCs/>
+          <w:sz w:val="20"/>
+          <w:szCs w:val="20"/>
+        </w:rPr>
+        <w:t xml:space="preserve">Pass threshold</w:t>
+      </w:r>
+      <w:r>
+        <w:rPr>
+          <w:rFonts w:ascii="Consolas" w:cs="Consolas" w:eastAsia="Consolas" w:hAnsi="Consolas"/>
+          <w:sz w:val="20"/>
+          <w:szCs w:val="20"/>
+        </w:rPr>
+        <w:t xml:space="preserve">: </w:t>
+      </w:r>
+      <w:r>
+        <w:rPr>
+          <w:rFonts w:ascii="Consolas" w:cs="Consolas" w:eastAsia="Consolas" w:hAnsi="Consolas"/>
+          <w:b/>
+          <w:bCs/>
+          <w:sz w:val="20"/>
+          <w:szCs w:val="20"/>
+        </w:rPr>
+        <w:t xml:space="preserve">[FOR/AGAINST]</w:t>
+      </w:r>
+      <w:r>
+        <w:rPr>
+          <w:rFonts w:ascii="Consolas" w:cs="Consolas" w:eastAsia="Consolas" w:hAnsi="Consolas"/>
+          <w:sz w:val="20"/>
+          <w:szCs w:val="20"/>
+        </w:rPr>
+        <w:t xml:space="preserve"> at </w:t>
+      </w:r>
+      <w:r>
+        <w:rPr>
+          <w:rFonts w:ascii="Consolas" w:cs="Consolas" w:eastAsia="Consolas" w:hAnsi="Consolas"/>
+          <w:b/>
+          <w:bCs/>
+          <w:sz w:val="20"/>
+          <w:szCs w:val="20"/>
+          <w:highlight w:val="yellow"/>
+        </w:rPr>
+        <w:t xml:space="preserve">[X]</w:t>
+      </w:r>
+      <w:r>
+        <w:rPr>
+          <w:rFonts w:ascii="Consolas" w:cs="Consolas" w:eastAsia="Consolas" w:hAnsi="Consolas"/>
+          <w:sz w:val="20"/>
+          <w:szCs w:val="20"/>
+        </w:rPr>
+        <w:t xml:space="preserve">%</w:t>
+      </w:r>
+    </w:p>
+    <w:p>
+      <w:pPr>
+        <w:pBdr>
+          <w:top w:val="single" w:color="262626" w:sz="12"/>
+          <w:left w:val="single" w:color="262626" w:sz="12"/>
+          <w:bottom w:val="single" w:color="262626" w:sz="12"/>
+          <w:right w:val="single" w:color="262626" w:sz="12"/>
+        </w:pBdr>
+        <w:shd w:fill="FAFAF5" w:val="clear"/>
+        <w:spacing w:after="0"/>
+        <w:ind w:left="200" w:right="200"/>
+      </w:pPr>
+      <w:r>
+        <w:rPr>
+          <w:rFonts w:ascii="Consolas" w:cs="Consolas" w:eastAsia="Consolas" w:hAnsi="Consolas"/>
+          <w:sz w:val="20"/>
+          <w:szCs w:val="20"/>
+        </w:rPr>
+        <w:t xml:space="preserve">3️⃣ Per-type schedule: </w:t>
+      </w:r>
+      <w:r>
+        <w:rPr>
+          <w:rFonts w:ascii="Consolas" w:cs="Consolas" w:eastAsia="Consolas" w:hAnsi="Consolas"/>
+          <w:b/>
+          <w:bCs/>
+          <w:sz w:val="20"/>
+          <w:szCs w:val="20"/>
+        </w:rPr>
+        <w:t xml:space="preserve">[FOR/AGAINST]</w:t>
+      </w:r>
+      <w:r>
+        <w:rPr>
+          <w:rFonts w:ascii="Consolas" w:cs="Consolas" w:eastAsia="Consolas" w:hAnsi="Consolas"/>
+          <w:sz w:val="20"/>
+          <w:szCs w:val="20"/>
+        </w:rPr>
+        <w:t xml:space="preserve"> at </w:t>
+      </w:r>
+      <w:r>
+        <w:rPr>
+          <w:rFonts w:ascii="Consolas" w:cs="Consolas" w:eastAsia="Consolas" w:hAnsi="Consolas"/>
+          <w:b/>
+          <w:bCs/>
+          <w:sz w:val="20"/>
+          <w:szCs w:val="20"/>
+          <w:highlight w:val="yellow"/>
+        </w:rPr>
+        <w:t xml:space="preserve">[X]</w:t>
+      </w:r>
+      <w:r>
+        <w:rPr>
+          <w:rFonts w:ascii="Consolas" w:cs="Consolas" w:eastAsia="Consolas" w:hAnsi="Consolas"/>
+          <w:sz w:val="20"/>
+          <w:szCs w:val="20"/>
+        </w:rPr>
+        <w:t xml:space="preserve">%</w:t>
+      </w:r>
+    </w:p>
+    <w:p>
+      <w:pPr>
+        <w:pBdr>
+          <w:top w:val="single" w:color="262626" w:sz="12"/>
+          <w:left w:val="single" w:color="262626" w:sz="12"/>
+          <w:bottom w:val="single" w:color="262626" w:sz="12"/>
+          <w:right w:val="single" w:color="262626" w:sz="12"/>
+        </w:pBdr>
+        <w:shd w:fill="FAFAF5" w:val="clear"/>
+        <w:spacing w:after="100"/>
+      </w:pPr>
+    </w:p>
+    <w:p>
+      <w:pPr>
+        <w:pBdr>
+          <w:top w:val="single" w:color="262626" w:sz="12"/>
+          <w:left w:val="single" w:color="262626" w:sz="12"/>
+          <w:bottom w:val="single" w:color="262626" w:sz="12"/>
+          <w:right w:val="single" w:color="262626" w:sz="12"/>
+        </w:pBdr>
+        <w:shd w:fill="FAFAF5" w:val="clear"/>
+        <w:spacing w:after="0"/>
+        <w:ind w:left="200" w:right="200"/>
+      </w:pPr>
+      <w:r>
+        <w:rPr>
+          <w:rFonts w:ascii="Consolas" w:cs="Consolas" w:eastAsia="Consolas" w:hAnsi="Consolas"/>
+          <w:sz w:val="20"/>
+          <w:szCs w:val="20"/>
+        </w:rPr>
+        <w:t xml:space="preserve">Biggest movement this week: </w:t>
+      </w:r>
+      <w:r>
+        <w:rPr>
+          <w:rFonts w:ascii="Consolas" w:cs="Consolas" w:eastAsia="Consolas" w:hAnsi="Consolas"/>
+          <w:b/>
+          <w:bCs/>
+          <w:sz w:val="20"/>
+          <w:szCs w:val="20"/>
+          <w:highlight w:val="yellow"/>
+        </w:rPr>
+        <w:t xml:space="preserve">[one line on swing / new voters / discussion]</w:t>
+      </w:r>
+      <w:r>
+        <w:rPr>
+          <w:rFonts w:ascii="Consolas" w:cs="Consolas" w:eastAsia="Consolas" w:hAnsi="Consolas"/>
+          <w:sz w:val="20"/>
+          <w:szCs w:val="20"/>
+        </w:rPr>
+        <w:t xml:space="preserve">.</w:t>
+      </w:r>
+    </w:p>
+    <w:p>
+      <w:pPr>
+        <w:pBdr>
+          <w:top w:val="single" w:color="262626" w:sz="12"/>
+          <w:left w:val="single" w:color="262626" w:sz="12"/>
+          <w:bottom w:val="single" w:color="262626" w:sz="12"/>
+          <w:right w:val="single" w:color="262626" w:sz="12"/>
+        </w:pBdr>
+        <w:shd w:fill="FAFAF5" w:val="clear"/>
+        <w:spacing w:after="100"/>
+      </w:pPr>
+    </w:p>
+    <w:p>
+      <w:pPr>
+        <w:pBdr>
+          <w:top w:val="single" w:color="262626" w:sz="12"/>
+          <w:left w:val="single" w:color="262626" w:sz="12"/>
+          <w:bottom w:val="single" w:color="262626" w:sz="12"/>
+          <w:right w:val="single" w:color="262626" w:sz="12"/>
+        </w:pBdr>
+        <w:shd w:fill="FAFAF5" w:val="clear"/>
+        <w:spacing w:after="0"/>
+        <w:ind w:left="200" w:right="200"/>
+      </w:pPr>
+      <w:r>
+        <w:rPr>
+          <w:rFonts w:ascii="Consolas" w:cs="Consolas" w:eastAsia="Consolas" w:hAnsi="Consolas"/>
+          <w:sz w:val="20"/>
+          <w:szCs w:val="20"/>
+        </w:rPr>
+        <w:t xml:space="preserve">Same disclosure as day one: </w:t>
+      </w:r>
+      <w:r>
+        <w:rPr>
+          <w:rFonts w:ascii="Consolas" w:cs="Consolas" w:eastAsia="Consolas" w:hAnsi="Consolas"/>
+          <w:b/>
+          <w:bCs/>
+          <w:sz w:val="20"/>
+          <w:szCs w:val="20"/>
+        </w:rPr>
+        <w:t xml:space="preserve">if 5% isn't reached, the most-voted outcome still becomes our working consensus</w:t>
+      </w:r>
+      <w:r>
+        <w:rPr>
+          <w:rFonts w:ascii="Consolas" w:cs="Consolas" w:eastAsia="Consolas" w:hAnsi="Consolas"/>
+          <w:sz w:val="20"/>
+          <w:szCs w:val="20"/>
+        </w:rPr>
+        <w:t xml:space="preserve"> — recorded openly as quorum-missed, re-confirmed in a later ratification vote. No surprises, ever.</w:t>
+      </w:r>
+    </w:p>
+    <w:p>
+      <w:pPr>
+        <w:pBdr>
+          <w:top w:val="single" w:color="262626" w:sz="12"/>
+          <w:left w:val="single" w:color="262626" w:sz="12"/>
+          <w:bottom w:val="single" w:color="262626" w:sz="12"/>
+          <w:right w:val="single" w:color="262626" w:sz="12"/>
+        </w:pBdr>
+        <w:shd w:fill="FAFAF5" w:val="clear"/>
+        <w:spacing w:after="100"/>
+      </w:pPr>
+    </w:p>
+    <w:p>
+      <w:pPr>
+        <w:pBdr>
+          <w:top w:val="single" w:color="262626" w:sz="12"/>
+          <w:left w:val="single" w:color="262626" w:sz="12"/>
+          <w:bottom w:val="single" w:color="262626" w:sz="12"/>
+          <w:right w:val="single" w:color="262626" w:sz="12"/>
+        </w:pBdr>
+        <w:shd w:fill="FAFAF5" w:val="clear"/>
+        <w:spacing w:after="0"/>
+        <w:ind w:left="200" w:right="200"/>
+      </w:pPr>
+      <w:r>
+        <w:rPr>
+          <w:rFonts w:ascii="Consolas" w:cs="Consolas" w:eastAsia="Consolas" w:hAnsi="Consolas"/>
+          <w:sz w:val="20"/>
+          <w:szCs w:val="20"/>
+        </w:rPr>
+        <w:t xml:space="preserve">Ballots are changeable until Nov 1, 00:00 UTC.</w:t>
+      </w:r>
+    </w:p>
+    <w:p>
+      <w:pPr>
+        <w:pBdr>
+          <w:top w:val="single" w:color="262626" w:sz="12"/>
+          <w:left w:val="single" w:color="262626" w:sz="12"/>
+          <w:bottom w:val="single" w:color="262626" w:sz="12"/>
+          <w:right w:val="single" w:color="262626" w:sz="12"/>
+        </w:pBdr>
+        <w:shd w:fill="FAFAF5" w:val="clear"/>
+        <w:spacing w:after="100"/>
+      </w:pPr>
+    </w:p>
+    <w:p>
+      <w:pPr>
+        <w:pBdr>
+          <w:top w:val="single" w:color="262626" w:sz="12"/>
+          <w:left w:val="single" w:color="262626" w:sz="12"/>
+          <w:bottom w:val="single" w:color="262626" w:sz="12"/>
+          <w:right w:val="single" w:color="262626" w:sz="12"/>
+        </w:pBdr>
+        <w:shd w:fill="FAFAF5" w:val="clear"/>
+        <w:spacing w:after="0"/>
+        <w:ind w:left="200" w:right="200"/>
+      </w:pPr>
+      <w:r>
+        <w:rPr>
+          <w:rFonts w:ascii="Consolas" w:cs="Consolas" w:eastAsia="Consolas" w:hAnsi="Consolas"/>
+          <w:sz w:val="20"/>
+          <w:szCs w:val="20"/>
+        </w:rPr>
+        <w:t xml:space="preserve">👉 dao.omnom.dog/vote?utm_campaign=wave1-referendum&amp;utm_source=x</w:t>
+      </w:r>
+    </w:p>
+    <w:p>
+      <w:pPr>
+        <w:pBdr>
+          <w:top w:val="single" w:color="262626" w:sz="12"/>
+          <w:left w:val="single" w:color="262626" w:sz="12"/>
+          <w:bottom w:val="single" w:color="262626" w:sz="12"/>
+          <w:right w:val="single" w:color="262626" w:sz="12"/>
+        </w:pBdr>
+        <w:shd w:fill="FAFAF5" w:val="clear"/>
+        <w:spacing w:after="100"/>
+      </w:pPr>
+    </w:p>
+    <w:p>
+      <w:pPr>
+        <w:pBdr>
+          <w:top w:val="single" w:color="262626" w:sz="12"/>
+          <w:left w:val="single" w:color="262626" w:sz="12"/>
+          <w:bottom w:val="single" w:color="262626" w:sz="12"/>
+          <w:right w:val="single" w:color="262626" w:sz="12"/>
+        </w:pBdr>
+        <w:shd w:fill="FAFAF5" w:val="clear"/>
+        <w:spacing w:after="0"/>
+        <w:ind w:left="200" w:right="200"/>
+      </w:pPr>
+      <w:r>
+        <w:rPr>
+          <w:rFonts w:ascii="Consolas" w:cs="Consolas" w:eastAsia="Consolas" w:hAnsi="Consolas"/>
+          <w:sz w:val="20"/>
+          <w:szCs w:val="20"/>
+        </w:rPr>
+        <w:t xml:space="preserve">$OMNOM #DAO #Governance 🐕🧡</w:t>
+      </w:r>
     </w:p>
     <w:p>
       <w:pPr>
@@ -2433,8 +3667,481 @@
           <w:right w:val="single" w:color="262626" w:sz="12"/>
         </w:pBdr>
         <w:shd w:fill="FAFAF5" w:val="clear"/>
-        <w:spacing w:after="100"/>
-      </w:pPr>
+        <w:spacing w:after="0"/>
+        <w:ind w:left="200" w:right="200"/>
+      </w:pPr>
+      <w:r>
+        <w:rPr>
+          <w:rFonts w:ascii="Consolas" w:cs="Consolas" w:eastAsia="Consolas" w:hAnsi="Consolas"/>
+          <w:sz w:val="20"/>
+          <w:szCs w:val="20"/>
+        </w:rPr>
+        <w:t xml:space="preserve">(Oct 23) — final stretch begins</w:t>
+      </w:r>
+    </w:p>
+    <w:p>
+      <w:pPr>
+        <w:pBdr>
+          <w:top w:val="single" w:color="262626" w:sz="12"/>
+          <w:left w:val="single" w:color="262626" w:sz="12"/>
+          <w:bottom w:val="single" w:color="262626" w:sz="12"/>
+          <w:right w:val="single" w:color="262626" w:sz="12"/>
+        </w:pBdr>
+        <w:shd w:fill="FAFAF5" w:val="clear"/>
+        <w:spacing w:after="100"/>
+      </w:pPr>
+    </w:p>
+    <w:p>
+      <w:pPr>
+        <w:pBdr>
+          <w:top w:val="single" w:color="262626" w:sz="12"/>
+          <w:left w:val="single" w:color="262626" w:sz="12"/>
+          <w:bottom w:val="single" w:color="262626" w:sz="12"/>
+          <w:right w:val="single" w:color="262626" w:sz="12"/>
+        </w:pBdr>
+        <w:shd w:fill="FAFAF5" w:val="clear"/>
+        <w:spacing w:after="0"/>
+        <w:ind w:left="200" w:right="200"/>
+      </w:pPr>
+      <w:r>
+        <w:rPr>
+          <w:rFonts w:ascii="Consolas" w:cs="Consolas" w:eastAsia="Consolas" w:hAnsi="Consolas"/>
+          <w:sz w:val="20"/>
+          <w:szCs w:val="20"/>
+        </w:rPr>
+        <w:t xml:space="preserve">🗳️ </w:t>
+      </w:r>
+      <w:r>
+        <w:rPr>
+          <w:rFonts w:ascii="Consolas" w:cs="Consolas" w:eastAsia="Consolas" w:hAnsi="Consolas"/>
+          <w:b/>
+          <w:bCs/>
+          <w:sz w:val="20"/>
+          <w:szCs w:val="20"/>
+        </w:rPr>
+        <w:t xml:space="preserve">One week left on the $OMNOM rulebook vote.</w:t>
+      </w:r>
+    </w:p>
+    <w:p>
+      <w:pPr>
+        <w:pBdr>
+          <w:top w:val="single" w:color="262626" w:sz="12"/>
+          <w:left w:val="single" w:color="262626" w:sz="12"/>
+          <w:bottom w:val="single" w:color="262626" w:sz="12"/>
+          <w:right w:val="single" w:color="262626" w:sz="12"/>
+        </w:pBdr>
+        <w:shd w:fill="FAFAF5" w:val="clear"/>
+        <w:spacing w:after="100"/>
+      </w:pPr>
+    </w:p>
+    <w:p>
+      <w:pPr>
+        <w:pBdr>
+          <w:top w:val="single" w:color="262626" w:sz="12"/>
+          <w:left w:val="single" w:color="262626" w:sz="12"/>
+          <w:bottom w:val="single" w:color="262626" w:sz="12"/>
+          <w:right w:val="single" w:color="262626" w:sz="12"/>
+        </w:pBdr>
+        <w:shd w:fill="FAFAF5" w:val="clear"/>
+        <w:spacing w:after="0"/>
+        <w:ind w:left="200" w:right="200"/>
+      </w:pPr>
+      <w:r>
+        <w:rPr>
+          <w:rFonts w:ascii="Consolas" w:cs="Consolas" w:eastAsia="Consolas" w:hAnsi="Consolas"/>
+          <w:b/>
+          <w:bCs/>
+          <w:sz w:val="20"/>
+          <w:szCs w:val="20"/>
+        </w:rPr>
+        <w:t xml:space="preserve">[N] ballots = [X]% of the 5% bar</w:t>
+      </w:r>
+      <w:r>
+        <w:rPr>
+          <w:rFonts w:ascii="Consolas" w:cs="Consolas" w:eastAsia="Consolas" w:hAnsi="Consolas"/>
+          <w:sz w:val="20"/>
+          <w:szCs w:val="20"/>
+        </w:rPr>
+        <w:t xml:space="preserve"> (for scale: record turnout 2.73%, last vote 1.73%). Closes </w:t>
+      </w:r>
+      <w:r>
+        <w:rPr>
+          <w:rFonts w:ascii="Consolas" w:cs="Consolas" w:eastAsia="Consolas" w:hAnsi="Consolas"/>
+          <w:b/>
+          <w:bCs/>
+          <w:sz w:val="20"/>
+          <w:szCs w:val="20"/>
+        </w:rPr>
+        <w:t xml:space="preserve">Nov 1, 00:00 UTC</w:t>
+      </w:r>
+      <w:r>
+        <w:rPr>
+          <w:rFonts w:ascii="Consolas" w:cs="Consolas" w:eastAsia="Consolas" w:hAnsi="Consolas"/>
+          <w:sz w:val="20"/>
+          <w:szCs w:val="20"/>
+        </w:rPr>
+        <w:t xml:space="preserve"> (8 PM local Oct 31).</w:t>
+      </w:r>
+    </w:p>
+    <w:p>
+      <w:pPr>
+        <w:pBdr>
+          <w:top w:val="single" w:color="262626" w:sz="12"/>
+          <w:left w:val="single" w:color="262626" w:sz="12"/>
+          <w:bottom w:val="single" w:color="262626" w:sz="12"/>
+          <w:right w:val="single" w:color="262626" w:sz="12"/>
+        </w:pBdr>
+        <w:shd w:fill="FAFAF5" w:val="clear"/>
+        <w:spacing w:after="100"/>
+      </w:pPr>
+    </w:p>
+    <w:p>
+      <w:pPr>
+        <w:pBdr>
+          <w:top w:val="single" w:color="262626" w:sz="12"/>
+          <w:left w:val="single" w:color="262626" w:sz="12"/>
+          <w:bottom w:val="single" w:color="262626" w:sz="12"/>
+          <w:right w:val="single" w:color="262626" w:sz="12"/>
+        </w:pBdr>
+        <w:shd w:fill="FAFAF5" w:val="clear"/>
+        <w:spacing w:after="0"/>
+        <w:ind w:left="200" w:right="200"/>
+      </w:pPr>
+      <w:r>
+        <w:rPr>
+          <w:rFonts w:ascii="Consolas" w:cs="Consolas" w:eastAsia="Consolas" w:hAnsi="Consolas"/>
+          <w:sz w:val="20"/>
+          <w:szCs w:val="20"/>
+        </w:rPr>
+        <w:t xml:space="preserve">Leading positions:</w:t>
+      </w:r>
+    </w:p>
+    <w:p>
+      <w:pPr>
+        <w:pBdr>
+          <w:top w:val="single" w:color="262626" w:sz="12"/>
+          <w:left w:val="single" w:color="262626" w:sz="12"/>
+          <w:bottom w:val="single" w:color="262626" w:sz="12"/>
+          <w:right w:val="single" w:color="262626" w:sz="12"/>
+        </w:pBdr>
+        <w:shd w:fill="FAFAF5" w:val="clear"/>
+        <w:spacing w:after="0"/>
+        <w:ind w:left="200" w:right="200"/>
+      </w:pPr>
+      <w:r>
+        <w:rPr>
+          <w:rFonts w:ascii="Consolas" w:cs="Consolas" w:eastAsia="Consolas" w:hAnsi="Consolas"/>
+          <w:sz w:val="20"/>
+          <w:szCs w:val="20"/>
+        </w:rPr>
+        <w:t xml:space="preserve">1️⃣ </w:t>
+      </w:r>
+      <w:r>
+        <w:rPr>
+          <w:rFonts w:ascii="Consolas" w:cs="Consolas" w:eastAsia="Consolas" w:hAnsi="Consolas"/>
+          <w:b/>
+          <w:bCs/>
+          <w:sz w:val="20"/>
+          <w:szCs w:val="20"/>
+        </w:rPr>
+        <w:t xml:space="preserve">Global default quorum</w:t>
+      </w:r>
+      <w:r>
+        <w:rPr>
+          <w:rFonts w:ascii="Consolas" w:cs="Consolas" w:eastAsia="Consolas" w:hAnsi="Consolas"/>
+          <w:sz w:val="20"/>
+          <w:szCs w:val="20"/>
+        </w:rPr>
+        <w:t xml:space="preserve">: </w:t>
+      </w:r>
+      <w:r>
+        <w:rPr>
+          <w:rFonts w:ascii="Consolas" w:cs="Consolas" w:eastAsia="Consolas" w:hAnsi="Consolas"/>
+          <w:b/>
+          <w:bCs/>
+          <w:sz w:val="20"/>
+          <w:szCs w:val="20"/>
+        </w:rPr>
+        <w:t xml:space="preserve">[FOR/AGAINST]</w:t>
+      </w:r>
+      <w:r>
+        <w:rPr>
+          <w:rFonts w:ascii="Consolas" w:cs="Consolas" w:eastAsia="Consolas" w:hAnsi="Consolas"/>
+          <w:sz w:val="20"/>
+          <w:szCs w:val="20"/>
+        </w:rPr>
+        <w:t xml:space="preserve"> at </w:t>
+      </w:r>
+      <w:r>
+        <w:rPr>
+          <w:rFonts w:ascii="Consolas" w:cs="Consolas" w:eastAsia="Consolas" w:hAnsi="Consolas"/>
+          <w:b/>
+          <w:bCs/>
+          <w:sz w:val="20"/>
+          <w:szCs w:val="20"/>
+          <w:highlight w:val="yellow"/>
+        </w:rPr>
+        <w:t xml:space="preserve">[X]</w:t>
+      </w:r>
+      <w:r>
+        <w:rPr>
+          <w:rFonts w:ascii="Consolas" w:cs="Consolas" w:eastAsia="Consolas" w:hAnsi="Consolas"/>
+          <w:sz w:val="20"/>
+          <w:szCs w:val="20"/>
+        </w:rPr>
+        <w:t xml:space="preserve">%</w:t>
+      </w:r>
+    </w:p>
+    <w:p>
+      <w:pPr>
+        <w:pBdr>
+          <w:top w:val="single" w:color="262626" w:sz="12"/>
+          <w:left w:val="single" w:color="262626" w:sz="12"/>
+          <w:bottom w:val="single" w:color="262626" w:sz="12"/>
+          <w:right w:val="single" w:color="262626" w:sz="12"/>
+        </w:pBdr>
+        <w:shd w:fill="FAFAF5" w:val="clear"/>
+        <w:spacing w:after="0"/>
+        <w:ind w:left="200" w:right="200"/>
+      </w:pPr>
+      <w:r>
+        <w:rPr>
+          <w:rFonts w:ascii="Consolas" w:cs="Consolas" w:eastAsia="Consolas" w:hAnsi="Consolas"/>
+          <w:sz w:val="20"/>
+          <w:szCs w:val="20"/>
+        </w:rPr>
+        <w:t xml:space="preserve">2️⃣ </w:t>
+      </w:r>
+      <w:r>
+        <w:rPr>
+          <w:rFonts w:ascii="Consolas" w:cs="Consolas" w:eastAsia="Consolas" w:hAnsi="Consolas"/>
+          <w:b/>
+          <w:bCs/>
+          <w:sz w:val="20"/>
+          <w:szCs w:val="20"/>
+        </w:rPr>
+        <w:t xml:space="preserve">Pass threshold</w:t>
+      </w:r>
+      <w:r>
+        <w:rPr>
+          <w:rFonts w:ascii="Consolas" w:cs="Consolas" w:eastAsia="Consolas" w:hAnsi="Consolas"/>
+          <w:sz w:val="20"/>
+          <w:szCs w:val="20"/>
+        </w:rPr>
+        <w:t xml:space="preserve">: </w:t>
+      </w:r>
+      <w:r>
+        <w:rPr>
+          <w:rFonts w:ascii="Consolas" w:cs="Consolas" w:eastAsia="Consolas" w:hAnsi="Consolas"/>
+          <w:b/>
+          <w:bCs/>
+          <w:sz w:val="20"/>
+          <w:szCs w:val="20"/>
+        </w:rPr>
+        <w:t xml:space="preserve">[FOR/AGAINST]</w:t>
+      </w:r>
+      <w:r>
+        <w:rPr>
+          <w:rFonts w:ascii="Consolas" w:cs="Consolas" w:eastAsia="Consolas" w:hAnsi="Consolas"/>
+          <w:sz w:val="20"/>
+          <w:szCs w:val="20"/>
+        </w:rPr>
+        <w:t xml:space="preserve"> at </w:t>
+      </w:r>
+      <w:r>
+        <w:rPr>
+          <w:rFonts w:ascii="Consolas" w:cs="Consolas" w:eastAsia="Consolas" w:hAnsi="Consolas"/>
+          <w:b/>
+          <w:bCs/>
+          <w:sz w:val="20"/>
+          <w:szCs w:val="20"/>
+          <w:highlight w:val="yellow"/>
+        </w:rPr>
+        <w:t xml:space="preserve">[X]</w:t>
+      </w:r>
+      <w:r>
+        <w:rPr>
+          <w:rFonts w:ascii="Consolas" w:cs="Consolas" w:eastAsia="Consolas" w:hAnsi="Consolas"/>
+          <w:sz w:val="20"/>
+          <w:szCs w:val="20"/>
+        </w:rPr>
+        <w:t xml:space="preserve">%</w:t>
+      </w:r>
+    </w:p>
+    <w:p>
+      <w:pPr>
+        <w:pBdr>
+          <w:top w:val="single" w:color="262626" w:sz="12"/>
+          <w:left w:val="single" w:color="262626" w:sz="12"/>
+          <w:bottom w:val="single" w:color="262626" w:sz="12"/>
+          <w:right w:val="single" w:color="262626" w:sz="12"/>
+        </w:pBdr>
+        <w:shd w:fill="FAFAF5" w:val="clear"/>
+        <w:spacing w:after="0"/>
+        <w:ind w:left="200" w:right="200"/>
+      </w:pPr>
+      <w:r>
+        <w:rPr>
+          <w:rFonts w:ascii="Consolas" w:cs="Consolas" w:eastAsia="Consolas" w:hAnsi="Consolas"/>
+          <w:sz w:val="20"/>
+          <w:szCs w:val="20"/>
+        </w:rPr>
+        <w:t xml:space="preserve">3️⃣ Per-type schedule: </w:t>
+      </w:r>
+      <w:r>
+        <w:rPr>
+          <w:rFonts w:ascii="Consolas" w:cs="Consolas" w:eastAsia="Consolas" w:hAnsi="Consolas"/>
+          <w:b/>
+          <w:bCs/>
+          <w:sz w:val="20"/>
+          <w:szCs w:val="20"/>
+        </w:rPr>
+        <w:t xml:space="preserve">[FOR/AGAINST]</w:t>
+      </w:r>
+      <w:r>
+        <w:rPr>
+          <w:rFonts w:ascii="Consolas" w:cs="Consolas" w:eastAsia="Consolas" w:hAnsi="Consolas"/>
+          <w:sz w:val="20"/>
+          <w:szCs w:val="20"/>
+        </w:rPr>
+        <w:t xml:space="preserve"> at </w:t>
+      </w:r>
+      <w:r>
+        <w:rPr>
+          <w:rFonts w:ascii="Consolas" w:cs="Consolas" w:eastAsia="Consolas" w:hAnsi="Consolas"/>
+          <w:b/>
+          <w:bCs/>
+          <w:sz w:val="20"/>
+          <w:szCs w:val="20"/>
+          <w:highlight w:val="yellow"/>
+        </w:rPr>
+        <w:t xml:space="preserve">[X]</w:t>
+      </w:r>
+      <w:r>
+        <w:rPr>
+          <w:rFonts w:ascii="Consolas" w:cs="Consolas" w:eastAsia="Consolas" w:hAnsi="Consolas"/>
+          <w:sz w:val="20"/>
+          <w:szCs w:val="20"/>
+        </w:rPr>
+        <w:t xml:space="preserve">%</w:t>
+      </w:r>
+    </w:p>
+    <w:p>
+      <w:pPr>
+        <w:pBdr>
+          <w:top w:val="single" w:color="262626" w:sz="12"/>
+          <w:left w:val="single" w:color="262626" w:sz="12"/>
+          <w:bottom w:val="single" w:color="262626" w:sz="12"/>
+          <w:right w:val="single" w:color="262626" w:sz="12"/>
+        </w:pBdr>
+        <w:shd w:fill="FAFAF5" w:val="clear"/>
+        <w:spacing w:after="100"/>
+      </w:pPr>
+    </w:p>
+    <w:p>
+      <w:pPr>
+        <w:pBdr>
+          <w:top w:val="single" w:color="262626" w:sz="12"/>
+          <w:left w:val="single" w:color="262626" w:sz="12"/>
+          <w:bottom w:val="single" w:color="262626" w:sz="12"/>
+          <w:right w:val="single" w:color="262626" w:sz="12"/>
+        </w:pBdr>
+        <w:shd w:fill="FAFAF5" w:val="clear"/>
+        <w:spacing w:after="0"/>
+        <w:ind w:left="200" w:right="200"/>
+      </w:pPr>
+      <w:r>
+        <w:rPr>
+          <w:rFonts w:ascii="Consolas" w:cs="Consolas" w:eastAsia="Consolas" w:hAnsi="Consolas"/>
+          <w:sz w:val="20"/>
+          <w:szCs w:val="20"/>
+        </w:rPr>
+        <w:t xml:space="preserve">If you've been meaning to vote: this is the week. Gasless, ~90 seconds, changeable until close. And as disclosed from day one: </w:t>
+      </w:r>
+      <w:r>
+        <w:rPr>
+          <w:rFonts w:ascii="Consolas" w:cs="Consolas" w:eastAsia="Consolas" w:hAnsi="Consolas"/>
+          <w:b/>
+          <w:bCs/>
+          <w:sz w:val="20"/>
+          <w:szCs w:val="20"/>
+        </w:rPr>
+        <w:t xml:space="preserve">if 5% isn't reached, the most-voted outcome still becomes our working consensus</w:t>
+      </w:r>
+      <w:r>
+        <w:rPr>
+          <w:rFonts w:ascii="Consolas" w:cs="Consolas" w:eastAsia="Consolas" w:hAnsi="Consolas"/>
+          <w:sz w:val="20"/>
+          <w:szCs w:val="20"/>
+        </w:rPr>
+        <w:t xml:space="preserve"> — recorded openly, re-confirmed later. But a real quorum makes it binding. Help us get there.</w:t>
+      </w:r>
+    </w:p>
+    <w:p>
+      <w:pPr>
+        <w:pBdr>
+          <w:top w:val="single" w:color="262626" w:sz="12"/>
+          <w:left w:val="single" w:color="262626" w:sz="12"/>
+          <w:bottom w:val="single" w:color="262626" w:sz="12"/>
+          <w:right w:val="single" w:color="262626" w:sz="12"/>
+        </w:pBdr>
+        <w:shd w:fill="FAFAF5" w:val="clear"/>
+        <w:spacing w:after="100"/>
+      </w:pPr>
+    </w:p>
+    <w:p>
+      <w:pPr>
+        <w:pBdr>
+          <w:top w:val="single" w:color="262626" w:sz="12"/>
+          <w:left w:val="single" w:color="262626" w:sz="12"/>
+          <w:bottom w:val="single" w:color="262626" w:sz="12"/>
+          <w:right w:val="single" w:color="262626" w:sz="12"/>
+        </w:pBdr>
+        <w:shd w:fill="FAFAF5" w:val="clear"/>
+        <w:spacing w:after="0"/>
+        <w:ind w:left="200" w:right="200"/>
+      </w:pPr>
+      <w:r>
+        <w:rPr>
+          <w:rFonts w:ascii="Consolas" w:cs="Consolas" w:eastAsia="Consolas" w:hAnsi="Consolas"/>
+          <w:sz w:val="20"/>
+          <w:szCs w:val="20"/>
+        </w:rPr>
+        <w:t xml:space="preserve">👉 dao.omnom.dog/vote?utm_campaign=wave1-referendum&amp;utm_source=x</w:t>
+      </w:r>
+    </w:p>
+    <w:p>
+      <w:pPr>
+        <w:pBdr>
+          <w:top w:val="single" w:color="262626" w:sz="12"/>
+          <w:left w:val="single" w:color="262626" w:sz="12"/>
+          <w:bottom w:val="single" w:color="262626" w:sz="12"/>
+          <w:right w:val="single" w:color="262626" w:sz="12"/>
+        </w:pBdr>
+        <w:shd w:fill="FAFAF5" w:val="clear"/>
+        <w:spacing w:after="100"/>
+      </w:pPr>
+    </w:p>
+    <w:p>
+      <w:pPr>
+        <w:pBdr>
+          <w:top w:val="single" w:color="262626" w:sz="12"/>
+          <w:left w:val="single" w:color="262626" w:sz="12"/>
+          <w:bottom w:val="single" w:color="262626" w:sz="12"/>
+          <w:right w:val="single" w:color="262626" w:sz="12"/>
+        </w:pBdr>
+        <w:shd w:fill="FAFAF5" w:val="clear"/>
+        <w:spacing w:after="0"/>
+        <w:ind w:left="200" w:right="200"/>
+      </w:pPr>
+      <w:r>
+        <w:rPr>
+          <w:rFonts w:ascii="Consolas" w:cs="Consolas" w:eastAsia="Consolas" w:hAnsi="Consolas"/>
+          <w:sz w:val="20"/>
+          <w:szCs w:val="20"/>
+        </w:rPr>
+        <w:t xml:space="preserve">$OMNOM #DAO #Governance 🐕🧡</w:t>
+      </w:r>
     </w:p>
     <w:p>
       <w:pPr>
@@ -2463,8 +4170,469 @@
           <w:right w:val="single" w:color="262626" w:sz="12"/>
         </w:pBdr>
         <w:shd w:fill="FAFAF5" w:val="clear"/>
-        <w:spacing w:after="100"/>
-      </w:pPr>
+        <w:spacing w:after="0"/>
+        <w:ind w:left="200" w:right="200"/>
+      </w:pPr>
+      <w:r>
+        <w:rPr>
+          <w:rFonts w:ascii="Consolas" w:cs="Consolas" w:eastAsia="Consolas" w:hAnsi="Consolas"/>
+          <w:sz w:val="20"/>
+          <w:szCs w:val="20"/>
+        </w:rPr>
+        <w:t xml:space="preserve">post (from Oct 30, 00:00 UTC)</w:t>
+      </w:r>
+    </w:p>
+    <w:p>
+      <w:pPr>
+        <w:pBdr>
+          <w:top w:val="single" w:color="262626" w:sz="12"/>
+          <w:left w:val="single" w:color="262626" w:sz="12"/>
+          <w:bottom w:val="single" w:color="262626" w:sz="12"/>
+          <w:right w:val="single" w:color="262626" w:sz="12"/>
+        </w:pBdr>
+        <w:shd w:fill="FAFAF5" w:val="clear"/>
+        <w:spacing w:after="100"/>
+      </w:pPr>
+    </w:p>
+    <w:p>
+      <w:pPr>
+        <w:pBdr>
+          <w:top w:val="single" w:color="262626" w:sz="12"/>
+          <w:left w:val="single" w:color="262626" w:sz="12"/>
+          <w:bottom w:val="single" w:color="262626" w:sz="12"/>
+          <w:right w:val="single" w:color="262626" w:sz="12"/>
+        </w:pBdr>
+        <w:shd w:fill="FAFAF5" w:val="clear"/>
+        <w:spacing w:after="0"/>
+        <w:ind w:left="200" w:right="200"/>
+      </w:pPr>
+      <w:r>
+        <w:rPr>
+          <w:rFonts w:ascii="Consolas" w:cs="Consolas" w:eastAsia="Consolas" w:hAnsi="Consolas"/>
+          <w:sz w:val="20"/>
+          <w:szCs w:val="20"/>
+        </w:rPr>
+        <w:t xml:space="preserve">🗳️ </w:t>
+      </w:r>
+      <w:r>
+        <w:rPr>
+          <w:rFonts w:ascii="Consolas" w:cs="Consolas" w:eastAsia="Consolas" w:hAnsi="Consolas"/>
+          <w:b/>
+          <w:bCs/>
+          <w:sz w:val="20"/>
+          <w:szCs w:val="20"/>
+        </w:rPr>
+        <w:t xml:space="preserve">FINAL 48 HOURS — $OMNOM rulebook vote closes Nov 1, 00:00 UTC</w:t>
+      </w:r>
+      <w:r>
+        <w:rPr>
+          <w:rFonts w:ascii="Consolas" w:cs="Consolas" w:eastAsia="Consolas" w:hAnsi="Consolas"/>
+          <w:sz w:val="20"/>
+          <w:szCs w:val="20"/>
+        </w:rPr>
+        <w:t xml:space="preserve"> (8 PM local Oct 31).</w:t>
+      </w:r>
+    </w:p>
+    <w:p>
+      <w:pPr>
+        <w:pBdr>
+          <w:top w:val="single" w:color="262626" w:sz="12"/>
+          <w:left w:val="single" w:color="262626" w:sz="12"/>
+          <w:bottom w:val="single" w:color="262626" w:sz="12"/>
+          <w:right w:val="single" w:color="262626" w:sz="12"/>
+        </w:pBdr>
+        <w:shd w:fill="FAFAF5" w:val="clear"/>
+        <w:spacing w:after="100"/>
+      </w:pPr>
+    </w:p>
+    <w:p>
+      <w:pPr>
+        <w:pBdr>
+          <w:top w:val="single" w:color="262626" w:sz="12"/>
+          <w:left w:val="single" w:color="262626" w:sz="12"/>
+          <w:bottom w:val="single" w:color="262626" w:sz="12"/>
+          <w:right w:val="single" w:color="262626" w:sz="12"/>
+        </w:pBdr>
+        <w:shd w:fill="FAFAF5" w:val="clear"/>
+        <w:spacing w:after="0"/>
+        <w:ind w:left="200" w:right="200"/>
+      </w:pPr>
+      <w:r>
+        <w:rPr>
+          <w:rFonts w:ascii="Consolas" w:cs="Consolas" w:eastAsia="Consolas" w:hAnsi="Consolas"/>
+          <w:b/>
+          <w:bCs/>
+          <w:sz w:val="20"/>
+          <w:szCs w:val="20"/>
+        </w:rPr>
+        <w:t xml:space="preserve">[N] ballots = [X]% of the 5% bar</w:t>
+      </w:r>
+      <w:r>
+        <w:rPr>
+          <w:rFonts w:ascii="Consolas" w:cs="Consolas" w:eastAsia="Consolas" w:hAnsi="Consolas"/>
+          <w:sz w:val="20"/>
+          <w:szCs w:val="20"/>
+        </w:rPr>
+        <w:t xml:space="preserve"> (for scale: record turnout 2.73%, last vote 1.73%). Leading positions:</w:t>
+      </w:r>
+    </w:p>
+    <w:p>
+      <w:pPr>
+        <w:pBdr>
+          <w:top w:val="single" w:color="262626" w:sz="12"/>
+          <w:left w:val="single" w:color="262626" w:sz="12"/>
+          <w:bottom w:val="single" w:color="262626" w:sz="12"/>
+          <w:right w:val="single" w:color="262626" w:sz="12"/>
+        </w:pBdr>
+        <w:shd w:fill="FAFAF5" w:val="clear"/>
+        <w:spacing w:after="0"/>
+        <w:ind w:left="200" w:right="200"/>
+      </w:pPr>
+      <w:r>
+        <w:rPr>
+          <w:rFonts w:ascii="Consolas" w:cs="Consolas" w:eastAsia="Consolas" w:hAnsi="Consolas"/>
+          <w:sz w:val="20"/>
+          <w:szCs w:val="20"/>
+        </w:rPr>
+        <w:t xml:space="preserve">1️⃣ Quorum: </w:t>
+      </w:r>
+      <w:r>
+        <w:rPr>
+          <w:rFonts w:ascii="Consolas" w:cs="Consolas" w:eastAsia="Consolas" w:hAnsi="Consolas"/>
+          <w:b/>
+          <w:bCs/>
+          <w:sz w:val="20"/>
+          <w:szCs w:val="20"/>
+        </w:rPr>
+        <w:t xml:space="preserve">[FOR/AGAINST]</w:t>
+      </w:r>
+      <w:r>
+        <w:rPr>
+          <w:rFonts w:ascii="Consolas" w:cs="Consolas" w:eastAsia="Consolas" w:hAnsi="Consolas"/>
+          <w:sz w:val="20"/>
+          <w:szCs w:val="20"/>
+        </w:rPr>
+        <w:t xml:space="preserve"> </w:t>
+      </w:r>
+      <w:r>
+        <w:rPr>
+          <w:rFonts w:ascii="Consolas" w:cs="Consolas" w:eastAsia="Consolas" w:hAnsi="Consolas"/>
+          <w:b/>
+          <w:bCs/>
+          <w:sz w:val="20"/>
+          <w:szCs w:val="20"/>
+          <w:highlight w:val="yellow"/>
+        </w:rPr>
+        <w:t xml:space="preserve">[X]</w:t>
+      </w:r>
+      <w:r>
+        <w:rPr>
+          <w:rFonts w:ascii="Consolas" w:cs="Consolas" w:eastAsia="Consolas" w:hAnsi="Consolas"/>
+          <w:sz w:val="20"/>
+          <w:szCs w:val="20"/>
+        </w:rPr>
+        <w:t xml:space="preserve">% · 2️⃣ Threshold: </w:t>
+      </w:r>
+      <w:r>
+        <w:rPr>
+          <w:rFonts w:ascii="Consolas" w:cs="Consolas" w:eastAsia="Consolas" w:hAnsi="Consolas"/>
+          <w:b/>
+          <w:bCs/>
+          <w:sz w:val="20"/>
+          <w:szCs w:val="20"/>
+        </w:rPr>
+        <w:t xml:space="preserve">[FOR/AGAINST]</w:t>
+      </w:r>
+      <w:r>
+        <w:rPr>
+          <w:rFonts w:ascii="Consolas" w:cs="Consolas" w:eastAsia="Consolas" w:hAnsi="Consolas"/>
+          <w:sz w:val="20"/>
+          <w:szCs w:val="20"/>
+        </w:rPr>
+        <w:t xml:space="preserve"> </w:t>
+      </w:r>
+      <w:r>
+        <w:rPr>
+          <w:rFonts w:ascii="Consolas" w:cs="Consolas" w:eastAsia="Consolas" w:hAnsi="Consolas"/>
+          <w:b/>
+          <w:bCs/>
+          <w:sz w:val="20"/>
+          <w:szCs w:val="20"/>
+          <w:highlight w:val="yellow"/>
+        </w:rPr>
+        <w:t xml:space="preserve">[X]</w:t>
+      </w:r>
+      <w:r>
+        <w:rPr>
+          <w:rFonts w:ascii="Consolas" w:cs="Consolas" w:eastAsia="Consolas" w:hAnsi="Consolas"/>
+          <w:sz w:val="20"/>
+          <w:szCs w:val="20"/>
+        </w:rPr>
+        <w:t xml:space="preserve">% · 3️⃣ Schedule: </w:t>
+      </w:r>
+      <w:r>
+        <w:rPr>
+          <w:rFonts w:ascii="Consolas" w:cs="Consolas" w:eastAsia="Consolas" w:hAnsi="Consolas"/>
+          <w:b/>
+          <w:bCs/>
+          <w:sz w:val="20"/>
+          <w:szCs w:val="20"/>
+        </w:rPr>
+        <w:t xml:space="preserve">[FOR/AGAINST]</w:t>
+      </w:r>
+      <w:r>
+        <w:rPr>
+          <w:rFonts w:ascii="Consolas" w:cs="Consolas" w:eastAsia="Consolas" w:hAnsi="Consolas"/>
+          <w:sz w:val="20"/>
+          <w:szCs w:val="20"/>
+        </w:rPr>
+        <w:t xml:space="preserve"> </w:t>
+      </w:r>
+      <w:r>
+        <w:rPr>
+          <w:rFonts w:ascii="Consolas" w:cs="Consolas" w:eastAsia="Consolas" w:hAnsi="Consolas"/>
+          <w:b/>
+          <w:bCs/>
+          <w:sz w:val="20"/>
+          <w:szCs w:val="20"/>
+          <w:highlight w:val="yellow"/>
+        </w:rPr>
+        <w:t xml:space="preserve">[X]</w:t>
+      </w:r>
+      <w:r>
+        <w:rPr>
+          <w:rFonts w:ascii="Consolas" w:cs="Consolas" w:eastAsia="Consolas" w:hAnsi="Consolas"/>
+          <w:sz w:val="20"/>
+          <w:szCs w:val="20"/>
+        </w:rPr>
+        <w:t xml:space="preserve">%</w:t>
+      </w:r>
+    </w:p>
+    <w:p>
+      <w:pPr>
+        <w:pBdr>
+          <w:top w:val="single" w:color="262626" w:sz="12"/>
+          <w:left w:val="single" w:color="262626" w:sz="12"/>
+          <w:bottom w:val="single" w:color="262626" w:sz="12"/>
+          <w:right w:val="single" w:color="262626" w:sz="12"/>
+        </w:pBdr>
+        <w:shd w:fill="FAFAF5" w:val="clear"/>
+        <w:spacing w:after="100"/>
+      </w:pPr>
+    </w:p>
+    <w:p>
+      <w:pPr>
+        <w:pBdr>
+          <w:top w:val="single" w:color="262626" w:sz="12"/>
+          <w:left w:val="single" w:color="262626" w:sz="12"/>
+          <w:bottom w:val="single" w:color="262626" w:sz="12"/>
+          <w:right w:val="single" w:color="262626" w:sz="12"/>
+        </w:pBdr>
+        <w:shd w:fill="FAFAF5" w:val="clear"/>
+        <w:spacing w:after="0"/>
+        <w:ind w:left="200" w:right="200"/>
+      </w:pPr>
+      <w:r>
+        <w:rPr>
+          <w:rFonts w:ascii="Consolas" w:cs="Consolas" w:eastAsia="Consolas" w:hAnsi="Consolas"/>
+          <w:sz w:val="20"/>
+          <w:szCs w:val="20"/>
+        </w:rPr>
+        <w:t xml:space="preserve">Three rulebook questions, one ballot each, ~90 seconds, no gas. Ever held $OMNOM? You're eligible — all 25,686 of you.</w:t>
+      </w:r>
+    </w:p>
+    <w:p>
+      <w:pPr>
+        <w:pBdr>
+          <w:top w:val="single" w:color="262626" w:sz="12"/>
+          <w:left w:val="single" w:color="262626" w:sz="12"/>
+          <w:bottom w:val="single" w:color="262626" w:sz="12"/>
+          <w:right w:val="single" w:color="262626" w:sz="12"/>
+        </w:pBdr>
+        <w:shd w:fill="FAFAF5" w:val="clear"/>
+        <w:spacing w:after="100"/>
+      </w:pPr>
+    </w:p>
+    <w:p>
+      <w:pPr>
+        <w:pBdr>
+          <w:top w:val="single" w:color="262626" w:sz="12"/>
+          <w:left w:val="single" w:color="262626" w:sz="12"/>
+          <w:bottom w:val="single" w:color="262626" w:sz="12"/>
+          <w:right w:val="single" w:color="262626" w:sz="12"/>
+        </w:pBdr>
+        <w:shd w:fill="FAFAF5" w:val="clear"/>
+        <w:spacing w:after="0"/>
+        <w:ind w:left="200" w:right="200"/>
+      </w:pPr>
+      <w:r>
+        <w:rPr>
+          <w:rFonts w:ascii="Consolas" w:cs="Consolas" w:eastAsia="Consolas" w:hAnsi="Consolas"/>
+          <w:sz w:val="20"/>
+          <w:szCs w:val="20"/>
+        </w:rPr>
+        <w:t xml:space="preserve">And the promise we made on day one: </w:t>
+      </w:r>
+      <w:r>
+        <w:rPr>
+          <w:rFonts w:ascii="Consolas" w:cs="Consolas" w:eastAsia="Consolas" w:hAnsi="Consolas"/>
+          <w:b/>
+          <w:bCs/>
+          <w:sz w:val="20"/>
+          <w:szCs w:val="20"/>
+        </w:rPr>
+        <w:t xml:space="preserve">if 5% isn't reached, the most-voted outcome still becomes our working consensus</w:t>
+      </w:r>
+      <w:r>
+        <w:rPr>
+          <w:rFonts w:ascii="Consolas" w:cs="Consolas" w:eastAsia="Consolas" w:hAnsi="Consolas"/>
+          <w:sz w:val="20"/>
+          <w:szCs w:val="20"/>
+        </w:rPr>
+        <w:t xml:space="preserve"> — recorded openly, re-confirmed in a later ratification vote. Your vote counts either way. But binding needs quorum.</w:t>
+      </w:r>
+    </w:p>
+    <w:p>
+      <w:pPr>
+        <w:pBdr>
+          <w:top w:val="single" w:color="262626" w:sz="12"/>
+          <w:left w:val="single" w:color="262626" w:sz="12"/>
+          <w:bottom w:val="single" w:color="262626" w:sz="12"/>
+          <w:right w:val="single" w:color="262626" w:sz="12"/>
+        </w:pBdr>
+        <w:shd w:fill="FAFAF5" w:val="clear"/>
+        <w:spacing w:after="100"/>
+      </w:pPr>
+    </w:p>
+    <w:p>
+      <w:pPr>
+        <w:pBdr>
+          <w:top w:val="single" w:color="262626" w:sz="12"/>
+          <w:left w:val="single" w:color="262626" w:sz="12"/>
+          <w:bottom w:val="single" w:color="262626" w:sz="12"/>
+          <w:right w:val="single" w:color="262626" w:sz="12"/>
+        </w:pBdr>
+        <w:shd w:fill="FAFAF5" w:val="clear"/>
+        <w:spacing w:after="0"/>
+        <w:ind w:left="200" w:right="200"/>
+      </w:pPr>
+      <w:r>
+        <w:rPr>
+          <w:rFonts w:ascii="Consolas" w:cs="Consolas" w:eastAsia="Consolas" w:hAnsi="Consolas"/>
+          <w:sz w:val="20"/>
+          <w:szCs w:val="20"/>
+        </w:rPr>
+        <w:t xml:space="preserve">👉 dao.omnom.dog/vote?utm_campaign=wave1-referendum&amp;utm_source=x</w:t>
+      </w:r>
+    </w:p>
+    <w:p>
+      <w:pPr>
+        <w:pBdr>
+          <w:top w:val="single" w:color="262626" w:sz="12"/>
+          <w:left w:val="single" w:color="262626" w:sz="12"/>
+          <w:bottom w:val="single" w:color="262626" w:sz="12"/>
+          <w:right w:val="single" w:color="262626" w:sz="12"/>
+        </w:pBdr>
+        <w:shd w:fill="FAFAF5" w:val="clear"/>
+        <w:spacing w:after="100"/>
+      </w:pPr>
+    </w:p>
+    <w:p>
+      <w:pPr>
+        <w:pBdr>
+          <w:top w:val="single" w:color="262626" w:sz="12"/>
+          <w:left w:val="single" w:color="262626" w:sz="12"/>
+          <w:bottom w:val="single" w:color="262626" w:sz="12"/>
+          <w:right w:val="single" w:color="262626" w:sz="12"/>
+        </w:pBdr>
+        <w:shd w:fill="FAFAF5" w:val="clear"/>
+        <w:spacing w:after="0"/>
+        <w:ind w:left="200" w:right="200"/>
+      </w:pPr>
+      <w:r>
+        <w:rPr>
+          <w:rFonts w:ascii="Consolas" w:cs="Consolas" w:eastAsia="Consolas" w:hAnsi="Consolas"/>
+          <w:sz w:val="20"/>
+          <w:szCs w:val="20"/>
+        </w:rPr>
+        <w:t xml:space="preserve">$OMNOM #DAO #Governance 🐕🧡</w:t>
+      </w:r>
+    </w:p>
+    <w:p>
+      <w:pPr>
+        <w:pBdr>
+          <w:top w:val="single" w:color="262626" w:sz="12"/>
+          <w:left w:val="single" w:color="262626" w:sz="12"/>
+          <w:bottom w:val="single" w:color="262626" w:sz="12"/>
+          <w:right w:val="single" w:color="262626" w:sz="12"/>
+        </w:pBdr>
+        <w:shd w:fill="FAFAF5" w:val="clear"/>
+        <w:spacing w:after="100"/>
+      </w:pPr>
+    </w:p>
+    <w:p>
+      <w:pPr>
+        <w:pBdr>
+          <w:top w:val="single" w:color="262626" w:sz="12"/>
+          <w:left w:val="single" w:color="262626" w:sz="12"/>
+          <w:bottom w:val="single" w:color="262626" w:sz="12"/>
+          <w:right w:val="single" w:color="262626" w:sz="12"/>
+        </w:pBdr>
+        <w:shd w:fill="FAFAF5" w:val="clear"/>
+        <w:spacing w:after="0"/>
+        <w:ind w:left="200" w:right="200"/>
+      </w:pPr>
+      <w:r>
+        <w:rPr>
+          <w:rFonts w:ascii="Consolas" w:cs="Consolas" w:eastAsia="Consolas" w:hAnsi="Consolas"/>
+          <w:sz w:val="20"/>
+          <w:szCs w:val="20"/>
+        </w:rPr>
+        <w:t xml:space="preserve">## (g) Results posts — TWO variants, decide by the final numbers only</w:t>
+      </w:r>
+    </w:p>
+    <w:p>
+      <w:pPr>
+        <w:pBdr>
+          <w:top w:val="single" w:color="262626" w:sz="12"/>
+          <w:left w:val="single" w:color="262626" w:sz="12"/>
+          <w:bottom w:val="single" w:color="262626" w:sz="12"/>
+          <w:right w:val="single" w:color="262626" w:sz="12"/>
+        </w:pBdr>
+        <w:shd w:fill="FAFAF5" w:val="clear"/>
+        <w:spacing w:after="100"/>
+      </w:pPr>
+    </w:p>
+    <w:p>
+      <w:pPr>
+        <w:pBdr>
+          <w:top w:val="single" w:color="262626" w:sz="12"/>
+          <w:left w:val="single" w:color="262626" w:sz="12"/>
+          <w:bottom w:val="single" w:color="262626" w:sz="12"/>
+          <w:right w:val="single" w:color="262626" w:sz="12"/>
+        </w:pBdr>
+        <w:shd w:fill="FAFAF5" w:val="clear"/>
+        <w:spacing w:after="0"/>
+        <w:ind w:left="200" w:right="200"/>
+      </w:pPr>
+      <w:r>
+        <w:rPr>
+          <w:rFonts w:ascii="Consolas" w:cs="Consolas" w:eastAsia="Consolas" w:hAnsi="Consolas"/>
+          <w:b/>
+          <w:bCs/>
+          <w:sz w:val="20"/>
+          <w:szCs w:val="20"/>
+        </w:rPr>
+        <w:t xml:space="preserve">Never post results until the finalize run has completed and the numbers are verified</w:t>
+      </w:r>
+      <w:r>
+        <w:rPr>
+          <w:rFonts w:ascii="Consolas" w:cs="Consolas" w:eastAsia="Consolas" w:hAnsi="Consolas"/>
+          <w:sz w:val="20"/>
+          <w:szCs w:val="20"/>
+        </w:rPr>
+        <w:t xml:space="preserve"> (cross-check `/results` and the proposal pages; the 30-min cron closes the window). Post exactly one of these. Telegram runs of either variant swap `utm_source=x` → `utm_source=telegram`.</w:t>
+      </w:r>
     </w:p>
     <w:p>
       <w:pPr>
@@ -2493,8 +4661,522 @@
           <w:right w:val="single" w:color="262626" w:sz="12"/>
         </w:pBdr>
         <w:shd w:fill="FAFAF5" w:val="clear"/>
-        <w:spacing w:after="100"/>
-      </w:pPr>
+        <w:spacing w:after="0"/>
+        <w:ind w:left="200" w:right="200"/>
+      </w:pPr>
+      <w:r>
+        <w:rPr>
+          <w:rFonts w:ascii="Consolas" w:cs="Consolas" w:eastAsia="Consolas" w:hAnsi="Consolas"/>
+          <w:sz w:val="20"/>
+          <w:szCs w:val="20"/>
+        </w:rPr>
+        <w:t xml:space="preserve">Quorum reached</w:t>
+      </w:r>
+    </w:p>
+    <w:p>
+      <w:pPr>
+        <w:pBdr>
+          <w:top w:val="single" w:color="262626" w:sz="12"/>
+          <w:left w:val="single" w:color="262626" w:sz="12"/>
+          <w:bottom w:val="single" w:color="262626" w:sz="12"/>
+          <w:right w:val="single" w:color="262626" w:sz="12"/>
+        </w:pBdr>
+        <w:shd w:fill="FAFAF5" w:val="clear"/>
+        <w:spacing w:after="100"/>
+      </w:pPr>
+    </w:p>
+    <w:p>
+      <w:pPr>
+        <w:pBdr>
+          <w:top w:val="single" w:color="262626" w:sz="12"/>
+          <w:left w:val="single" w:color="262626" w:sz="12"/>
+          <w:bottom w:val="single" w:color="262626" w:sz="12"/>
+          <w:right w:val="single" w:color="262626" w:sz="12"/>
+        </w:pBdr>
+        <w:shd w:fill="FAFAF5" w:val="clear"/>
+        <w:spacing w:after="0"/>
+        <w:ind w:left="200" w:right="200"/>
+      </w:pPr>
+      <w:r>
+        <w:rPr>
+          <w:rFonts w:ascii="Consolas" w:cs="Consolas" w:eastAsia="Consolas" w:hAnsi="Consolas"/>
+          <w:sz w:val="20"/>
+          <w:szCs w:val="20"/>
+        </w:rPr>
+        <w:t xml:space="preserve">📊 </w:t>
+      </w:r>
+      <w:r>
+        <w:rPr>
+          <w:rFonts w:ascii="Consolas" w:cs="Consolas" w:eastAsia="Consolas" w:hAnsi="Consolas"/>
+          <w:b/>
+          <w:bCs/>
+          <w:sz w:val="20"/>
+          <w:szCs w:val="20"/>
+        </w:rPr>
+        <w:t xml:space="preserve">$OMNOM rulebook vote CLOSED — QUORUM MET.</w:t>
+      </w:r>
+    </w:p>
+    <w:p>
+      <w:pPr>
+        <w:pBdr>
+          <w:top w:val="single" w:color="262626" w:sz="12"/>
+          <w:left w:val="single" w:color="262626" w:sz="12"/>
+          <w:bottom w:val="single" w:color="262626" w:sz="12"/>
+          <w:right w:val="single" w:color="262626" w:sz="12"/>
+        </w:pBdr>
+        <w:shd w:fill="FAFAF5" w:val="clear"/>
+        <w:spacing w:after="100"/>
+      </w:pPr>
+    </w:p>
+    <w:p>
+      <w:pPr>
+        <w:pBdr>
+          <w:top w:val="single" w:color="262626" w:sz="12"/>
+          <w:left w:val="single" w:color="262626" w:sz="12"/>
+          <w:bottom w:val="single" w:color="262626" w:sz="12"/>
+          <w:right w:val="single" w:color="262626" w:sz="12"/>
+        </w:pBdr>
+        <w:shd w:fill="FAFAF5" w:val="clear"/>
+        <w:spacing w:after="0"/>
+        <w:ind w:left="200" w:right="200"/>
+      </w:pPr>
+      <w:r>
+        <w:rPr>
+          <w:rFonts w:ascii="Consolas" w:cs="Consolas" w:eastAsia="Consolas" w:hAnsi="Consolas"/>
+          <w:sz w:val="20"/>
+          <w:szCs w:val="20"/>
+        </w:rPr>
+        <w:t xml:space="preserve">You didn't just vote — you cleared the bar. </w:t>
+      </w:r>
+      <w:r>
+        <w:rPr>
+          <w:rFonts w:ascii="Consolas" w:cs="Consolas" w:eastAsia="Consolas" w:hAnsi="Consolas"/>
+          <w:b/>
+          <w:bCs/>
+          <w:sz w:val="20"/>
+          <w:szCs w:val="20"/>
+        </w:rPr>
+        <w:t xml:space="preserve">[N] ballots = [X]% of total voting power</w:t>
+      </w:r>
+      <w:r>
+        <w:rPr>
+          <w:rFonts w:ascii="Consolas" w:cs="Consolas" w:eastAsia="Consolas" w:hAnsi="Consolas"/>
+          <w:sz w:val="20"/>
+          <w:szCs w:val="20"/>
+        </w:rPr>
+        <w:t xml:space="preserve"> (5% needed = 29,098,690).</w:t>
+      </w:r>
+    </w:p>
+    <w:p>
+      <w:pPr>
+        <w:pBdr>
+          <w:top w:val="single" w:color="262626" w:sz="12"/>
+          <w:left w:val="single" w:color="262626" w:sz="12"/>
+          <w:bottom w:val="single" w:color="262626" w:sz="12"/>
+          <w:right w:val="single" w:color="262626" w:sz="12"/>
+        </w:pBdr>
+        <w:shd w:fill="FAFAF5" w:val="clear"/>
+        <w:spacing w:after="100"/>
+      </w:pPr>
+    </w:p>
+    <w:p>
+      <w:pPr>
+        <w:pBdr>
+          <w:top w:val="single" w:color="262626" w:sz="12"/>
+          <w:left w:val="single" w:color="262626" w:sz="12"/>
+          <w:bottom w:val="single" w:color="262626" w:sz="12"/>
+          <w:right w:val="single" w:color="262626" w:sz="12"/>
+        </w:pBdr>
+        <w:shd w:fill="FAFAF5" w:val="clear"/>
+        <w:spacing w:after="0"/>
+        <w:ind w:left="200" w:right="200"/>
+      </w:pPr>
+      <w:r>
+        <w:rPr>
+          <w:rFonts w:ascii="Consolas" w:cs="Consolas" w:eastAsia="Consolas" w:hAnsi="Consolas"/>
+          <w:sz w:val="20"/>
+          <w:szCs w:val="20"/>
+        </w:rPr>
+        <w:t xml:space="preserve">Final results:</w:t>
+      </w:r>
+    </w:p>
+    <w:p>
+      <w:pPr>
+        <w:pBdr>
+          <w:top w:val="single" w:color="262626" w:sz="12"/>
+          <w:left w:val="single" w:color="262626" w:sz="12"/>
+          <w:bottom w:val="single" w:color="262626" w:sz="12"/>
+          <w:right w:val="single" w:color="262626" w:sz="12"/>
+        </w:pBdr>
+        <w:shd w:fill="FAFAF5" w:val="clear"/>
+        <w:spacing w:after="0"/>
+        <w:ind w:left="200" w:right="200"/>
+      </w:pPr>
+      <w:r>
+        <w:rPr>
+          <w:rFonts w:ascii="Consolas" w:cs="Consolas" w:eastAsia="Consolas" w:hAnsi="Consolas"/>
+          <w:sz w:val="20"/>
+          <w:szCs w:val="20"/>
+        </w:rPr>
+        <w:t xml:space="preserve">1️⃣ </w:t>
+      </w:r>
+      <w:r>
+        <w:rPr>
+          <w:rFonts w:ascii="Consolas" w:cs="Consolas" w:eastAsia="Consolas" w:hAnsi="Consolas"/>
+          <w:b/>
+          <w:bCs/>
+          <w:sz w:val="20"/>
+          <w:szCs w:val="20"/>
+        </w:rPr>
+        <w:t xml:space="preserve">Global default quorum</w:t>
+      </w:r>
+      <w:r>
+        <w:rPr>
+          <w:rFonts w:ascii="Consolas" w:cs="Consolas" w:eastAsia="Consolas" w:hAnsi="Consolas"/>
+          <w:sz w:val="20"/>
+          <w:szCs w:val="20"/>
+        </w:rPr>
+        <w:t xml:space="preserve">: </w:t>
+      </w:r>
+      <w:r>
+        <w:rPr>
+          <w:rFonts w:ascii="Consolas" w:cs="Consolas" w:eastAsia="Consolas" w:hAnsi="Consolas"/>
+          <w:b/>
+          <w:bCs/>
+          <w:sz w:val="20"/>
+          <w:szCs w:val="20"/>
+        </w:rPr>
+        <w:t xml:space="preserve">[FOR/AGAINST/ABSTAIN]</w:t>
+      </w:r>
+      <w:r>
+        <w:rPr>
+          <w:rFonts w:ascii="Consolas" w:cs="Consolas" w:eastAsia="Consolas" w:hAnsi="Consolas"/>
+          <w:sz w:val="20"/>
+          <w:szCs w:val="20"/>
+        </w:rPr>
+        <w:t xml:space="preserve"> — </w:t>
+      </w:r>
+      <w:r>
+        <w:rPr>
+          <w:rFonts w:ascii="Consolas" w:cs="Consolas" w:eastAsia="Consolas" w:hAnsi="Consolas"/>
+          <w:b/>
+          <w:bCs/>
+          <w:sz w:val="20"/>
+          <w:szCs w:val="20"/>
+          <w:highlight w:val="yellow"/>
+        </w:rPr>
+        <w:t xml:space="preserve">[X]</w:t>
+      </w:r>
+      <w:r>
+        <w:rPr>
+          <w:rFonts w:ascii="Consolas" w:cs="Consolas" w:eastAsia="Consolas" w:hAnsi="Consolas"/>
+          <w:sz w:val="20"/>
+          <w:szCs w:val="20"/>
+        </w:rPr>
+        <w:t xml:space="preserve">% of for+against power</w:t>
+      </w:r>
+    </w:p>
+    <w:p>
+      <w:pPr>
+        <w:pBdr>
+          <w:top w:val="single" w:color="262626" w:sz="12"/>
+          <w:left w:val="single" w:color="262626" w:sz="12"/>
+          <w:bottom w:val="single" w:color="262626" w:sz="12"/>
+          <w:right w:val="single" w:color="262626" w:sz="12"/>
+        </w:pBdr>
+        <w:shd w:fill="FAFAF5" w:val="clear"/>
+        <w:spacing w:after="0"/>
+        <w:ind w:left="200" w:right="200"/>
+      </w:pPr>
+      <w:r>
+        <w:rPr>
+          <w:rFonts w:ascii="Consolas" w:cs="Consolas" w:eastAsia="Consolas" w:hAnsi="Consolas"/>
+          <w:sz w:val="20"/>
+          <w:szCs w:val="20"/>
+        </w:rPr>
+        <w:t xml:space="preserve">2️⃣ </w:t>
+      </w:r>
+      <w:r>
+        <w:rPr>
+          <w:rFonts w:ascii="Consolas" w:cs="Consolas" w:eastAsia="Consolas" w:hAnsi="Consolas"/>
+          <w:b/>
+          <w:bCs/>
+          <w:sz w:val="20"/>
+          <w:szCs w:val="20"/>
+        </w:rPr>
+        <w:t xml:space="preserve">Pass threshold</w:t>
+      </w:r>
+      <w:r>
+        <w:rPr>
+          <w:rFonts w:ascii="Consolas" w:cs="Consolas" w:eastAsia="Consolas" w:hAnsi="Consolas"/>
+          <w:sz w:val="20"/>
+          <w:szCs w:val="20"/>
+        </w:rPr>
+        <w:t xml:space="preserve">: </w:t>
+      </w:r>
+      <w:r>
+        <w:rPr>
+          <w:rFonts w:ascii="Consolas" w:cs="Consolas" w:eastAsia="Consolas" w:hAnsi="Consolas"/>
+          <w:b/>
+          <w:bCs/>
+          <w:sz w:val="20"/>
+          <w:szCs w:val="20"/>
+        </w:rPr>
+        <w:t xml:space="preserve">[FOR/AGAINST/ABSTAIN]</w:t>
+      </w:r>
+      <w:r>
+        <w:rPr>
+          <w:rFonts w:ascii="Consolas" w:cs="Consolas" w:eastAsia="Consolas" w:hAnsi="Consolas"/>
+          <w:sz w:val="20"/>
+          <w:szCs w:val="20"/>
+        </w:rPr>
+        <w:t xml:space="preserve"> — </w:t>
+      </w:r>
+      <w:r>
+        <w:rPr>
+          <w:rFonts w:ascii="Consolas" w:cs="Consolas" w:eastAsia="Consolas" w:hAnsi="Consolas"/>
+          <w:b/>
+          <w:bCs/>
+          <w:sz w:val="20"/>
+          <w:szCs w:val="20"/>
+          <w:highlight w:val="yellow"/>
+        </w:rPr>
+        <w:t xml:space="preserve">[X]</w:t>
+      </w:r>
+      <w:r>
+        <w:rPr>
+          <w:rFonts w:ascii="Consolas" w:cs="Consolas" w:eastAsia="Consolas" w:hAnsi="Consolas"/>
+          <w:sz w:val="20"/>
+          <w:szCs w:val="20"/>
+        </w:rPr>
+        <w:t xml:space="preserve">%</w:t>
+      </w:r>
+    </w:p>
+    <w:p>
+      <w:pPr>
+        <w:pBdr>
+          <w:top w:val="single" w:color="262626" w:sz="12"/>
+          <w:left w:val="single" w:color="262626" w:sz="12"/>
+          <w:bottom w:val="single" w:color="262626" w:sz="12"/>
+          <w:right w:val="single" w:color="262626" w:sz="12"/>
+        </w:pBdr>
+        <w:shd w:fill="FAFAF5" w:val="clear"/>
+        <w:spacing w:after="0"/>
+        <w:ind w:left="200" w:right="200"/>
+      </w:pPr>
+      <w:r>
+        <w:rPr>
+          <w:rFonts w:ascii="Consolas" w:cs="Consolas" w:eastAsia="Consolas" w:hAnsi="Consolas"/>
+          <w:sz w:val="20"/>
+          <w:szCs w:val="20"/>
+        </w:rPr>
+        <w:t xml:space="preserve">3️⃣ Per-type schedule: </w:t>
+      </w:r>
+      <w:r>
+        <w:rPr>
+          <w:rFonts w:ascii="Consolas" w:cs="Consolas" w:eastAsia="Consolas" w:hAnsi="Consolas"/>
+          <w:b/>
+          <w:bCs/>
+          <w:sz w:val="20"/>
+          <w:szCs w:val="20"/>
+        </w:rPr>
+        <w:t xml:space="preserve">[FOR/AGAINST/ABSTAIN]</w:t>
+      </w:r>
+      <w:r>
+        <w:rPr>
+          <w:rFonts w:ascii="Consolas" w:cs="Consolas" w:eastAsia="Consolas" w:hAnsi="Consolas"/>
+          <w:sz w:val="20"/>
+          <w:szCs w:val="20"/>
+        </w:rPr>
+        <w:t xml:space="preserve"> — </w:t>
+      </w:r>
+      <w:r>
+        <w:rPr>
+          <w:rFonts w:ascii="Consolas" w:cs="Consolas" w:eastAsia="Consolas" w:hAnsi="Consolas"/>
+          <w:b/>
+          <w:bCs/>
+          <w:sz w:val="20"/>
+          <w:szCs w:val="20"/>
+          <w:highlight w:val="yellow"/>
+        </w:rPr>
+        <w:t xml:space="preserve">[X]</w:t>
+      </w:r>
+      <w:r>
+        <w:rPr>
+          <w:rFonts w:ascii="Consolas" w:cs="Consolas" w:eastAsia="Consolas" w:hAnsi="Consolas"/>
+          <w:sz w:val="20"/>
+          <w:szCs w:val="20"/>
+        </w:rPr>
+        <w:t xml:space="preserve">%</w:t>
+      </w:r>
+    </w:p>
+    <w:p>
+      <w:pPr>
+        <w:pBdr>
+          <w:top w:val="single" w:color="262626" w:sz="12"/>
+          <w:left w:val="single" w:color="262626" w:sz="12"/>
+          <w:bottom w:val="single" w:color="262626" w:sz="12"/>
+          <w:right w:val="single" w:color="262626" w:sz="12"/>
+        </w:pBdr>
+        <w:shd w:fill="FAFAF5" w:val="clear"/>
+        <w:spacing w:after="100"/>
+      </w:pPr>
+    </w:p>
+    <w:p>
+      <w:pPr>
+        <w:pBdr>
+          <w:top w:val="single" w:color="262626" w:sz="12"/>
+          <w:left w:val="single" w:color="262626" w:sz="12"/>
+          <w:bottom w:val="single" w:color="262626" w:sz="12"/>
+          <w:right w:val="single" w:color="262626" w:sz="12"/>
+        </w:pBdr>
+        <w:shd w:fill="FAFAF5" w:val="clear"/>
+        <w:spacing w:after="0"/>
+        <w:ind w:left="200" w:right="200"/>
+      </w:pPr>
+      <w:r>
+        <w:rPr>
+          <w:rFonts w:ascii="Consolas" w:cs="Consolas" w:eastAsia="Consolas" w:hAnsi="Consolas"/>
+          <w:sz w:val="20"/>
+          <w:szCs w:val="20"/>
+        </w:rPr>
+        <w:t xml:space="preserve">These are </w:t>
+      </w:r>
+      <w:r>
+        <w:rPr>
+          <w:rFonts w:ascii="Consolas" w:cs="Consolas" w:eastAsia="Consolas" w:hAnsi="Consolas"/>
+          <w:b/>
+          <w:bCs/>
+          <w:sz w:val="20"/>
+          <w:szCs w:val="20"/>
+        </w:rPr>
+        <w:t xml:space="preserve">binding, quorum-backed decisions</w:t>
+      </w:r>
+      <w:r>
+        <w:rPr>
+          <w:rFonts w:ascii="Consolas" w:cs="Consolas" w:eastAsia="Consolas" w:hAnsi="Consolas"/>
+          <w:sz w:val="20"/>
+          <w:szCs w:val="20"/>
+        </w:rPr>
+        <w:t xml:space="preserve">: the winning outcomes are being recorded on each proposal and applied to the platform. For the first time, the rules this DAO runs on were ratified by the people who hold it. (The rule we disclosed on day one — if 5% isn't reached, the most-voted outcome still becomes the working consensus — never came into play: you cleared the bar, so these results are binding outright, no asterisk.)</w:t>
+      </w:r>
+    </w:p>
+    <w:p>
+      <w:pPr>
+        <w:pBdr>
+          <w:top w:val="single" w:color="262626" w:sz="12"/>
+          <w:left w:val="single" w:color="262626" w:sz="12"/>
+          <w:bottom w:val="single" w:color="262626" w:sz="12"/>
+          <w:right w:val="single" w:color="262626" w:sz="12"/>
+        </w:pBdr>
+        <w:shd w:fill="FAFAF5" w:val="clear"/>
+        <w:spacing w:after="100"/>
+      </w:pPr>
+    </w:p>
+    <w:p>
+      <w:pPr>
+        <w:pBdr>
+          <w:top w:val="single" w:color="262626" w:sz="12"/>
+          <w:left w:val="single" w:color="262626" w:sz="12"/>
+          <w:bottom w:val="single" w:color="262626" w:sz="12"/>
+          <w:right w:val="single" w:color="262626" w:sz="12"/>
+        </w:pBdr>
+        <w:shd w:fill="FAFAF5" w:val="clear"/>
+        <w:spacing w:after="0"/>
+        <w:ind w:left="200" w:right="200"/>
+      </w:pPr>
+      <w:r>
+        <w:rPr>
+          <w:rFonts w:ascii="Consolas" w:cs="Consolas" w:eastAsia="Consolas" w:hAnsi="Consolas"/>
+          <w:sz w:val="20"/>
+          <w:szCs w:val="20"/>
+        </w:rPr>
+        <w:t xml:space="preserve">From record 2.73% (35 voters) and last vote's 1.73% (27) to </w:t>
+      </w:r>
+      <w:r>
+        <w:rPr>
+          <w:rFonts w:ascii="Consolas" w:cs="Consolas" w:eastAsia="Consolas" w:hAnsi="Consolas"/>
+          <w:b/>
+          <w:bCs/>
+          <w:sz w:val="20"/>
+          <w:szCs w:val="20"/>
+        </w:rPr>
+        <w:t xml:space="preserve">[X]%</w:t>
+      </w:r>
+      <w:r>
+        <w:rPr>
+          <w:rFonts w:ascii="Consolas" w:cs="Consolas" w:eastAsia="Consolas" w:hAnsi="Consolas"/>
+          <w:sz w:val="20"/>
+          <w:szCs w:val="20"/>
+        </w:rPr>
+        <w:t xml:space="preserve"> — that's what showing up does.</w:t>
+      </w:r>
+    </w:p>
+    <w:p>
+      <w:pPr>
+        <w:pBdr>
+          <w:top w:val="single" w:color="262626" w:sz="12"/>
+          <w:left w:val="single" w:color="262626" w:sz="12"/>
+          <w:bottom w:val="single" w:color="262626" w:sz="12"/>
+          <w:right w:val="single" w:color="262626" w:sz="12"/>
+        </w:pBdr>
+        <w:shd w:fill="FAFAF5" w:val="clear"/>
+        <w:spacing w:after="100"/>
+      </w:pPr>
+    </w:p>
+    <w:p>
+      <w:pPr>
+        <w:pBdr>
+          <w:top w:val="single" w:color="262626" w:sz="12"/>
+          <w:left w:val="single" w:color="262626" w:sz="12"/>
+          <w:bottom w:val="single" w:color="262626" w:sz="12"/>
+          <w:right w:val="single" w:color="262626" w:sz="12"/>
+        </w:pBdr>
+        <w:shd w:fill="FAFAF5" w:val="clear"/>
+        <w:spacing w:after="0"/>
+        <w:ind w:left="200" w:right="200"/>
+      </w:pPr>
+      <w:r>
+        <w:rPr>
+          <w:rFonts w:ascii="Consolas" w:cs="Consolas" w:eastAsia="Consolas" w:hAnsi="Consolas"/>
+          <w:sz w:val="20"/>
+          <w:szCs w:val="20"/>
+        </w:rPr>
+        <w:t xml:space="preserve">Full numbers: dao.omnom.dog/results?utm_campaign=wave1-referendum&amp;utm_source=x</w:t>
+      </w:r>
+    </w:p>
+    <w:p>
+      <w:pPr>
+        <w:pBdr>
+          <w:top w:val="single" w:color="262626" w:sz="12"/>
+          <w:left w:val="single" w:color="262626" w:sz="12"/>
+          <w:bottom w:val="single" w:color="262626" w:sz="12"/>
+          <w:right w:val="single" w:color="262626" w:sz="12"/>
+        </w:pBdr>
+        <w:shd w:fill="FAFAF5" w:val="clear"/>
+        <w:spacing w:after="100"/>
+      </w:pPr>
+    </w:p>
+    <w:p>
+      <w:pPr>
+        <w:pBdr>
+          <w:top w:val="single" w:color="262626" w:sz="12"/>
+          <w:left w:val="single" w:color="262626" w:sz="12"/>
+          <w:bottom w:val="single" w:color="262626" w:sz="12"/>
+          <w:right w:val="single" w:color="262626" w:sz="12"/>
+        </w:pBdr>
+        <w:shd w:fill="FAFAF5" w:val="clear"/>
+        <w:spacing w:after="0"/>
+        <w:ind w:left="200" w:right="200"/>
+      </w:pPr>
+      <w:r>
+        <w:rPr>
+          <w:rFonts w:ascii="Consolas" w:cs="Consolas" w:eastAsia="Consolas" w:hAnsi="Consolas"/>
+          <w:sz w:val="20"/>
+          <w:szCs w:val="20"/>
+        </w:rPr>
+        <w:t xml:space="preserve">$OMNOM #DAO #Governance 🐕🧡</w:t>
+      </w:r>
     </w:p>
     <w:p>
       <w:pPr>
@@ -2523,8 +5205,682 @@
           <w:right w:val="single" w:color="262626" w:sz="12"/>
         </w:pBdr>
         <w:shd w:fill="FAFAF5" w:val="clear"/>
-        <w:spacing w:after="100"/>
-      </w:pPr>
+        <w:spacing w:after="0"/>
+        <w:ind w:left="200" w:right="200"/>
+      </w:pPr>
+      <w:r>
+        <w:rPr>
+          <w:rFonts w:ascii="Consolas" w:cs="Consolas" w:eastAsia="Consolas" w:hAnsi="Consolas"/>
+          <w:sz w:val="20"/>
+          <w:szCs w:val="20"/>
+        </w:rPr>
+        <w:t xml:space="preserve">Consensus fallback (quorum missed)</w:t>
+      </w:r>
+    </w:p>
+    <w:p>
+      <w:pPr>
+        <w:pBdr>
+          <w:top w:val="single" w:color="262626" w:sz="12"/>
+          <w:left w:val="single" w:color="262626" w:sz="12"/>
+          <w:bottom w:val="single" w:color="262626" w:sz="12"/>
+          <w:right w:val="single" w:color="262626" w:sz="12"/>
+        </w:pBdr>
+        <w:shd w:fill="FAFAF5" w:val="clear"/>
+        <w:spacing w:after="100"/>
+      </w:pPr>
+    </w:p>
+    <w:p>
+      <w:pPr>
+        <w:pBdr>
+          <w:top w:val="single" w:color="262626" w:sz="12"/>
+          <w:left w:val="single" w:color="262626" w:sz="12"/>
+          <w:bottom w:val="single" w:color="262626" w:sz="12"/>
+          <w:right w:val="single" w:color="262626" w:sz="12"/>
+        </w:pBdr>
+        <w:shd w:fill="FAFAF5" w:val="clear"/>
+        <w:spacing w:after="0"/>
+        <w:ind w:left="200" w:right="200"/>
+      </w:pPr>
+      <w:r>
+        <w:rPr>
+          <w:rFonts w:ascii="Consolas" w:cs="Consolas" w:eastAsia="Consolas" w:hAnsi="Consolas"/>
+          <w:sz w:val="20"/>
+          <w:szCs w:val="20"/>
+        </w:rPr>
+        <w:t xml:space="preserve">📊 </w:t>
+      </w:r>
+      <w:r>
+        <w:rPr>
+          <w:rFonts w:ascii="Consolas" w:cs="Consolas" w:eastAsia="Consolas" w:hAnsi="Consolas"/>
+          <w:b/>
+          <w:bCs/>
+          <w:sz w:val="20"/>
+          <w:szCs w:val="20"/>
+        </w:rPr>
+        <w:t xml:space="preserve">$OMNOM rulebook vote CLOSED. We missed the 5% quorum — and we're doing exactly what we said we would.</w:t>
+      </w:r>
+    </w:p>
+    <w:p>
+      <w:pPr>
+        <w:pBdr>
+          <w:top w:val="single" w:color="262626" w:sz="12"/>
+          <w:left w:val="single" w:color="262626" w:sz="12"/>
+          <w:bottom w:val="single" w:color="262626" w:sz="12"/>
+          <w:right w:val="single" w:color="262626" w:sz="12"/>
+        </w:pBdr>
+        <w:shd w:fill="FAFAF5" w:val="clear"/>
+        <w:spacing w:after="100"/>
+      </w:pPr>
+    </w:p>
+    <w:p>
+      <w:pPr>
+        <w:pBdr>
+          <w:top w:val="single" w:color="262626" w:sz="12"/>
+          <w:left w:val="single" w:color="262626" w:sz="12"/>
+          <w:bottom w:val="single" w:color="262626" w:sz="12"/>
+          <w:right w:val="single" w:color="262626" w:sz="12"/>
+        </w:pBdr>
+        <w:shd w:fill="FAFAF5" w:val="clear"/>
+        <w:spacing w:after="0"/>
+        <w:ind w:left="200" w:right="200"/>
+      </w:pPr>
+      <w:r>
+        <w:rPr>
+          <w:rFonts w:ascii="Consolas" w:cs="Consolas" w:eastAsia="Consolas" w:hAnsi="Consolas"/>
+          <w:sz w:val="20"/>
+          <w:szCs w:val="20"/>
+        </w:rPr>
+        <w:t xml:space="preserve">Final turnout: </w:t>
+      </w:r>
+      <w:r>
+        <w:rPr>
+          <w:rFonts w:ascii="Consolas" w:cs="Consolas" w:eastAsia="Consolas" w:hAnsi="Consolas"/>
+          <w:b/>
+          <w:bCs/>
+          <w:sz w:val="20"/>
+          <w:szCs w:val="20"/>
+        </w:rPr>
+        <w:t xml:space="preserve">[N] ballots = [X]%</w:t>
+      </w:r>
+      <w:r>
+        <w:rPr>
+          <w:rFonts w:ascii="Consolas" w:cs="Consolas" w:eastAsia="Consolas" w:hAnsi="Consolas"/>
+          <w:sz w:val="20"/>
+          <w:szCs w:val="20"/>
+        </w:rPr>
+        <w:t xml:space="preserve"> of total voting power (5% bar = 29,098,690). For scale: our record was 2.73% (35 voters); last vote was 1.73% (27).</w:t>
+      </w:r>
+    </w:p>
+    <w:p>
+      <w:pPr>
+        <w:pBdr>
+          <w:top w:val="single" w:color="262626" w:sz="12"/>
+          <w:left w:val="single" w:color="262626" w:sz="12"/>
+          <w:bottom w:val="single" w:color="262626" w:sz="12"/>
+          <w:right w:val="single" w:color="262626" w:sz="12"/>
+        </w:pBdr>
+        <w:shd w:fill="FAFAF5" w:val="clear"/>
+        <w:spacing w:after="100"/>
+      </w:pPr>
+    </w:p>
+    <w:p>
+      <w:pPr>
+        <w:pBdr>
+          <w:top w:val="single" w:color="262626" w:sz="12"/>
+          <w:left w:val="single" w:color="262626" w:sz="12"/>
+          <w:bottom w:val="single" w:color="262626" w:sz="12"/>
+          <w:right w:val="single" w:color="262626" w:sz="12"/>
+        </w:pBdr>
+        <w:shd w:fill="FAFAF5" w:val="clear"/>
+        <w:spacing w:after="0"/>
+        <w:ind w:left="200" w:right="200"/>
+      </w:pPr>
+      <w:r>
+        <w:rPr>
+          <w:rFonts w:ascii="Consolas" w:cs="Consolas" w:eastAsia="Consolas" w:hAnsi="Consolas"/>
+          <w:b/>
+          <w:bCs/>
+          <w:sz w:val="20"/>
+          <w:szCs w:val="20"/>
+        </w:rPr>
+        <w:t xml:space="preserve">The disclosed consensus fallback, applied openly:</w:t>
+      </w:r>
+      <w:r>
+        <w:rPr>
+          <w:rFonts w:ascii="Consolas" w:cs="Consolas" w:eastAsia="Consolas" w:hAnsi="Consolas"/>
+          <w:sz w:val="20"/>
+          <w:szCs w:val="20"/>
+        </w:rPr>
+        <w:t xml:space="preserve"> the most-voted outcome on each question </w:t>
+      </w:r>
+      <w:r>
+        <w:rPr>
+          <w:rFonts w:ascii="Consolas" w:cs="Consolas" w:eastAsia="Consolas" w:hAnsi="Consolas"/>
+          <w:b/>
+          <w:bCs/>
+          <w:sz w:val="20"/>
+          <w:szCs w:val="20"/>
+        </w:rPr>
+        <w:t xml:space="preserve">is adopted as the community's working consensus</w:t>
+      </w:r>
+      <w:r>
+        <w:rPr>
+          <w:rFonts w:ascii="Consolas" w:cs="Consolas" w:eastAsia="Consolas" w:hAnsi="Consolas"/>
+          <w:sz w:val="20"/>
+          <w:szCs w:val="20"/>
+        </w:rPr>
+        <w:t xml:space="preserve"> — recorded in each proposal as a quorum-missed decision (`adoptedAs: consensus-fallback`, final turnout attached) and </w:t>
+      </w:r>
+      <w:r>
+        <w:rPr>
+          <w:rFonts w:ascii="Consolas" w:cs="Consolas" w:eastAsia="Consolas" w:hAnsi="Consolas"/>
+          <w:b/>
+          <w:bCs/>
+          <w:sz w:val="20"/>
+          <w:szCs w:val="20"/>
+        </w:rPr>
+        <w:t xml:space="preserve">re-confirmed in a later ratification vote</w:t>
+      </w:r>
+      <w:r>
+        <w:rPr>
+          <w:rFonts w:ascii="Consolas" w:cs="Consolas" w:eastAsia="Consolas" w:hAnsi="Consolas"/>
+          <w:sz w:val="20"/>
+          <w:szCs w:val="20"/>
+        </w:rPr>
+        <w:t xml:space="preserve"> as turnout grows. Process, in the open: we announce the adoption intent (this post is that announcement), let </w:t>
+      </w:r>
+      <w:r>
+        <w:rPr>
+          <w:rFonts w:ascii="Consolas" w:cs="Consolas" w:eastAsia="Consolas" w:hAnsi="Consolas"/>
+          <w:b/>
+          <w:bCs/>
+          <w:sz w:val="20"/>
+          <w:szCs w:val="20"/>
+        </w:rPr>
+        <w:t xml:space="preserve">24 hours</w:t>
+      </w:r>
+      <w:r>
+        <w:rPr>
+          <w:rFonts w:ascii="Consolas" w:cs="Consolas" w:eastAsia="Consolas" w:hAnsi="Consolas"/>
+          <w:sz w:val="20"/>
+          <w:szCs w:val="20"/>
+        </w:rPr>
+        <w:t xml:space="preserve"> of public cooling-off run, then record the adoptions — every step lands in the public audit log.</w:t>
+      </w:r>
+    </w:p>
+    <w:p>
+      <w:pPr>
+        <w:pBdr>
+          <w:top w:val="single" w:color="262626" w:sz="12"/>
+          <w:left w:val="single" w:color="262626" w:sz="12"/>
+          <w:bottom w:val="single" w:color="262626" w:sz="12"/>
+          <w:right w:val="single" w:color="262626" w:sz="12"/>
+        </w:pBdr>
+        <w:shd w:fill="FAFAF5" w:val="clear"/>
+        <w:spacing w:after="100"/>
+      </w:pPr>
+    </w:p>
+    <w:p>
+      <w:pPr>
+        <w:pBdr>
+          <w:top w:val="single" w:color="262626" w:sz="12"/>
+          <w:left w:val="single" w:color="262626" w:sz="12"/>
+          <w:bottom w:val="single" w:color="262626" w:sz="12"/>
+          <w:right w:val="single" w:color="262626" w:sz="12"/>
+        </w:pBdr>
+        <w:shd w:fill="FAFAF5" w:val="clear"/>
+        <w:spacing w:after="0"/>
+        <w:ind w:left="200" w:right="200"/>
+      </w:pPr>
+      <w:r>
+        <w:rPr>
+          <w:rFonts w:ascii="Consolas" w:cs="Consolas" w:eastAsia="Consolas" w:hAnsi="Consolas"/>
+          <w:sz w:val="20"/>
+          <w:szCs w:val="20"/>
+        </w:rPr>
+        <w:t xml:space="preserve">Outcomes adopted as working consensus:</w:t>
+      </w:r>
+    </w:p>
+    <w:p>
+      <w:pPr>
+        <w:pBdr>
+          <w:top w:val="single" w:color="262626" w:sz="12"/>
+          <w:left w:val="single" w:color="262626" w:sz="12"/>
+          <w:bottom w:val="single" w:color="262626" w:sz="12"/>
+          <w:right w:val="single" w:color="262626" w:sz="12"/>
+        </w:pBdr>
+        <w:shd w:fill="FAFAF5" w:val="clear"/>
+        <w:spacing w:after="0"/>
+        <w:ind w:left="200" w:right="200"/>
+      </w:pPr>
+      <w:r>
+        <w:rPr>
+          <w:rFonts w:ascii="Consolas" w:cs="Consolas" w:eastAsia="Consolas" w:hAnsi="Consolas"/>
+          <w:sz w:val="20"/>
+          <w:szCs w:val="20"/>
+        </w:rPr>
+        <w:t xml:space="preserve">1️⃣ </w:t>
+      </w:r>
+      <w:r>
+        <w:rPr>
+          <w:rFonts w:ascii="Consolas" w:cs="Consolas" w:eastAsia="Consolas" w:hAnsi="Consolas"/>
+          <w:b/>
+          <w:bCs/>
+          <w:sz w:val="20"/>
+          <w:szCs w:val="20"/>
+        </w:rPr>
+        <w:t xml:space="preserve">Global default quorum</w:t>
+      </w:r>
+      <w:r>
+        <w:rPr>
+          <w:rFonts w:ascii="Consolas" w:cs="Consolas" w:eastAsia="Consolas" w:hAnsi="Consolas"/>
+          <w:sz w:val="20"/>
+          <w:szCs w:val="20"/>
+        </w:rPr>
+        <w:t xml:space="preserve">: </w:t>
+      </w:r>
+      <w:r>
+        <w:rPr>
+          <w:rFonts w:ascii="Consolas" w:cs="Consolas" w:eastAsia="Consolas" w:hAnsi="Consolas"/>
+          <w:b/>
+          <w:bCs/>
+          <w:sz w:val="20"/>
+          <w:szCs w:val="20"/>
+        </w:rPr>
+        <w:t xml:space="preserve">[FOR/AGAINST/ABSTAIN]</w:t>
+      </w:r>
+      <w:r>
+        <w:rPr>
+          <w:rFonts w:ascii="Consolas" w:cs="Consolas" w:eastAsia="Consolas" w:hAnsi="Consolas"/>
+          <w:sz w:val="20"/>
+          <w:szCs w:val="20"/>
+        </w:rPr>
+        <w:t xml:space="preserve"> — </w:t>
+      </w:r>
+      <w:r>
+        <w:rPr>
+          <w:rFonts w:ascii="Consolas" w:cs="Consolas" w:eastAsia="Consolas" w:hAnsi="Consolas"/>
+          <w:b/>
+          <w:bCs/>
+          <w:sz w:val="20"/>
+          <w:szCs w:val="20"/>
+          <w:highlight w:val="yellow"/>
+        </w:rPr>
+        <w:t xml:space="preserve">[X]</w:t>
+      </w:r>
+      <w:r>
+        <w:rPr>
+          <w:rFonts w:ascii="Consolas" w:cs="Consolas" w:eastAsia="Consolas" w:hAnsi="Consolas"/>
+          <w:sz w:val="20"/>
+          <w:szCs w:val="20"/>
+        </w:rPr>
+        <w:t xml:space="preserve">% of for+against power</w:t>
+      </w:r>
+    </w:p>
+    <w:p>
+      <w:pPr>
+        <w:pBdr>
+          <w:top w:val="single" w:color="262626" w:sz="12"/>
+          <w:left w:val="single" w:color="262626" w:sz="12"/>
+          <w:bottom w:val="single" w:color="262626" w:sz="12"/>
+          <w:right w:val="single" w:color="262626" w:sz="12"/>
+        </w:pBdr>
+        <w:shd w:fill="FAFAF5" w:val="clear"/>
+        <w:spacing w:after="0"/>
+        <w:ind w:left="200" w:right="200"/>
+      </w:pPr>
+      <w:r>
+        <w:rPr>
+          <w:rFonts w:ascii="Consolas" w:cs="Consolas" w:eastAsia="Consolas" w:hAnsi="Consolas"/>
+          <w:sz w:val="20"/>
+          <w:szCs w:val="20"/>
+        </w:rPr>
+        <w:t xml:space="preserve">2️⃣ </w:t>
+      </w:r>
+      <w:r>
+        <w:rPr>
+          <w:rFonts w:ascii="Consolas" w:cs="Consolas" w:eastAsia="Consolas" w:hAnsi="Consolas"/>
+          <w:b/>
+          <w:bCs/>
+          <w:sz w:val="20"/>
+          <w:szCs w:val="20"/>
+        </w:rPr>
+        <w:t xml:space="preserve">Pass threshold</w:t>
+      </w:r>
+      <w:r>
+        <w:rPr>
+          <w:rFonts w:ascii="Consolas" w:cs="Consolas" w:eastAsia="Consolas" w:hAnsi="Consolas"/>
+          <w:sz w:val="20"/>
+          <w:szCs w:val="20"/>
+        </w:rPr>
+        <w:t xml:space="preserve">: </w:t>
+      </w:r>
+      <w:r>
+        <w:rPr>
+          <w:rFonts w:ascii="Consolas" w:cs="Consolas" w:eastAsia="Consolas" w:hAnsi="Consolas"/>
+          <w:b/>
+          <w:bCs/>
+          <w:sz w:val="20"/>
+          <w:szCs w:val="20"/>
+        </w:rPr>
+        <w:t xml:space="preserve">[FOR/AGAINST/ABSTAIN]</w:t>
+      </w:r>
+      <w:r>
+        <w:rPr>
+          <w:rFonts w:ascii="Consolas" w:cs="Consolas" w:eastAsia="Consolas" w:hAnsi="Consolas"/>
+          <w:sz w:val="20"/>
+          <w:szCs w:val="20"/>
+        </w:rPr>
+        <w:t xml:space="preserve"> — </w:t>
+      </w:r>
+      <w:r>
+        <w:rPr>
+          <w:rFonts w:ascii="Consolas" w:cs="Consolas" w:eastAsia="Consolas" w:hAnsi="Consolas"/>
+          <w:b/>
+          <w:bCs/>
+          <w:sz w:val="20"/>
+          <w:szCs w:val="20"/>
+          <w:highlight w:val="yellow"/>
+        </w:rPr>
+        <w:t xml:space="preserve">[X]</w:t>
+      </w:r>
+      <w:r>
+        <w:rPr>
+          <w:rFonts w:ascii="Consolas" w:cs="Consolas" w:eastAsia="Consolas" w:hAnsi="Consolas"/>
+          <w:sz w:val="20"/>
+          <w:szCs w:val="20"/>
+        </w:rPr>
+        <w:t xml:space="preserve">%</w:t>
+      </w:r>
+    </w:p>
+    <w:p>
+      <w:pPr>
+        <w:pBdr>
+          <w:top w:val="single" w:color="262626" w:sz="12"/>
+          <w:left w:val="single" w:color="262626" w:sz="12"/>
+          <w:bottom w:val="single" w:color="262626" w:sz="12"/>
+          <w:right w:val="single" w:color="262626" w:sz="12"/>
+        </w:pBdr>
+        <w:shd w:fill="FAFAF5" w:val="clear"/>
+        <w:spacing w:after="0"/>
+        <w:ind w:left="200" w:right="200"/>
+      </w:pPr>
+      <w:r>
+        <w:rPr>
+          <w:rFonts w:ascii="Consolas" w:cs="Consolas" w:eastAsia="Consolas" w:hAnsi="Consolas"/>
+          <w:sz w:val="20"/>
+          <w:szCs w:val="20"/>
+        </w:rPr>
+        <w:t xml:space="preserve">3️⃣ Per-type schedule: </w:t>
+      </w:r>
+      <w:r>
+        <w:rPr>
+          <w:rFonts w:ascii="Consolas" w:cs="Consolas" w:eastAsia="Consolas" w:hAnsi="Consolas"/>
+          <w:b/>
+          <w:bCs/>
+          <w:sz w:val="20"/>
+          <w:szCs w:val="20"/>
+        </w:rPr>
+        <w:t xml:space="preserve">[FOR/AGAINST/ABSTAIN]</w:t>
+      </w:r>
+      <w:r>
+        <w:rPr>
+          <w:rFonts w:ascii="Consolas" w:cs="Consolas" w:eastAsia="Consolas" w:hAnsi="Consolas"/>
+          <w:sz w:val="20"/>
+          <w:szCs w:val="20"/>
+        </w:rPr>
+        <w:t xml:space="preserve"> — </w:t>
+      </w:r>
+      <w:r>
+        <w:rPr>
+          <w:rFonts w:ascii="Consolas" w:cs="Consolas" w:eastAsia="Consolas" w:hAnsi="Consolas"/>
+          <w:b/>
+          <w:bCs/>
+          <w:sz w:val="20"/>
+          <w:szCs w:val="20"/>
+          <w:highlight w:val="yellow"/>
+        </w:rPr>
+        <w:t xml:space="preserve">[X]</w:t>
+      </w:r>
+      <w:r>
+        <w:rPr>
+          <w:rFonts w:ascii="Consolas" w:cs="Consolas" w:eastAsia="Consolas" w:hAnsi="Consolas"/>
+          <w:sz w:val="20"/>
+          <w:szCs w:val="20"/>
+        </w:rPr>
+        <w:t xml:space="preserve">%</w:t>
+      </w:r>
+    </w:p>
+    <w:p>
+      <w:pPr>
+        <w:pBdr>
+          <w:top w:val="single" w:color="262626" w:sz="12"/>
+          <w:left w:val="single" w:color="262626" w:sz="12"/>
+          <w:bottom w:val="single" w:color="262626" w:sz="12"/>
+          <w:right w:val="single" w:color="262626" w:sz="12"/>
+        </w:pBdr>
+        <w:shd w:fill="FAFAF5" w:val="clear"/>
+        <w:spacing w:after="100"/>
+      </w:pPr>
+    </w:p>
+    <w:p>
+      <w:pPr>
+        <w:pBdr>
+          <w:top w:val="single" w:color="262626" w:sz="12"/>
+          <w:left w:val="single" w:color="262626" w:sz="12"/>
+          <w:bottom w:val="single" w:color="262626" w:sz="12"/>
+          <w:right w:val="single" w:color="262626" w:sz="12"/>
+        </w:pBdr>
+        <w:shd w:fill="FAFAF5" w:val="clear"/>
+        <w:spacing w:after="0"/>
+        <w:ind w:left="200" w:right="200"/>
+      </w:pPr>
+      <w:r>
+        <w:rPr>
+          <w:rFonts w:ascii="Consolas" w:cs="Consolas" w:eastAsia="Consolas" w:hAnsi="Consolas"/>
+          <w:sz w:val="20"/>
+          <w:szCs w:val="20"/>
+        </w:rPr>
+        <w:t xml:space="preserve">No backroom, no asterisk discovered later — the rule was in the first post, in every update, and inside every ballot. Your votes set the working consensus either way, and every holder can read the record.</w:t>
+      </w:r>
+    </w:p>
+    <w:p>
+      <w:pPr>
+        <w:pBdr>
+          <w:top w:val="single" w:color="262626" w:sz="12"/>
+          <w:left w:val="single" w:color="262626" w:sz="12"/>
+          <w:bottom w:val="single" w:color="262626" w:sz="12"/>
+          <w:right w:val="single" w:color="262626" w:sz="12"/>
+        </w:pBdr>
+        <w:shd w:fill="FAFAF5" w:val="clear"/>
+        <w:spacing w:after="100"/>
+      </w:pPr>
+    </w:p>
+    <w:p>
+      <w:pPr>
+        <w:pBdr>
+          <w:top w:val="single" w:color="262626" w:sz="12"/>
+          <w:left w:val="single" w:color="262626" w:sz="12"/>
+          <w:bottom w:val="single" w:color="262626" w:sz="12"/>
+          <w:right w:val="single" w:color="262626" w:sz="12"/>
+        </w:pBdr>
+        <w:shd w:fill="FAFAF5" w:val="clear"/>
+        <w:spacing w:after="0"/>
+        <w:ind w:left="200" w:right="200"/>
+      </w:pPr>
+      <w:r>
+        <w:rPr>
+          <w:rFonts w:ascii="Consolas" w:cs="Consolas" w:eastAsia="Consolas" w:hAnsi="Consolas"/>
+          <w:sz w:val="20"/>
+          <w:szCs w:val="20"/>
+        </w:rPr>
+        <w:t xml:space="preserve">Next: the ratification re-confirm vote gets scheduled and announced. Turnout is now the project's #1 governance problem, openly stated.</w:t>
+      </w:r>
+    </w:p>
+    <w:p>
+      <w:pPr>
+        <w:pBdr>
+          <w:top w:val="single" w:color="262626" w:sz="12"/>
+          <w:left w:val="single" w:color="262626" w:sz="12"/>
+          <w:bottom w:val="single" w:color="262626" w:sz="12"/>
+          <w:right w:val="single" w:color="262626" w:sz="12"/>
+        </w:pBdr>
+        <w:shd w:fill="FAFAF5" w:val="clear"/>
+        <w:spacing w:after="100"/>
+      </w:pPr>
+    </w:p>
+    <w:p>
+      <w:pPr>
+        <w:pBdr>
+          <w:top w:val="single" w:color="262626" w:sz="12"/>
+          <w:left w:val="single" w:color="262626" w:sz="12"/>
+          <w:bottom w:val="single" w:color="262626" w:sz="12"/>
+          <w:right w:val="single" w:color="262626" w:sz="12"/>
+        </w:pBdr>
+        <w:shd w:fill="FAFAF5" w:val="clear"/>
+        <w:spacing w:after="0"/>
+        <w:ind w:left="200" w:right="200"/>
+      </w:pPr>
+      <w:r>
+        <w:rPr>
+          <w:rFonts w:ascii="Consolas" w:cs="Consolas" w:eastAsia="Consolas" w:hAnsi="Consolas"/>
+          <w:sz w:val="20"/>
+          <w:szCs w:val="20"/>
+        </w:rPr>
+        <w:t xml:space="preserve">Full record: dao.omnom.dog/results?utm_campaign=wave1-referendum&amp;utm_source=x</w:t>
+      </w:r>
+    </w:p>
+    <w:p>
+      <w:pPr>
+        <w:pBdr>
+          <w:top w:val="single" w:color="262626" w:sz="12"/>
+          <w:left w:val="single" w:color="262626" w:sz="12"/>
+          <w:bottom w:val="single" w:color="262626" w:sz="12"/>
+          <w:right w:val="single" w:color="262626" w:sz="12"/>
+        </w:pBdr>
+        <w:shd w:fill="FAFAF5" w:val="clear"/>
+        <w:spacing w:after="100"/>
+      </w:pPr>
+    </w:p>
+    <w:p>
+      <w:pPr>
+        <w:pBdr>
+          <w:top w:val="single" w:color="262626" w:sz="12"/>
+          <w:left w:val="single" w:color="262626" w:sz="12"/>
+          <w:bottom w:val="single" w:color="262626" w:sz="12"/>
+          <w:right w:val="single" w:color="262626" w:sz="12"/>
+        </w:pBdr>
+        <w:shd w:fill="FAFAF5" w:val="clear"/>
+        <w:spacing w:after="0"/>
+        <w:ind w:left="200" w:right="200"/>
+      </w:pPr>
+      <w:r>
+        <w:rPr>
+          <w:rFonts w:ascii="Consolas" w:cs="Consolas" w:eastAsia="Consolas" w:hAnsi="Consolas"/>
+          <w:sz w:val="20"/>
+          <w:szCs w:val="20"/>
+        </w:rPr>
+        <w:t xml:space="preserve">$OMNOM #DAO #Governance 🐕🧡</w:t>
+      </w:r>
+    </w:p>
+    <w:p>
+      <w:pPr>
+        <w:pBdr>
+          <w:top w:val="single" w:color="262626" w:sz="12"/>
+          <w:left w:val="single" w:color="262626" w:sz="12"/>
+          <w:bottom w:val="single" w:color="262626" w:sz="12"/>
+          <w:right w:val="single" w:color="262626" w:sz="12"/>
+        </w:pBdr>
+        <w:shd w:fill="FAFAF5" w:val="clear"/>
+        <w:spacing w:after="100"/>
+      </w:pPr>
+    </w:p>
+    <w:p>
+      <w:pPr>
+        <w:pBdr>
+          <w:top w:val="single" w:color="262626" w:sz="12"/>
+          <w:left w:val="single" w:color="262626" w:sz="12"/>
+          <w:bottom w:val="single" w:color="262626" w:sz="12"/>
+          <w:right w:val="single" w:color="262626" w:sz="12"/>
+        </w:pBdr>
+        <w:shd w:fill="FAFAF5" w:val="clear"/>
+        <w:spacing w:after="0"/>
+        <w:ind w:left="200" w:right="200"/>
+      </w:pPr>
+      <w:r>
+        <w:rPr>
+          <w:rFonts w:ascii="Consolas" w:cs="Consolas" w:eastAsia="Consolas" w:hAnsi="Consolas"/>
+          <w:sz w:val="20"/>
+          <w:szCs w:val="20"/>
+        </w:rPr>
+        <w:t xml:space="preserve">## Optional teaser line (owner's call — use sparingly)</w:t>
+      </w:r>
+    </w:p>
+    <w:p>
+      <w:pPr>
+        <w:pBdr>
+          <w:top w:val="single" w:color="262626" w:sz="12"/>
+          <w:left w:val="single" w:color="262626" w:sz="12"/>
+          <w:bottom w:val="single" w:color="262626" w:sz="12"/>
+          <w:right w:val="single" w:color="262626" w:sz="12"/>
+        </w:pBdr>
+        <w:shd w:fill="FAFAF5" w:val="clear"/>
+        <w:spacing w:after="100"/>
+      </w:pPr>
+    </w:p>
+    <w:p>
+      <w:pPr>
+        <w:pBdr>
+          <w:top w:val="single" w:color="262626" w:sz="12"/>
+          <w:left w:val="single" w:color="262626" w:sz="12"/>
+          <w:bottom w:val="single" w:color="262626" w:sz="12"/>
+          <w:right w:val="single" w:color="262626" w:sz="12"/>
+        </w:pBdr>
+        <w:shd w:fill="FAFAF5" w:val="clear"/>
+        <w:spacing w:after="0"/>
+        <w:ind w:left="200" w:right="200"/>
+      </w:pPr>
+      <w:r>
+        <w:rPr>
+          <w:rFonts w:ascii="Consolas" w:cs="Consolas" w:eastAsia="Consolas" w:hAnsi="Consolas"/>
+          <w:sz w:val="20"/>
+          <w:szCs w:val="20"/>
+        </w:rPr>
+        <w:t xml:space="preserve">If you want to seed what comes after the rulebook, append ONE line to the Telegram long post or an X reply (never the main post — don't dilute the CTA):</w:t>
+      </w:r>
+    </w:p>
+    <w:p>
+      <w:pPr>
+        <w:pBdr>
+          <w:top w:val="single" w:color="262626" w:sz="12"/>
+          <w:left w:val="single" w:color="262626" w:sz="12"/>
+          <w:bottom w:val="single" w:color="262626" w:sz="12"/>
+          <w:right w:val="single" w:color="262626" w:sz="12"/>
+        </w:pBdr>
+        <w:shd w:fill="FAFAF5" w:val="clear"/>
+        <w:spacing w:after="100"/>
+      </w:pPr>
+    </w:p>
+    <w:p>
+      <w:pPr>
+        <w:pBdr>
+          <w:top w:val="single" w:color="262626" w:sz="12"/>
+          <w:left w:val="single" w:color="262626" w:sz="12"/>
+          <w:bottom w:val="single" w:color="262626" w:sz="12"/>
+          <w:right w:val="single" w:color="262626" w:sz="12"/>
+        </w:pBdr>
+        <w:shd w:fill="FAFAF5" w:val="clear"/>
+        <w:spacing w:after="0"/>
+        <w:ind w:left="200" w:right="200"/>
+      </w:pPr>
+      <w:r>
+        <w:rPr>
+          <w:rFonts w:ascii="Consolas" w:cs="Consolas" w:eastAsia="Consolas" w:hAnsi="Consolas"/>
+          <w:sz w:val="20"/>
+          <w:szCs w:val="20"/>
+        </w:rPr>
+        <w:t xml:space="preserve">👀 And after the rulebook: the community decides where $OMNOM lives next. DogeOS just opened its public testnet — a Dogecoin L2 with DOGE gas. Early eyes are watching.</w:t>
+      </w:r>
     </w:p>
     <w:sectPr>
       <w:pgSz w:w="11906" w:h="16838" w:orient="portrait"/>

</xml_diff>